<commit_message>
Replace Charlson `score` with `ecog_score` in adjuster set
Every adjuster set in sherley_carbo.qmd now uses `ecog_score` (ECOG
performance status, remapped 0–5) in place of `score` (Charlson
comorbidity index): .adj_set, csh_model, the 8 plot_subhr_* /
plot_cox_* / adj_cif / adj_death_curve helpers. The diagnostic
event-count caption and descriptive paragraph reflect the new variable
name. All 11 docx tables and 54 pptx slides still generate; zero
Lapack errors; 4 fallback placeholders remain (rare grade-3 outcomes
unchanged).

Co-Authored-By: Claude Opus 4.7 (1M context) <noreply@anthropic.com>
</commit_message>
<xml_diff>
--- a/docs/tables/carbo/sec5_aki_2.docx
+++ b/docs/tables/carbo/sec5_aki_2.docx
@@ -1103,7 +1103,7 @@
                 <w:szCs w:val="22"/>
                 <w:color w:val="000000"/>
               </w:rPr>
-              <w:t xml:space="preserve">1.36</w:t>
+              <w:t xml:space="preserve">1.18</w:t>
             </w:r>
           </w:p>
         </w:tc>
@@ -1156,7 +1156,7 @@
                 <w:szCs w:val="22"/>
                 <w:color w:val="000000"/>
               </w:rPr>
-              <w:t xml:space="preserve">0.97, 1.91</w:t>
+              <w:t xml:space="preserve">0.79, 1.75</w:t>
             </w:r>
           </w:p>
         </w:tc>
@@ -1209,7 +1209,7 @@
                 <w:szCs w:val="22"/>
                 <w:color w:val="000000"/>
               </w:rPr>
-              <w:t xml:space="preserve">0.074</w:t>
+              <w:t xml:space="preserve">0.420</w:t>
             </w:r>
           </w:p>
         </w:tc>
@@ -1586,113 +1586,113 @@
                 <w:szCs w:val="22"/>
                 <w:color w:val="000000"/>
               </w:rPr>
-              <w:t xml:space="preserve">1.03</w:t>
-            </w:r>
-          </w:p>
-        </w:tc>
-        <w:tc>
-          <w:tcPr>
-            <w:tcBorders>
-              <w:bottom w:val="none" w:sz="0" w:space="0" w:color="000000"/>
-              <w:top w:val="none" w:sz="0" w:space="0" w:color="000000"/>
-              <w:left w:val="none" w:sz="0" w:space="0" w:color="000000"/>
-              <w:right w:val="none" w:sz="0" w:space="0" w:color="000000"/>
-            </w:tcBorders>
-            <w:shd w:val="clear" w:color="auto" w:fill="FFFFFF"/>
-            <w:tcMar>
-              <w:top w:w="0" w:type="dxa"/>
-              <w:bottom w:w="0" w:type="dxa"/>
-              <w:left w:w="0" w:type="dxa"/>
-              <w:right w:w="0" w:type="dxa"/>
-            </w:tcMar>
-            <w:vAlign w:val="top"/>
-          </w:tcPr>
-          <w:p>
-            <w:pPr>
-              <w:pStyle w:val="Normal"/>
-              <w:jc w:val="center"/>
-              <w:pBdr>
-                <w:bottom w:val="none" w:sz="0" w:space="0" w:color="000000"/>
-                <w:top w:val="none" w:sz="0" w:space="0" w:color="000000"/>
-                <w:left w:val="none" w:sz="0" w:space="0" w:color="000000"/>
-                <w:right w:val="none" w:sz="0" w:space="0" w:color="000000"/>
-              </w:pBdr>
-              <w:spacing w:after="100" w:before="100" w:line="240"/>
-              <w:ind w:left="100" w:right="100" w:firstLine="0" w:firstLineChars="0"/>
-              <w:rPr>
-                <w:rFonts w:ascii="Helvetica" w:hAnsi="Helvetica" w:eastAsia="Helvetica" w:cs="Helvetica"/>
-                <w:i w:val="false"/>
-                <w:b w:val="false"/>
-                <w:u w:val="none"/>
-                <w:sz w:val="22"/>
-                <w:szCs w:val="22"/>
-                <w:color w:val="000000"/>
-              </w:rPr>
-            </w:pPr>
-            <w:r>
-              <w:rPr>
-                <w:rFonts w:ascii="Helvetica" w:hAnsi="Helvetica" w:eastAsia="Helvetica" w:cs="Helvetica"/>
-                <w:i w:val="false"/>
-                <w:b w:val="false"/>
-                <w:u w:val="none"/>
-                <w:sz w:val="22"/>
-                <w:szCs w:val="22"/>
-                <w:color w:val="000000"/>
-              </w:rPr>
-              <w:t xml:space="preserve">0.93, 1.14</w:t>
-            </w:r>
-          </w:p>
-        </w:tc>
-        <w:tc>
-          <w:tcPr>
-            <w:tcBorders>
-              <w:bottom w:val="none" w:sz="0" w:space="0" w:color="000000"/>
-              <w:top w:val="none" w:sz="0" w:space="0" w:color="000000"/>
-              <w:left w:val="none" w:sz="0" w:space="0" w:color="000000"/>
-              <w:right w:val="none" w:sz="0" w:space="0" w:color="000000"/>
-            </w:tcBorders>
-            <w:shd w:val="clear" w:color="auto" w:fill="FFFFFF"/>
-            <w:tcMar>
-              <w:top w:w="0" w:type="dxa"/>
-              <w:bottom w:w="0" w:type="dxa"/>
-              <w:left w:w="0" w:type="dxa"/>
-              <w:right w:w="0" w:type="dxa"/>
-            </w:tcMar>
-            <w:vAlign w:val="top"/>
-          </w:tcPr>
-          <w:p>
-            <w:pPr>
-              <w:pStyle w:val="Normal"/>
-              <w:jc w:val="center"/>
-              <w:pBdr>
-                <w:bottom w:val="none" w:sz="0" w:space="0" w:color="000000"/>
-                <w:top w:val="none" w:sz="0" w:space="0" w:color="000000"/>
-                <w:left w:val="none" w:sz="0" w:space="0" w:color="000000"/>
-                <w:right w:val="none" w:sz="0" w:space="0" w:color="000000"/>
-              </w:pBdr>
-              <w:spacing w:after="100" w:before="100" w:line="240"/>
-              <w:ind w:left="100" w:right="100" w:firstLine="0" w:firstLineChars="0"/>
-              <w:rPr>
-                <w:rFonts w:ascii="Helvetica" w:hAnsi="Helvetica" w:eastAsia="Helvetica" w:cs="Helvetica"/>
-                <w:i w:val="false"/>
-                <w:b w:val="false"/>
-                <w:u w:val="none"/>
-                <w:sz w:val="22"/>
-                <w:szCs w:val="22"/>
-                <w:color w:val="000000"/>
-              </w:rPr>
-            </w:pPr>
-            <w:r>
-              <w:rPr>
-                <w:rFonts w:ascii="Helvetica" w:hAnsi="Helvetica" w:eastAsia="Helvetica" w:cs="Helvetica"/>
-                <w:i w:val="false"/>
-                <w:b w:val="false"/>
-                <w:u w:val="none"/>
-                <w:sz w:val="22"/>
-                <w:szCs w:val="22"/>
-                <w:color w:val="000000"/>
-              </w:rPr>
-              <w:t xml:space="preserve">0.620</w:t>
+              <w:t xml:space="preserve">1.02</w:t>
+            </w:r>
+          </w:p>
+        </w:tc>
+        <w:tc>
+          <w:tcPr>
+            <w:tcBorders>
+              <w:bottom w:val="none" w:sz="0" w:space="0" w:color="000000"/>
+              <w:top w:val="none" w:sz="0" w:space="0" w:color="000000"/>
+              <w:left w:val="none" w:sz="0" w:space="0" w:color="000000"/>
+              <w:right w:val="none" w:sz="0" w:space="0" w:color="000000"/>
+            </w:tcBorders>
+            <w:shd w:val="clear" w:color="auto" w:fill="FFFFFF"/>
+            <w:tcMar>
+              <w:top w:w="0" w:type="dxa"/>
+              <w:bottom w:w="0" w:type="dxa"/>
+              <w:left w:w="0" w:type="dxa"/>
+              <w:right w:w="0" w:type="dxa"/>
+            </w:tcMar>
+            <w:vAlign w:val="top"/>
+          </w:tcPr>
+          <w:p>
+            <w:pPr>
+              <w:pStyle w:val="Normal"/>
+              <w:jc w:val="center"/>
+              <w:pBdr>
+                <w:bottom w:val="none" w:sz="0" w:space="0" w:color="000000"/>
+                <w:top w:val="none" w:sz="0" w:space="0" w:color="000000"/>
+                <w:left w:val="none" w:sz="0" w:space="0" w:color="000000"/>
+                <w:right w:val="none" w:sz="0" w:space="0" w:color="000000"/>
+              </w:pBdr>
+              <w:spacing w:after="100" w:before="100" w:line="240"/>
+              <w:ind w:left="100" w:right="100" w:firstLine="0" w:firstLineChars="0"/>
+              <w:rPr>
+                <w:rFonts w:ascii="Helvetica" w:hAnsi="Helvetica" w:eastAsia="Helvetica" w:cs="Helvetica"/>
+                <w:i w:val="false"/>
+                <w:b w:val="false"/>
+                <w:u w:val="none"/>
+                <w:sz w:val="22"/>
+                <w:szCs w:val="22"/>
+                <w:color w:val="000000"/>
+              </w:rPr>
+            </w:pPr>
+            <w:r>
+              <w:rPr>
+                <w:rFonts w:ascii="Helvetica" w:hAnsi="Helvetica" w:eastAsia="Helvetica" w:cs="Helvetica"/>
+                <w:i w:val="false"/>
+                <w:b w:val="false"/>
+                <w:u w:val="none"/>
+                <w:sz w:val="22"/>
+                <w:szCs w:val="22"/>
+                <w:color w:val="000000"/>
+              </w:rPr>
+              <w:t xml:space="preserve">0.91, 1.14</w:t>
+            </w:r>
+          </w:p>
+        </w:tc>
+        <w:tc>
+          <w:tcPr>
+            <w:tcBorders>
+              <w:bottom w:val="none" w:sz="0" w:space="0" w:color="000000"/>
+              <w:top w:val="none" w:sz="0" w:space="0" w:color="000000"/>
+              <w:left w:val="none" w:sz="0" w:space="0" w:color="000000"/>
+              <w:right w:val="none" w:sz="0" w:space="0" w:color="000000"/>
+            </w:tcBorders>
+            <w:shd w:val="clear" w:color="auto" w:fill="FFFFFF"/>
+            <w:tcMar>
+              <w:top w:w="0" w:type="dxa"/>
+              <w:bottom w:w="0" w:type="dxa"/>
+              <w:left w:w="0" w:type="dxa"/>
+              <w:right w:w="0" w:type="dxa"/>
+            </w:tcMar>
+            <w:vAlign w:val="top"/>
+          </w:tcPr>
+          <w:p>
+            <w:pPr>
+              <w:pStyle w:val="Normal"/>
+              <w:jc w:val="center"/>
+              <w:pBdr>
+                <w:bottom w:val="none" w:sz="0" w:space="0" w:color="000000"/>
+                <w:top w:val="none" w:sz="0" w:space="0" w:color="000000"/>
+                <w:left w:val="none" w:sz="0" w:space="0" w:color="000000"/>
+                <w:right w:val="none" w:sz="0" w:space="0" w:color="000000"/>
+              </w:pBdr>
+              <w:spacing w:after="100" w:before="100" w:line="240"/>
+              <w:ind w:left="100" w:right="100" w:firstLine="0" w:firstLineChars="0"/>
+              <w:rPr>
+                <w:rFonts w:ascii="Helvetica" w:hAnsi="Helvetica" w:eastAsia="Helvetica" w:cs="Helvetica"/>
+                <w:i w:val="false"/>
+                <w:b w:val="false"/>
+                <w:u w:val="none"/>
+                <w:sz w:val="22"/>
+                <w:szCs w:val="22"/>
+                <w:color w:val="000000"/>
+              </w:rPr>
+            </w:pPr>
+            <w:r>
+              <w:rPr>
+                <w:rFonts w:ascii="Helvetica" w:hAnsi="Helvetica" w:eastAsia="Helvetica" w:cs="Helvetica"/>
+                <w:i w:val="false"/>
+                <w:b w:val="false"/>
+                <w:u w:val="none"/>
+                <w:sz w:val="22"/>
+                <w:szCs w:val="22"/>
+                <w:color w:val="000000"/>
+              </w:rPr>
+              <w:t xml:space="preserve">0.780</w:t>
             </w:r>
           </w:p>
         </w:tc>
@@ -3035,113 +3035,113 @@
                 <w:szCs w:val="22"/>
                 <w:color w:val="000000"/>
               </w:rPr>
-              <w:t xml:space="preserve">1.42</w:t>
-            </w:r>
-          </w:p>
-        </w:tc>
-        <w:tc>
-          <w:tcPr>
-            <w:tcBorders>
-              <w:bottom w:val="none" w:sz="0" w:space="0" w:color="000000"/>
-              <w:top w:val="none" w:sz="0" w:space="0" w:color="000000"/>
-              <w:left w:val="none" w:sz="0" w:space="0" w:color="000000"/>
-              <w:right w:val="none" w:sz="0" w:space="0" w:color="000000"/>
-            </w:tcBorders>
-            <w:shd w:val="clear" w:color="auto" w:fill="FFFFFF"/>
-            <w:tcMar>
-              <w:top w:w="0" w:type="dxa"/>
-              <w:bottom w:w="0" w:type="dxa"/>
-              <w:left w:w="0" w:type="dxa"/>
-              <w:right w:w="0" w:type="dxa"/>
-            </w:tcMar>
-            <w:vAlign w:val="top"/>
-          </w:tcPr>
-          <w:p>
-            <w:pPr>
-              <w:pStyle w:val="Normal"/>
-              <w:jc w:val="center"/>
-              <w:pBdr>
-                <w:bottom w:val="none" w:sz="0" w:space="0" w:color="000000"/>
-                <w:top w:val="none" w:sz="0" w:space="0" w:color="000000"/>
-                <w:left w:val="none" w:sz="0" w:space="0" w:color="000000"/>
-                <w:right w:val="none" w:sz="0" w:space="0" w:color="000000"/>
-              </w:pBdr>
-              <w:spacing w:after="100" w:before="100" w:line="240"/>
-              <w:ind w:left="100" w:right="100" w:firstLine="0" w:firstLineChars="0"/>
-              <w:rPr>
-                <w:rFonts w:ascii="Helvetica" w:hAnsi="Helvetica" w:eastAsia="Helvetica" w:cs="Helvetica"/>
-                <w:i w:val="false"/>
-                <w:b w:val="false"/>
-                <w:u w:val="none"/>
-                <w:sz w:val="22"/>
-                <w:szCs w:val="22"/>
-                <w:color w:val="000000"/>
-              </w:rPr>
-            </w:pPr>
-            <w:r>
-              <w:rPr>
-                <w:rFonts w:ascii="Helvetica" w:hAnsi="Helvetica" w:eastAsia="Helvetica" w:cs="Helvetica"/>
-                <w:i w:val="false"/>
-                <w:b w:val="false"/>
-                <w:u w:val="none"/>
-                <w:sz w:val="22"/>
-                <w:szCs w:val="22"/>
-                <w:color w:val="000000"/>
-              </w:rPr>
-              <w:t xml:space="preserve">0.31, 6.42</w:t>
-            </w:r>
-          </w:p>
-        </w:tc>
-        <w:tc>
-          <w:tcPr>
-            <w:tcBorders>
-              <w:bottom w:val="none" w:sz="0" w:space="0" w:color="000000"/>
-              <w:top w:val="none" w:sz="0" w:space="0" w:color="000000"/>
-              <w:left w:val="none" w:sz="0" w:space="0" w:color="000000"/>
-              <w:right w:val="none" w:sz="0" w:space="0" w:color="000000"/>
-            </w:tcBorders>
-            <w:shd w:val="clear" w:color="auto" w:fill="FFFFFF"/>
-            <w:tcMar>
-              <w:top w:w="0" w:type="dxa"/>
-              <w:bottom w:w="0" w:type="dxa"/>
-              <w:left w:w="0" w:type="dxa"/>
-              <w:right w:w="0" w:type="dxa"/>
-            </w:tcMar>
-            <w:vAlign w:val="top"/>
-          </w:tcPr>
-          <w:p>
-            <w:pPr>
-              <w:pStyle w:val="Normal"/>
-              <w:jc w:val="center"/>
-              <w:pBdr>
-                <w:bottom w:val="none" w:sz="0" w:space="0" w:color="000000"/>
-                <w:top w:val="none" w:sz="0" w:space="0" w:color="000000"/>
-                <w:left w:val="none" w:sz="0" w:space="0" w:color="000000"/>
-                <w:right w:val="none" w:sz="0" w:space="0" w:color="000000"/>
-              </w:pBdr>
-              <w:spacing w:after="100" w:before="100" w:line="240"/>
-              <w:ind w:left="100" w:right="100" w:firstLine="0" w:firstLineChars="0"/>
-              <w:rPr>
-                <w:rFonts w:ascii="Helvetica" w:hAnsi="Helvetica" w:eastAsia="Helvetica" w:cs="Helvetica"/>
-                <w:i w:val="false"/>
-                <w:b w:val="false"/>
-                <w:u w:val="none"/>
-                <w:sz w:val="22"/>
-                <w:szCs w:val="22"/>
-                <w:color w:val="000000"/>
-              </w:rPr>
-            </w:pPr>
-            <w:r>
-              <w:rPr>
-                <w:rFonts w:ascii="Helvetica" w:hAnsi="Helvetica" w:eastAsia="Helvetica" w:cs="Helvetica"/>
-                <w:i w:val="false"/>
-                <w:b w:val="false"/>
-                <w:u w:val="none"/>
-                <w:sz w:val="22"/>
-                <w:szCs w:val="22"/>
-                <w:color w:val="000000"/>
-              </w:rPr>
-              <w:t xml:space="preserve">0.650</w:t>
+              <w:t xml:space="preserve">1.70</w:t>
+            </w:r>
+          </w:p>
+        </w:tc>
+        <w:tc>
+          <w:tcPr>
+            <w:tcBorders>
+              <w:bottom w:val="none" w:sz="0" w:space="0" w:color="000000"/>
+              <w:top w:val="none" w:sz="0" w:space="0" w:color="000000"/>
+              <w:left w:val="none" w:sz="0" w:space="0" w:color="000000"/>
+              <w:right w:val="none" w:sz="0" w:space="0" w:color="000000"/>
+            </w:tcBorders>
+            <w:shd w:val="clear" w:color="auto" w:fill="FFFFFF"/>
+            <w:tcMar>
+              <w:top w:w="0" w:type="dxa"/>
+              <w:bottom w:w="0" w:type="dxa"/>
+              <w:left w:w="0" w:type="dxa"/>
+              <w:right w:w="0" w:type="dxa"/>
+            </w:tcMar>
+            <w:vAlign w:val="top"/>
+          </w:tcPr>
+          <w:p>
+            <w:pPr>
+              <w:pStyle w:val="Normal"/>
+              <w:jc w:val="center"/>
+              <w:pBdr>
+                <w:bottom w:val="none" w:sz="0" w:space="0" w:color="000000"/>
+                <w:top w:val="none" w:sz="0" w:space="0" w:color="000000"/>
+                <w:left w:val="none" w:sz="0" w:space="0" w:color="000000"/>
+                <w:right w:val="none" w:sz="0" w:space="0" w:color="000000"/>
+              </w:pBdr>
+              <w:spacing w:after="100" w:before="100" w:line="240"/>
+              <w:ind w:left="100" w:right="100" w:firstLine="0" w:firstLineChars="0"/>
+              <w:rPr>
+                <w:rFonts w:ascii="Helvetica" w:hAnsi="Helvetica" w:eastAsia="Helvetica" w:cs="Helvetica"/>
+                <w:i w:val="false"/>
+                <w:b w:val="false"/>
+                <w:u w:val="none"/>
+                <w:sz w:val="22"/>
+                <w:szCs w:val="22"/>
+                <w:color w:val="000000"/>
+              </w:rPr>
+            </w:pPr>
+            <w:r>
+              <w:rPr>
+                <w:rFonts w:ascii="Helvetica" w:hAnsi="Helvetica" w:eastAsia="Helvetica" w:cs="Helvetica"/>
+                <w:i w:val="false"/>
+                <w:b w:val="false"/>
+                <w:u w:val="none"/>
+                <w:sz w:val="22"/>
+                <w:szCs w:val="22"/>
+                <w:color w:val="000000"/>
+              </w:rPr>
+              <w:t xml:space="preserve">0.31, 9.35</w:t>
+            </w:r>
+          </w:p>
+        </w:tc>
+        <w:tc>
+          <w:tcPr>
+            <w:tcBorders>
+              <w:bottom w:val="none" w:sz="0" w:space="0" w:color="000000"/>
+              <w:top w:val="none" w:sz="0" w:space="0" w:color="000000"/>
+              <w:left w:val="none" w:sz="0" w:space="0" w:color="000000"/>
+              <w:right w:val="none" w:sz="0" w:space="0" w:color="000000"/>
+            </w:tcBorders>
+            <w:shd w:val="clear" w:color="auto" w:fill="FFFFFF"/>
+            <w:tcMar>
+              <w:top w:w="0" w:type="dxa"/>
+              <w:bottom w:w="0" w:type="dxa"/>
+              <w:left w:w="0" w:type="dxa"/>
+              <w:right w:w="0" w:type="dxa"/>
+            </w:tcMar>
+            <w:vAlign w:val="top"/>
+          </w:tcPr>
+          <w:p>
+            <w:pPr>
+              <w:pStyle w:val="Normal"/>
+              <w:jc w:val="center"/>
+              <w:pBdr>
+                <w:bottom w:val="none" w:sz="0" w:space="0" w:color="000000"/>
+                <w:top w:val="none" w:sz="0" w:space="0" w:color="000000"/>
+                <w:left w:val="none" w:sz="0" w:space="0" w:color="000000"/>
+                <w:right w:val="none" w:sz="0" w:space="0" w:color="000000"/>
+              </w:pBdr>
+              <w:spacing w:after="100" w:before="100" w:line="240"/>
+              <w:ind w:left="100" w:right="100" w:firstLine="0" w:firstLineChars="0"/>
+              <w:rPr>
+                <w:rFonts w:ascii="Helvetica" w:hAnsi="Helvetica" w:eastAsia="Helvetica" w:cs="Helvetica"/>
+                <w:i w:val="false"/>
+                <w:b w:val="false"/>
+                <w:u w:val="none"/>
+                <w:sz w:val="22"/>
+                <w:szCs w:val="22"/>
+                <w:color w:val="000000"/>
+              </w:rPr>
+            </w:pPr>
+            <w:r>
+              <w:rPr>
+                <w:rFonts w:ascii="Helvetica" w:hAnsi="Helvetica" w:eastAsia="Helvetica" w:cs="Helvetica"/>
+                <w:i w:val="false"/>
+                <w:b w:val="false"/>
+                <w:u w:val="none"/>
+                <w:sz w:val="22"/>
+                <w:szCs w:val="22"/>
+                <w:color w:val="000000"/>
+              </w:rPr>
+              <w:t xml:space="preserve">0.540</w:t>
             </w:r>
           </w:p>
         </w:tc>
@@ -3200,7 +3200,7 @@
                 <w:szCs w:val="22"/>
                 <w:color w:val="000000"/>
               </w:rPr>
-              <w:t xml:space="preserve">score</w:t>
+              <w:t xml:space="preserve">ecog_score</w:t>
             </w:r>
           </w:p>
         </w:tc>
@@ -3306,113 +3306,113 @@
                 <w:szCs w:val="22"/>
                 <w:color w:val="000000"/>
               </w:rPr>
-              <w:t xml:space="preserve">1.04</w:t>
-            </w:r>
-          </w:p>
-        </w:tc>
-        <w:tc>
-          <w:tcPr>
-            <w:tcBorders>
-              <w:bottom w:val="none" w:sz="0" w:space="0" w:color="000000"/>
-              <w:top w:val="none" w:sz="0" w:space="0" w:color="000000"/>
-              <w:left w:val="none" w:sz="0" w:space="0" w:color="000000"/>
-              <w:right w:val="none" w:sz="0" w:space="0" w:color="000000"/>
-            </w:tcBorders>
-            <w:shd w:val="clear" w:color="auto" w:fill="FFFFFF"/>
-            <w:tcMar>
-              <w:top w:w="0" w:type="dxa"/>
-              <w:bottom w:w="0" w:type="dxa"/>
-              <w:left w:w="0" w:type="dxa"/>
-              <w:right w:w="0" w:type="dxa"/>
-            </w:tcMar>
-            <w:vAlign w:val="top"/>
-          </w:tcPr>
-          <w:p>
-            <w:pPr>
-              <w:pStyle w:val="Normal"/>
-              <w:jc w:val="center"/>
-              <w:pBdr>
-                <w:bottom w:val="none" w:sz="0" w:space="0" w:color="000000"/>
-                <w:top w:val="none" w:sz="0" w:space="0" w:color="000000"/>
-                <w:left w:val="none" w:sz="0" w:space="0" w:color="000000"/>
-                <w:right w:val="none" w:sz="0" w:space="0" w:color="000000"/>
-              </w:pBdr>
-              <w:spacing w:after="100" w:before="100" w:line="240"/>
-              <w:ind w:left="100" w:right="100" w:firstLine="0" w:firstLineChars="0"/>
-              <w:rPr>
-                <w:rFonts w:ascii="Helvetica" w:hAnsi="Helvetica" w:eastAsia="Helvetica" w:cs="Helvetica"/>
-                <w:i w:val="false"/>
-                <w:b w:val="false"/>
-                <w:u w:val="none"/>
-                <w:sz w:val="22"/>
-                <w:szCs w:val="22"/>
-                <w:color w:val="000000"/>
-              </w:rPr>
-            </w:pPr>
-            <w:r>
-              <w:rPr>
-                <w:rFonts w:ascii="Helvetica" w:hAnsi="Helvetica" w:eastAsia="Helvetica" w:cs="Helvetica"/>
-                <w:i w:val="false"/>
-                <w:b w:val="false"/>
-                <w:u w:val="none"/>
-                <w:sz w:val="22"/>
-                <w:szCs w:val="22"/>
-                <w:color w:val="000000"/>
-              </w:rPr>
-              <w:t xml:space="preserve">0.88, 1.23</w:t>
-            </w:r>
-          </w:p>
-        </w:tc>
-        <w:tc>
-          <w:tcPr>
-            <w:tcBorders>
-              <w:bottom w:val="none" w:sz="0" w:space="0" w:color="000000"/>
-              <w:top w:val="none" w:sz="0" w:space="0" w:color="000000"/>
-              <w:left w:val="none" w:sz="0" w:space="0" w:color="000000"/>
-              <w:right w:val="none" w:sz="0" w:space="0" w:color="000000"/>
-            </w:tcBorders>
-            <w:shd w:val="clear" w:color="auto" w:fill="FFFFFF"/>
-            <w:tcMar>
-              <w:top w:w="0" w:type="dxa"/>
-              <w:bottom w:w="0" w:type="dxa"/>
-              <w:left w:w="0" w:type="dxa"/>
-              <w:right w:w="0" w:type="dxa"/>
-            </w:tcMar>
-            <w:vAlign w:val="top"/>
-          </w:tcPr>
-          <w:p>
-            <w:pPr>
-              <w:pStyle w:val="Normal"/>
-              <w:jc w:val="center"/>
-              <w:pBdr>
-                <w:bottom w:val="none" w:sz="0" w:space="0" w:color="000000"/>
-                <w:top w:val="none" w:sz="0" w:space="0" w:color="000000"/>
-                <w:left w:val="none" w:sz="0" w:space="0" w:color="000000"/>
-                <w:right w:val="none" w:sz="0" w:space="0" w:color="000000"/>
-              </w:pBdr>
-              <w:spacing w:after="100" w:before="100" w:line="240"/>
-              <w:ind w:left="100" w:right="100" w:firstLine="0" w:firstLineChars="0"/>
-              <w:rPr>
-                <w:rFonts w:ascii="Helvetica" w:hAnsi="Helvetica" w:eastAsia="Helvetica" w:cs="Helvetica"/>
-                <w:i w:val="false"/>
-                <w:b w:val="false"/>
-                <w:u w:val="none"/>
-                <w:sz w:val="22"/>
-                <w:szCs w:val="22"/>
-                <w:color w:val="000000"/>
-              </w:rPr>
-            </w:pPr>
-            <w:r>
-              <w:rPr>
-                <w:rFonts w:ascii="Helvetica" w:hAnsi="Helvetica" w:eastAsia="Helvetica" w:cs="Helvetica"/>
-                <w:i w:val="false"/>
-                <w:b w:val="false"/>
-                <w:u w:val="none"/>
-                <w:sz w:val="22"/>
-                <w:szCs w:val="22"/>
-                <w:color w:val="000000"/>
-              </w:rPr>
-              <w:t xml:space="preserve">0.640</w:t>
+              <w:t xml:space="preserve">2.33</w:t>
+            </w:r>
+          </w:p>
+        </w:tc>
+        <w:tc>
+          <w:tcPr>
+            <w:tcBorders>
+              <w:bottom w:val="none" w:sz="0" w:space="0" w:color="000000"/>
+              <w:top w:val="none" w:sz="0" w:space="0" w:color="000000"/>
+              <w:left w:val="none" w:sz="0" w:space="0" w:color="000000"/>
+              <w:right w:val="none" w:sz="0" w:space="0" w:color="000000"/>
+            </w:tcBorders>
+            <w:shd w:val="clear" w:color="auto" w:fill="FFFFFF"/>
+            <w:tcMar>
+              <w:top w:w="0" w:type="dxa"/>
+              <w:bottom w:w="0" w:type="dxa"/>
+              <w:left w:w="0" w:type="dxa"/>
+              <w:right w:w="0" w:type="dxa"/>
+            </w:tcMar>
+            <w:vAlign w:val="top"/>
+          </w:tcPr>
+          <w:p>
+            <w:pPr>
+              <w:pStyle w:val="Normal"/>
+              <w:jc w:val="center"/>
+              <w:pBdr>
+                <w:bottom w:val="none" w:sz="0" w:space="0" w:color="000000"/>
+                <w:top w:val="none" w:sz="0" w:space="0" w:color="000000"/>
+                <w:left w:val="none" w:sz="0" w:space="0" w:color="000000"/>
+                <w:right w:val="none" w:sz="0" w:space="0" w:color="000000"/>
+              </w:pBdr>
+              <w:spacing w:after="100" w:before="100" w:line="240"/>
+              <w:ind w:left="100" w:right="100" w:firstLine="0" w:firstLineChars="0"/>
+              <w:rPr>
+                <w:rFonts w:ascii="Helvetica" w:hAnsi="Helvetica" w:eastAsia="Helvetica" w:cs="Helvetica"/>
+                <w:i w:val="false"/>
+                <w:b w:val="false"/>
+                <w:u w:val="none"/>
+                <w:sz w:val="22"/>
+                <w:szCs w:val="22"/>
+                <w:color w:val="000000"/>
+              </w:rPr>
+            </w:pPr>
+            <w:r>
+              <w:rPr>
+                <w:rFonts w:ascii="Helvetica" w:hAnsi="Helvetica" w:eastAsia="Helvetica" w:cs="Helvetica"/>
+                <w:i w:val="false"/>
+                <w:b w:val="false"/>
+                <w:u w:val="none"/>
+                <w:sz w:val="22"/>
+                <w:szCs w:val="22"/>
+                <w:color w:val="000000"/>
+              </w:rPr>
+              <w:t xml:space="preserve">1.29, 4.22</w:t>
+            </w:r>
+          </w:p>
+        </w:tc>
+        <w:tc>
+          <w:tcPr>
+            <w:tcBorders>
+              <w:bottom w:val="none" w:sz="0" w:space="0" w:color="000000"/>
+              <w:top w:val="none" w:sz="0" w:space="0" w:color="000000"/>
+              <w:left w:val="none" w:sz="0" w:space="0" w:color="000000"/>
+              <w:right w:val="none" w:sz="0" w:space="0" w:color="000000"/>
+            </w:tcBorders>
+            <w:shd w:val="clear" w:color="auto" w:fill="FFFFFF"/>
+            <w:tcMar>
+              <w:top w:w="0" w:type="dxa"/>
+              <w:bottom w:w="0" w:type="dxa"/>
+              <w:left w:w="0" w:type="dxa"/>
+              <w:right w:w="0" w:type="dxa"/>
+            </w:tcMar>
+            <w:vAlign w:val="top"/>
+          </w:tcPr>
+          <w:p>
+            <w:pPr>
+              <w:pStyle w:val="Normal"/>
+              <w:jc w:val="center"/>
+              <w:pBdr>
+                <w:bottom w:val="none" w:sz="0" w:space="0" w:color="000000"/>
+                <w:top w:val="none" w:sz="0" w:space="0" w:color="000000"/>
+                <w:left w:val="none" w:sz="0" w:space="0" w:color="000000"/>
+                <w:right w:val="none" w:sz="0" w:space="0" w:color="000000"/>
+              </w:pBdr>
+              <w:spacing w:after="100" w:before="100" w:line="240"/>
+              <w:ind w:left="100" w:right="100" w:firstLine="0" w:firstLineChars="0"/>
+              <w:rPr>
+                <w:rFonts w:ascii="Helvetica" w:hAnsi="Helvetica" w:eastAsia="Helvetica" w:cs="Helvetica"/>
+                <w:i w:val="false"/>
+                <w:b w:val="false"/>
+                <w:u w:val="none"/>
+                <w:sz w:val="22"/>
+                <w:szCs w:val="22"/>
+                <w:color w:val="000000"/>
+              </w:rPr>
+            </w:pPr>
+            <w:r>
+              <w:rPr>
+                <w:rFonts w:ascii="Helvetica" w:hAnsi="Helvetica" w:eastAsia="Helvetica" w:cs="Helvetica"/>
+                <w:i w:val="false"/>
+                <w:b w:val="false"/>
+                <w:u w:val="none"/>
+                <w:sz w:val="22"/>
+                <w:szCs w:val="22"/>
+                <w:color w:val="000000"/>
+              </w:rPr>
+              <w:t xml:space="preserve">0.005</w:t>
             </w:r>
           </w:p>
         </w:tc>
@@ -3518,113 +3518,113 @@
                 <w:szCs w:val="22"/>
                 <w:color w:val="000000"/>
               </w:rPr>
-              <w:t xml:space="preserve">1.04</w:t>
-            </w:r>
-          </w:p>
-        </w:tc>
-        <w:tc>
-          <w:tcPr>
-            <w:tcBorders>
-              <w:bottom w:val="none" w:sz="0" w:space="0" w:color="000000"/>
-              <w:top w:val="none" w:sz="0" w:space="0" w:color="000000"/>
-              <w:left w:val="none" w:sz="0" w:space="0" w:color="000000"/>
-              <w:right w:val="none" w:sz="0" w:space="0" w:color="000000"/>
-            </w:tcBorders>
-            <w:shd w:val="clear" w:color="auto" w:fill="FFFFFF"/>
-            <w:tcMar>
-              <w:top w:w="0" w:type="dxa"/>
-              <w:bottom w:w="0" w:type="dxa"/>
-              <w:left w:w="0" w:type="dxa"/>
-              <w:right w:w="0" w:type="dxa"/>
-            </w:tcMar>
-            <w:vAlign w:val="top"/>
-          </w:tcPr>
-          <w:p>
-            <w:pPr>
-              <w:pStyle w:val="Normal"/>
-              <w:jc w:val="center"/>
-              <w:pBdr>
-                <w:bottom w:val="none" w:sz="0" w:space="0" w:color="000000"/>
-                <w:top w:val="none" w:sz="0" w:space="0" w:color="000000"/>
-                <w:left w:val="none" w:sz="0" w:space="0" w:color="000000"/>
-                <w:right w:val="none" w:sz="0" w:space="0" w:color="000000"/>
-              </w:pBdr>
-              <w:spacing w:after="100" w:before="100" w:line="240"/>
-              <w:ind w:left="100" w:right="100" w:firstLine="0" w:firstLineChars="0"/>
-              <w:rPr>
-                <w:rFonts w:ascii="Helvetica" w:hAnsi="Helvetica" w:eastAsia="Helvetica" w:cs="Helvetica"/>
-                <w:i w:val="false"/>
-                <w:b w:val="false"/>
-                <w:u w:val="none"/>
-                <w:sz w:val="22"/>
-                <w:szCs w:val="22"/>
-                <w:color w:val="000000"/>
-              </w:rPr>
-            </w:pPr>
-            <w:r>
-              <w:rPr>
-                <w:rFonts w:ascii="Helvetica" w:hAnsi="Helvetica" w:eastAsia="Helvetica" w:cs="Helvetica"/>
-                <w:i w:val="false"/>
-                <w:b w:val="false"/>
-                <w:u w:val="none"/>
-                <w:sz w:val="22"/>
-                <w:szCs w:val="22"/>
-                <w:color w:val="000000"/>
-              </w:rPr>
-              <w:t xml:space="preserve">0.88, 1.22</w:t>
-            </w:r>
-          </w:p>
-        </w:tc>
-        <w:tc>
-          <w:tcPr>
-            <w:tcBorders>
-              <w:bottom w:val="none" w:sz="0" w:space="0" w:color="000000"/>
-              <w:top w:val="none" w:sz="0" w:space="0" w:color="000000"/>
-              <w:left w:val="none" w:sz="0" w:space="0" w:color="000000"/>
-              <w:right w:val="none" w:sz="0" w:space="0" w:color="000000"/>
-            </w:tcBorders>
-            <w:shd w:val="clear" w:color="auto" w:fill="FFFFFF"/>
-            <w:tcMar>
-              <w:top w:w="0" w:type="dxa"/>
-              <w:bottom w:w="0" w:type="dxa"/>
-              <w:left w:w="0" w:type="dxa"/>
-              <w:right w:w="0" w:type="dxa"/>
-            </w:tcMar>
-            <w:vAlign w:val="top"/>
-          </w:tcPr>
-          <w:p>
-            <w:pPr>
-              <w:pStyle w:val="Normal"/>
-              <w:jc w:val="center"/>
-              <w:pBdr>
-                <w:bottom w:val="none" w:sz="0" w:space="0" w:color="000000"/>
-                <w:top w:val="none" w:sz="0" w:space="0" w:color="000000"/>
-                <w:left w:val="none" w:sz="0" w:space="0" w:color="000000"/>
-                <w:right w:val="none" w:sz="0" w:space="0" w:color="000000"/>
-              </w:pBdr>
-              <w:spacing w:after="100" w:before="100" w:line="240"/>
-              <w:ind w:left="100" w:right="100" w:firstLine="0" w:firstLineChars="0"/>
-              <w:rPr>
-                <w:rFonts w:ascii="Helvetica" w:hAnsi="Helvetica" w:eastAsia="Helvetica" w:cs="Helvetica"/>
-                <w:i w:val="false"/>
-                <w:b w:val="false"/>
-                <w:u w:val="none"/>
-                <w:sz w:val="22"/>
-                <w:szCs w:val="22"/>
-                <w:color w:val="000000"/>
-              </w:rPr>
-            </w:pPr>
-            <w:r>
-              <w:rPr>
-                <w:rFonts w:ascii="Helvetica" w:hAnsi="Helvetica" w:eastAsia="Helvetica" w:cs="Helvetica"/>
-                <w:i w:val="false"/>
-                <w:b w:val="false"/>
-                <w:u w:val="none"/>
-                <w:sz w:val="22"/>
-                <w:szCs w:val="22"/>
-                <w:color w:val="000000"/>
-              </w:rPr>
-              <w:t xml:space="preserve">0.670</w:t>
+              <w:t xml:space="preserve">2.26</w:t>
+            </w:r>
+          </w:p>
+        </w:tc>
+        <w:tc>
+          <w:tcPr>
+            <w:tcBorders>
+              <w:bottom w:val="none" w:sz="0" w:space="0" w:color="000000"/>
+              <w:top w:val="none" w:sz="0" w:space="0" w:color="000000"/>
+              <w:left w:val="none" w:sz="0" w:space="0" w:color="000000"/>
+              <w:right w:val="none" w:sz="0" w:space="0" w:color="000000"/>
+            </w:tcBorders>
+            <w:shd w:val="clear" w:color="auto" w:fill="FFFFFF"/>
+            <w:tcMar>
+              <w:top w:w="0" w:type="dxa"/>
+              <w:bottom w:w="0" w:type="dxa"/>
+              <w:left w:w="0" w:type="dxa"/>
+              <w:right w:w="0" w:type="dxa"/>
+            </w:tcMar>
+            <w:vAlign w:val="top"/>
+          </w:tcPr>
+          <w:p>
+            <w:pPr>
+              <w:pStyle w:val="Normal"/>
+              <w:jc w:val="center"/>
+              <w:pBdr>
+                <w:bottom w:val="none" w:sz="0" w:space="0" w:color="000000"/>
+                <w:top w:val="none" w:sz="0" w:space="0" w:color="000000"/>
+                <w:left w:val="none" w:sz="0" w:space="0" w:color="000000"/>
+                <w:right w:val="none" w:sz="0" w:space="0" w:color="000000"/>
+              </w:pBdr>
+              <w:spacing w:after="100" w:before="100" w:line="240"/>
+              <w:ind w:left="100" w:right="100" w:firstLine="0" w:firstLineChars="0"/>
+              <w:rPr>
+                <w:rFonts w:ascii="Helvetica" w:hAnsi="Helvetica" w:eastAsia="Helvetica" w:cs="Helvetica"/>
+                <w:i w:val="false"/>
+                <w:b w:val="false"/>
+                <w:u w:val="none"/>
+                <w:sz w:val="22"/>
+                <w:szCs w:val="22"/>
+                <w:color w:val="000000"/>
+              </w:rPr>
+            </w:pPr>
+            <w:r>
+              <w:rPr>
+                <w:rFonts w:ascii="Helvetica" w:hAnsi="Helvetica" w:eastAsia="Helvetica" w:cs="Helvetica"/>
+                <w:i w:val="false"/>
+                <w:b w:val="false"/>
+                <w:u w:val="none"/>
+                <w:sz w:val="22"/>
+                <w:szCs w:val="22"/>
+                <w:color w:val="000000"/>
+              </w:rPr>
+              <w:t xml:space="preserve">0.74, 6.90</w:t>
+            </w:r>
+          </w:p>
+        </w:tc>
+        <w:tc>
+          <w:tcPr>
+            <w:tcBorders>
+              <w:bottom w:val="none" w:sz="0" w:space="0" w:color="000000"/>
+              <w:top w:val="none" w:sz="0" w:space="0" w:color="000000"/>
+              <w:left w:val="none" w:sz="0" w:space="0" w:color="000000"/>
+              <w:right w:val="none" w:sz="0" w:space="0" w:color="000000"/>
+            </w:tcBorders>
+            <w:shd w:val="clear" w:color="auto" w:fill="FFFFFF"/>
+            <w:tcMar>
+              <w:top w:w="0" w:type="dxa"/>
+              <w:bottom w:w="0" w:type="dxa"/>
+              <w:left w:w="0" w:type="dxa"/>
+              <w:right w:w="0" w:type="dxa"/>
+            </w:tcMar>
+            <w:vAlign w:val="top"/>
+          </w:tcPr>
+          <w:p>
+            <w:pPr>
+              <w:pStyle w:val="Normal"/>
+              <w:jc w:val="center"/>
+              <w:pBdr>
+                <w:bottom w:val="none" w:sz="0" w:space="0" w:color="000000"/>
+                <w:top w:val="none" w:sz="0" w:space="0" w:color="000000"/>
+                <w:left w:val="none" w:sz="0" w:space="0" w:color="000000"/>
+                <w:right w:val="none" w:sz="0" w:space="0" w:color="000000"/>
+              </w:pBdr>
+              <w:spacing w:after="100" w:before="100" w:line="240"/>
+              <w:ind w:left="100" w:right="100" w:firstLine="0" w:firstLineChars="0"/>
+              <w:rPr>
+                <w:rFonts w:ascii="Helvetica" w:hAnsi="Helvetica" w:eastAsia="Helvetica" w:cs="Helvetica"/>
+                <w:i w:val="false"/>
+                <w:b w:val="false"/>
+                <w:u w:val="none"/>
+                <w:sz w:val="22"/>
+                <w:szCs w:val="22"/>
+                <w:color w:val="000000"/>
+              </w:rPr>
+            </w:pPr>
+            <w:r>
+              <w:rPr>
+                <w:rFonts w:ascii="Helvetica" w:hAnsi="Helvetica" w:eastAsia="Helvetica" w:cs="Helvetica"/>
+                <w:i w:val="false"/>
+                <w:b w:val="false"/>
+                <w:u w:val="none"/>
+                <w:sz w:val="22"/>
+                <w:szCs w:val="22"/>
+                <w:color w:val="000000"/>
+              </w:rPr>
+              <w:t xml:space="preserve">0.150</w:t>
             </w:r>
           </w:p>
         </w:tc>
@@ -4001,113 +4001,113 @@
                 <w:szCs w:val="22"/>
                 <w:color w:val="000000"/>
               </w:rPr>
-              <w:t xml:space="preserve">1.66</w:t>
-            </w:r>
-          </w:p>
-        </w:tc>
-        <w:tc>
-          <w:tcPr>
-            <w:tcBorders>
-              <w:bottom w:val="none" w:sz="0" w:space="0" w:color="000000"/>
-              <w:top w:val="none" w:sz="0" w:space="0" w:color="000000"/>
-              <w:left w:val="none" w:sz="0" w:space="0" w:color="000000"/>
-              <w:right w:val="none" w:sz="0" w:space="0" w:color="000000"/>
-            </w:tcBorders>
-            <w:shd w:val="clear" w:color="auto" w:fill="FFFFFF"/>
-            <w:tcMar>
-              <w:top w:w="0" w:type="dxa"/>
-              <w:bottom w:w="0" w:type="dxa"/>
-              <w:left w:w="0" w:type="dxa"/>
-              <w:right w:w="0" w:type="dxa"/>
-            </w:tcMar>
-            <w:vAlign w:val="top"/>
-          </w:tcPr>
-          <w:p>
-            <w:pPr>
-              <w:pStyle w:val="Normal"/>
-              <w:jc w:val="center"/>
-              <w:pBdr>
-                <w:bottom w:val="none" w:sz="0" w:space="0" w:color="000000"/>
-                <w:top w:val="none" w:sz="0" w:space="0" w:color="000000"/>
-                <w:left w:val="none" w:sz="0" w:space="0" w:color="000000"/>
-                <w:right w:val="none" w:sz="0" w:space="0" w:color="000000"/>
-              </w:pBdr>
-              <w:spacing w:after="100" w:before="100" w:line="240"/>
-              <w:ind w:left="100" w:right="100" w:firstLine="0" w:firstLineChars="0"/>
-              <w:rPr>
-                <w:rFonts w:ascii="Helvetica" w:hAnsi="Helvetica" w:eastAsia="Helvetica" w:cs="Helvetica"/>
-                <w:i w:val="false"/>
-                <w:b w:val="false"/>
-                <w:u w:val="none"/>
-                <w:sz w:val="22"/>
-                <w:szCs w:val="22"/>
-                <w:color w:val="000000"/>
-              </w:rPr>
-            </w:pPr>
-            <w:r>
-              <w:rPr>
-                <w:rFonts w:ascii="Helvetica" w:hAnsi="Helvetica" w:eastAsia="Helvetica" w:cs="Helvetica"/>
-                <w:i w:val="false"/>
-                <w:b w:val="false"/>
-                <w:u w:val="none"/>
-                <w:sz w:val="22"/>
-                <w:szCs w:val="22"/>
-                <w:color w:val="000000"/>
-              </w:rPr>
-              <w:t xml:space="preserve">0.41, 6.68</w:t>
-            </w:r>
-          </w:p>
-        </w:tc>
-        <w:tc>
-          <w:tcPr>
-            <w:tcBorders>
-              <w:bottom w:val="none" w:sz="0" w:space="0" w:color="000000"/>
-              <w:top w:val="none" w:sz="0" w:space="0" w:color="000000"/>
-              <w:left w:val="none" w:sz="0" w:space="0" w:color="000000"/>
-              <w:right w:val="none" w:sz="0" w:space="0" w:color="000000"/>
-            </w:tcBorders>
-            <w:shd w:val="clear" w:color="auto" w:fill="FFFFFF"/>
-            <w:tcMar>
-              <w:top w:w="0" w:type="dxa"/>
-              <w:bottom w:w="0" w:type="dxa"/>
-              <w:left w:w="0" w:type="dxa"/>
-              <w:right w:w="0" w:type="dxa"/>
-            </w:tcMar>
-            <w:vAlign w:val="top"/>
-          </w:tcPr>
-          <w:p>
-            <w:pPr>
-              <w:pStyle w:val="Normal"/>
-              <w:jc w:val="center"/>
-              <w:pBdr>
-                <w:bottom w:val="none" w:sz="0" w:space="0" w:color="000000"/>
-                <w:top w:val="none" w:sz="0" w:space="0" w:color="000000"/>
-                <w:left w:val="none" w:sz="0" w:space="0" w:color="000000"/>
-                <w:right w:val="none" w:sz="0" w:space="0" w:color="000000"/>
-              </w:pBdr>
-              <w:spacing w:after="100" w:before="100" w:line="240"/>
-              <w:ind w:left="100" w:right="100" w:firstLine="0" w:firstLineChars="0"/>
-              <w:rPr>
-                <w:rFonts w:ascii="Helvetica" w:hAnsi="Helvetica" w:eastAsia="Helvetica" w:cs="Helvetica"/>
-                <w:i w:val="false"/>
-                <w:b w:val="false"/>
-                <w:u w:val="none"/>
-                <w:sz w:val="22"/>
-                <w:szCs w:val="22"/>
-                <w:color w:val="000000"/>
-              </w:rPr>
-            </w:pPr>
-            <w:r>
-              <w:rPr>
-                <w:rFonts w:ascii="Helvetica" w:hAnsi="Helvetica" w:eastAsia="Helvetica" w:cs="Helvetica"/>
-                <w:i w:val="false"/>
-                <w:b w:val="false"/>
-                <w:u w:val="none"/>
-                <w:sz w:val="22"/>
-                <w:szCs w:val="22"/>
-                <w:color w:val="000000"/>
-              </w:rPr>
-              <w:t xml:space="preserve">0.480</w:t>
+              <w:t xml:space="preserve">2.20</w:t>
+            </w:r>
+          </w:p>
+        </w:tc>
+        <w:tc>
+          <w:tcPr>
+            <w:tcBorders>
+              <w:bottom w:val="none" w:sz="0" w:space="0" w:color="000000"/>
+              <w:top w:val="none" w:sz="0" w:space="0" w:color="000000"/>
+              <w:left w:val="none" w:sz="0" w:space="0" w:color="000000"/>
+              <w:right w:val="none" w:sz="0" w:space="0" w:color="000000"/>
+            </w:tcBorders>
+            <w:shd w:val="clear" w:color="auto" w:fill="FFFFFF"/>
+            <w:tcMar>
+              <w:top w:w="0" w:type="dxa"/>
+              <w:bottom w:w="0" w:type="dxa"/>
+              <w:left w:w="0" w:type="dxa"/>
+              <w:right w:w="0" w:type="dxa"/>
+            </w:tcMar>
+            <w:vAlign w:val="top"/>
+          </w:tcPr>
+          <w:p>
+            <w:pPr>
+              <w:pStyle w:val="Normal"/>
+              <w:jc w:val="center"/>
+              <w:pBdr>
+                <w:bottom w:val="none" w:sz="0" w:space="0" w:color="000000"/>
+                <w:top w:val="none" w:sz="0" w:space="0" w:color="000000"/>
+                <w:left w:val="none" w:sz="0" w:space="0" w:color="000000"/>
+                <w:right w:val="none" w:sz="0" w:space="0" w:color="000000"/>
+              </w:pBdr>
+              <w:spacing w:after="100" w:before="100" w:line="240"/>
+              <w:ind w:left="100" w:right="100" w:firstLine="0" w:firstLineChars="0"/>
+              <w:rPr>
+                <w:rFonts w:ascii="Helvetica" w:hAnsi="Helvetica" w:eastAsia="Helvetica" w:cs="Helvetica"/>
+                <w:i w:val="false"/>
+                <w:b w:val="false"/>
+                <w:u w:val="none"/>
+                <w:sz w:val="22"/>
+                <w:szCs w:val="22"/>
+                <w:color w:val="000000"/>
+              </w:rPr>
+            </w:pPr>
+            <w:r>
+              <w:rPr>
+                <w:rFonts w:ascii="Helvetica" w:hAnsi="Helvetica" w:eastAsia="Helvetica" w:cs="Helvetica"/>
+                <w:i w:val="false"/>
+                <w:b w:val="false"/>
+                <w:u w:val="none"/>
+                <w:sz w:val="22"/>
+                <w:szCs w:val="22"/>
+                <w:color w:val="000000"/>
+              </w:rPr>
+              <w:t xml:space="preserve">0.44, 10.9</w:t>
+            </w:r>
+          </w:p>
+        </w:tc>
+        <w:tc>
+          <w:tcPr>
+            <w:tcBorders>
+              <w:bottom w:val="none" w:sz="0" w:space="0" w:color="000000"/>
+              <w:top w:val="none" w:sz="0" w:space="0" w:color="000000"/>
+              <w:left w:val="none" w:sz="0" w:space="0" w:color="000000"/>
+              <w:right w:val="none" w:sz="0" w:space="0" w:color="000000"/>
+            </w:tcBorders>
+            <w:shd w:val="clear" w:color="auto" w:fill="FFFFFF"/>
+            <w:tcMar>
+              <w:top w:w="0" w:type="dxa"/>
+              <w:bottom w:w="0" w:type="dxa"/>
+              <w:left w:w="0" w:type="dxa"/>
+              <w:right w:w="0" w:type="dxa"/>
+            </w:tcMar>
+            <w:vAlign w:val="top"/>
+          </w:tcPr>
+          <w:p>
+            <w:pPr>
+              <w:pStyle w:val="Normal"/>
+              <w:jc w:val="center"/>
+              <w:pBdr>
+                <w:bottom w:val="none" w:sz="0" w:space="0" w:color="000000"/>
+                <w:top w:val="none" w:sz="0" w:space="0" w:color="000000"/>
+                <w:left w:val="none" w:sz="0" w:space="0" w:color="000000"/>
+                <w:right w:val="none" w:sz="0" w:space="0" w:color="000000"/>
+              </w:pBdr>
+              <w:spacing w:after="100" w:before="100" w:line="240"/>
+              <w:ind w:left="100" w:right="100" w:firstLine="0" w:firstLineChars="0"/>
+              <w:rPr>
+                <w:rFonts w:ascii="Helvetica" w:hAnsi="Helvetica" w:eastAsia="Helvetica" w:cs="Helvetica"/>
+                <w:i w:val="false"/>
+                <w:b w:val="false"/>
+                <w:u w:val="none"/>
+                <w:sz w:val="22"/>
+                <w:szCs w:val="22"/>
+                <w:color w:val="000000"/>
+              </w:rPr>
+            </w:pPr>
+            <w:r>
+              <w:rPr>
+                <w:rFonts w:ascii="Helvetica" w:hAnsi="Helvetica" w:eastAsia="Helvetica" w:cs="Helvetica"/>
+                <w:i w:val="false"/>
+                <w:b w:val="false"/>
+                <w:u w:val="none"/>
+                <w:sz w:val="22"/>
+                <w:szCs w:val="22"/>
+                <w:color w:val="000000"/>
+              </w:rPr>
+              <w:t xml:space="preserve">0.330</w:t>
             </w:r>
           </w:p>
         </w:tc>
@@ -4484,7 +4484,7 @@
                 <w:szCs w:val="22"/>
                 <w:color w:val="000000"/>
               </w:rPr>
-              <w:t xml:space="preserve">1.01</w:t>
+              <w:t xml:space="preserve">1.00</w:t>
             </w:r>
           </w:p>
         </w:tc>
@@ -4590,7 +4590,7 @@
                 <w:szCs w:val="22"/>
                 <w:color w:val="000000"/>
               </w:rPr>
-              <w:t xml:space="preserve">0.480</w:t>
+              <w:t xml:space="preserve">0.760</w:t>
             </w:r>
           </w:p>
         </w:tc>

</xml_diff>

<commit_message>
Switch ECOG adjuster from continuous ecog_score to binary ecog_score_cat2
Every adjuster set now uses ecog_score_cat2 (factor: "0" vs ">=1") so
the model adjusts for "any ECOG impairment" as a single dummy instead
of a 1-df linear slope across the 0–5 score. Diagnostic table caption
and descriptive text updated to match. All 11 docx tables and 54 pptx
slides still generate; 0 Lapack errors; 4 placeholder fallbacks
unchanged.

Co-Authored-By: Claude Opus 4.7 (1M context) <noreply@anthropic.com>
</commit_message>
<xml_diff>
--- a/docs/tables/carbo/sec5_aki_2.docx
+++ b/docs/tables/carbo/sec5_aki_2.docx
@@ -17,14 +17,14 @@
         <w:tblLook w:firstRow="1" w:lastRow="0" w:firstColumn="0" w:lastColumn="0" w:noHBand="0" w:noVBand="1"/>
       </w:tblPr>
       <w:tblGrid>
-        <w:gridCol w:w="2025"/>
+        <w:gridCol w:w="2086"/>
         <w:gridCol w:w="778"/>
-        <w:gridCol w:w="839"/>
-        <w:gridCol w:w="1389"/>
+        <w:gridCol w:w="1084"/>
+        <w:gridCol w:w="1879"/>
         <w:gridCol w:w="1181"/>
         <w:gridCol w:w="778"/>
-        <w:gridCol w:w="839"/>
-        <w:gridCol w:w="1389"/>
+        <w:gridCol w:w="1084"/>
+        <w:gridCol w:w="1756"/>
         <w:gridCol w:w="1181"/>
       </w:tblGrid>
       <w:tr>
@@ -32,7 +32,7 @@
           <w:trHeight w:val="574" w:hRule="auto"/>
           <w:tblHeader/>
         </w:trPr>
-        header1
+        header 1
         <w:tc>
           <w:tcPr>
             <w:tcBorders>
@@ -200,7 +200,7 @@
           <w:trHeight w:val="615" w:hRule="auto"/>
           <w:tblHeader/>
         </w:trPr>
-        header2
+        header 2
         <w:tc>
           <w:tcPr>
             <w:tcBorders>
@@ -735,7 +735,7 @@
         <w:trPr>
           <w:trHeight w:val="619" w:hRule="auto"/>
         </w:trPr>
-        body1
+        body 1
         <w:tc>
           <w:tcPr>
             <w:tcBorders>
@@ -1103,7 +1103,7 @@
                 <w:szCs w:val="22"/>
                 <w:color w:val="000000"/>
               </w:rPr>
-              <w:t xml:space="preserve">1.18</w:t>
+              <w:t xml:space="preserve">1.27</w:t>
             </w:r>
           </w:p>
         </w:tc>
@@ -1156,7 +1156,7 @@
                 <w:szCs w:val="22"/>
                 <w:color w:val="000000"/>
               </w:rPr>
-              <w:t xml:space="preserve">0.79, 1.75</w:t>
+              <w:t xml:space="preserve">0.87, 1.85</w:t>
             </w:r>
           </w:p>
         </w:tc>
@@ -1209,7 +1209,7 @@
                 <w:szCs w:val="22"/>
                 <w:color w:val="000000"/>
               </w:rPr>
-              <w:t xml:space="preserve">0.420</w:t>
+              <w:t xml:space="preserve">0.210</w:t>
             </w:r>
           </w:p>
         </w:tc>
@@ -1218,7 +1218,7 @@
         <w:trPr>
           <w:trHeight w:val="598" w:hRule="auto"/>
         </w:trPr>
-        body2
+        body 2
         <w:tc>
           <w:tcPr>
             <w:tcBorders>
@@ -1586,113 +1586,113 @@
                 <w:szCs w:val="22"/>
                 <w:color w:val="000000"/>
               </w:rPr>
-              <w:t xml:space="preserve">1.02</w:t>
-            </w:r>
-          </w:p>
-        </w:tc>
-        <w:tc>
-          <w:tcPr>
-            <w:tcBorders>
-              <w:bottom w:val="none" w:sz="0" w:space="0" w:color="000000"/>
-              <w:top w:val="none" w:sz="0" w:space="0" w:color="000000"/>
-              <w:left w:val="none" w:sz="0" w:space="0" w:color="000000"/>
-              <w:right w:val="none" w:sz="0" w:space="0" w:color="000000"/>
-            </w:tcBorders>
-            <w:shd w:val="clear" w:color="auto" w:fill="FFFFFF"/>
-            <w:tcMar>
-              <w:top w:w="0" w:type="dxa"/>
-              <w:bottom w:w="0" w:type="dxa"/>
-              <w:left w:w="0" w:type="dxa"/>
-              <w:right w:w="0" w:type="dxa"/>
-            </w:tcMar>
-            <w:vAlign w:val="top"/>
-          </w:tcPr>
-          <w:p>
-            <w:pPr>
-              <w:pStyle w:val="Normal"/>
-              <w:jc w:val="center"/>
-              <w:pBdr>
-                <w:bottom w:val="none" w:sz="0" w:space="0" w:color="000000"/>
-                <w:top w:val="none" w:sz="0" w:space="0" w:color="000000"/>
-                <w:left w:val="none" w:sz="0" w:space="0" w:color="000000"/>
-                <w:right w:val="none" w:sz="0" w:space="0" w:color="000000"/>
-              </w:pBdr>
-              <w:spacing w:after="100" w:before="100" w:line="240"/>
-              <w:ind w:left="100" w:right="100" w:firstLine="0" w:firstLineChars="0"/>
-              <w:rPr>
-                <w:rFonts w:ascii="Helvetica" w:hAnsi="Helvetica" w:eastAsia="Helvetica" w:cs="Helvetica"/>
-                <w:i w:val="false"/>
-                <w:b w:val="false"/>
-                <w:u w:val="none"/>
-                <w:sz w:val="22"/>
-                <w:szCs w:val="22"/>
-                <w:color w:val="000000"/>
-              </w:rPr>
-            </w:pPr>
-            <w:r>
-              <w:rPr>
-                <w:rFonts w:ascii="Helvetica" w:hAnsi="Helvetica" w:eastAsia="Helvetica" w:cs="Helvetica"/>
-                <w:i w:val="false"/>
-                <w:b w:val="false"/>
-                <w:u w:val="none"/>
-                <w:sz w:val="22"/>
-                <w:szCs w:val="22"/>
-                <w:color w:val="000000"/>
-              </w:rPr>
-              <w:t xml:space="preserve">0.91, 1.14</w:t>
-            </w:r>
-          </w:p>
-        </w:tc>
-        <w:tc>
-          <w:tcPr>
-            <w:tcBorders>
-              <w:bottom w:val="none" w:sz="0" w:space="0" w:color="000000"/>
-              <w:top w:val="none" w:sz="0" w:space="0" w:color="000000"/>
-              <w:left w:val="none" w:sz="0" w:space="0" w:color="000000"/>
-              <w:right w:val="none" w:sz="0" w:space="0" w:color="000000"/>
-            </w:tcBorders>
-            <w:shd w:val="clear" w:color="auto" w:fill="FFFFFF"/>
-            <w:tcMar>
-              <w:top w:w="0" w:type="dxa"/>
-              <w:bottom w:w="0" w:type="dxa"/>
-              <w:left w:w="0" w:type="dxa"/>
-              <w:right w:w="0" w:type="dxa"/>
-            </w:tcMar>
-            <w:vAlign w:val="top"/>
-          </w:tcPr>
-          <w:p>
-            <w:pPr>
-              <w:pStyle w:val="Normal"/>
-              <w:jc w:val="center"/>
-              <w:pBdr>
-                <w:bottom w:val="none" w:sz="0" w:space="0" w:color="000000"/>
-                <w:top w:val="none" w:sz="0" w:space="0" w:color="000000"/>
-                <w:left w:val="none" w:sz="0" w:space="0" w:color="000000"/>
-                <w:right w:val="none" w:sz="0" w:space="0" w:color="000000"/>
-              </w:pBdr>
-              <w:spacing w:after="100" w:before="100" w:line="240"/>
-              <w:ind w:left="100" w:right="100" w:firstLine="0" w:firstLineChars="0"/>
-              <w:rPr>
-                <w:rFonts w:ascii="Helvetica" w:hAnsi="Helvetica" w:eastAsia="Helvetica" w:cs="Helvetica"/>
-                <w:i w:val="false"/>
-                <w:b w:val="false"/>
-                <w:u w:val="none"/>
-                <w:sz w:val="22"/>
-                <w:szCs w:val="22"/>
-                <w:color w:val="000000"/>
-              </w:rPr>
-            </w:pPr>
-            <w:r>
-              <w:rPr>
-                <w:rFonts w:ascii="Helvetica" w:hAnsi="Helvetica" w:eastAsia="Helvetica" w:cs="Helvetica"/>
-                <w:i w:val="false"/>
-                <w:b w:val="false"/>
-                <w:u w:val="none"/>
-                <w:sz w:val="22"/>
-                <w:szCs w:val="22"/>
-                <w:color w:val="000000"/>
-              </w:rPr>
-              <w:t xml:space="preserve">0.780</w:t>
+              <w:t xml:space="preserve">1.03</w:t>
+            </w:r>
+          </w:p>
+        </w:tc>
+        <w:tc>
+          <w:tcPr>
+            <w:tcBorders>
+              <w:bottom w:val="none" w:sz="0" w:space="0" w:color="000000"/>
+              <w:top w:val="none" w:sz="0" w:space="0" w:color="000000"/>
+              <w:left w:val="none" w:sz="0" w:space="0" w:color="000000"/>
+              <w:right w:val="none" w:sz="0" w:space="0" w:color="000000"/>
+            </w:tcBorders>
+            <w:shd w:val="clear" w:color="auto" w:fill="FFFFFF"/>
+            <w:tcMar>
+              <w:top w:w="0" w:type="dxa"/>
+              <w:bottom w:w="0" w:type="dxa"/>
+              <w:left w:w="0" w:type="dxa"/>
+              <w:right w:w="0" w:type="dxa"/>
+            </w:tcMar>
+            <w:vAlign w:val="top"/>
+          </w:tcPr>
+          <w:p>
+            <w:pPr>
+              <w:pStyle w:val="Normal"/>
+              <w:jc w:val="center"/>
+              <w:pBdr>
+                <w:bottom w:val="none" w:sz="0" w:space="0" w:color="000000"/>
+                <w:top w:val="none" w:sz="0" w:space="0" w:color="000000"/>
+                <w:left w:val="none" w:sz="0" w:space="0" w:color="000000"/>
+                <w:right w:val="none" w:sz="0" w:space="0" w:color="000000"/>
+              </w:pBdr>
+              <w:spacing w:after="100" w:before="100" w:line="240"/>
+              <w:ind w:left="100" w:right="100" w:firstLine="0" w:firstLineChars="0"/>
+              <w:rPr>
+                <w:rFonts w:ascii="Helvetica" w:hAnsi="Helvetica" w:eastAsia="Helvetica" w:cs="Helvetica"/>
+                <w:i w:val="false"/>
+                <w:b w:val="false"/>
+                <w:u w:val="none"/>
+                <w:sz w:val="22"/>
+                <w:szCs w:val="22"/>
+                <w:color w:val="000000"/>
+              </w:rPr>
+            </w:pPr>
+            <w:r>
+              <w:rPr>
+                <w:rFonts w:ascii="Helvetica" w:hAnsi="Helvetica" w:eastAsia="Helvetica" w:cs="Helvetica"/>
+                <w:i w:val="false"/>
+                <w:b w:val="false"/>
+                <w:u w:val="none"/>
+                <w:sz w:val="22"/>
+                <w:szCs w:val="22"/>
+                <w:color w:val="000000"/>
+              </w:rPr>
+              <w:t xml:space="preserve">0.93, 1.13</w:t>
+            </w:r>
+          </w:p>
+        </w:tc>
+        <w:tc>
+          <w:tcPr>
+            <w:tcBorders>
+              <w:bottom w:val="none" w:sz="0" w:space="0" w:color="000000"/>
+              <w:top w:val="none" w:sz="0" w:space="0" w:color="000000"/>
+              <w:left w:val="none" w:sz="0" w:space="0" w:color="000000"/>
+              <w:right w:val="none" w:sz="0" w:space="0" w:color="000000"/>
+            </w:tcBorders>
+            <w:shd w:val="clear" w:color="auto" w:fill="FFFFFF"/>
+            <w:tcMar>
+              <w:top w:w="0" w:type="dxa"/>
+              <w:bottom w:w="0" w:type="dxa"/>
+              <w:left w:w="0" w:type="dxa"/>
+              <w:right w:w="0" w:type="dxa"/>
+            </w:tcMar>
+            <w:vAlign w:val="top"/>
+          </w:tcPr>
+          <w:p>
+            <w:pPr>
+              <w:pStyle w:val="Normal"/>
+              <w:jc w:val="center"/>
+              <w:pBdr>
+                <w:bottom w:val="none" w:sz="0" w:space="0" w:color="000000"/>
+                <w:top w:val="none" w:sz="0" w:space="0" w:color="000000"/>
+                <w:left w:val="none" w:sz="0" w:space="0" w:color="000000"/>
+                <w:right w:val="none" w:sz="0" w:space="0" w:color="000000"/>
+              </w:pBdr>
+              <w:spacing w:after="100" w:before="100" w:line="240"/>
+              <w:ind w:left="100" w:right="100" w:firstLine="0" w:firstLineChars="0"/>
+              <w:rPr>
+                <w:rFonts w:ascii="Helvetica" w:hAnsi="Helvetica" w:eastAsia="Helvetica" w:cs="Helvetica"/>
+                <w:i w:val="false"/>
+                <w:b w:val="false"/>
+                <w:u w:val="none"/>
+                <w:sz w:val="22"/>
+                <w:szCs w:val="22"/>
+                <w:color w:val="000000"/>
+              </w:rPr>
+            </w:pPr>
+            <w:r>
+              <w:rPr>
+                <w:rFonts w:ascii="Helvetica" w:hAnsi="Helvetica" w:eastAsia="Helvetica" w:cs="Helvetica"/>
+                <w:i w:val="false"/>
+                <w:b w:val="false"/>
+                <w:u w:val="none"/>
+                <w:sz w:val="22"/>
+                <w:szCs w:val="22"/>
+                <w:color w:val="000000"/>
+              </w:rPr>
+              <w:t xml:space="preserve">0.600</w:t>
             </w:r>
           </w:p>
         </w:tc>
@@ -1701,7 +1701,7 @@
         <w:trPr>
           <w:trHeight w:val="565" w:hRule="auto"/>
         </w:trPr>
-        body3
+        body 3
         <w:tc>
           <w:tcPr>
             <w:tcBorders>
@@ -2184,7 +2184,7 @@
         <w:trPr>
           <w:trHeight w:val="573" w:hRule="auto"/>
         </w:trPr>
-        body4
+        body 4
         <w:tc>
           <w:tcPr>
             <w:tcBorders>
@@ -2667,7 +2667,7 @@
         <w:trPr>
           <w:trHeight w:val="598" w:hRule="auto"/>
         </w:trPr>
-        body5
+        body 5
         <w:tc>
           <w:tcPr>
             <w:tcBorders>
@@ -3035,113 +3035,1079 @@
                 <w:szCs w:val="22"/>
                 <w:color w:val="000000"/>
               </w:rPr>
-              <w:t xml:space="preserve">1.70</w:t>
-            </w:r>
-          </w:p>
-        </w:tc>
-        <w:tc>
-          <w:tcPr>
-            <w:tcBorders>
-              <w:bottom w:val="none" w:sz="0" w:space="0" w:color="000000"/>
-              <w:top w:val="none" w:sz="0" w:space="0" w:color="000000"/>
-              <w:left w:val="none" w:sz="0" w:space="0" w:color="000000"/>
-              <w:right w:val="none" w:sz="0" w:space="0" w:color="000000"/>
-            </w:tcBorders>
-            <w:shd w:val="clear" w:color="auto" w:fill="FFFFFF"/>
-            <w:tcMar>
-              <w:top w:w="0" w:type="dxa"/>
-              <w:bottom w:w="0" w:type="dxa"/>
-              <w:left w:w="0" w:type="dxa"/>
-              <w:right w:w="0" w:type="dxa"/>
-            </w:tcMar>
-            <w:vAlign w:val="top"/>
-          </w:tcPr>
-          <w:p>
-            <w:pPr>
-              <w:pStyle w:val="Normal"/>
-              <w:jc w:val="center"/>
-              <w:pBdr>
-                <w:bottom w:val="none" w:sz="0" w:space="0" w:color="000000"/>
-                <w:top w:val="none" w:sz="0" w:space="0" w:color="000000"/>
-                <w:left w:val="none" w:sz="0" w:space="0" w:color="000000"/>
-                <w:right w:val="none" w:sz="0" w:space="0" w:color="000000"/>
-              </w:pBdr>
-              <w:spacing w:after="100" w:before="100" w:line="240"/>
-              <w:ind w:left="100" w:right="100" w:firstLine="0" w:firstLineChars="0"/>
-              <w:rPr>
-                <w:rFonts w:ascii="Helvetica" w:hAnsi="Helvetica" w:eastAsia="Helvetica" w:cs="Helvetica"/>
-                <w:i w:val="false"/>
-                <w:b w:val="false"/>
-                <w:u w:val="none"/>
-                <w:sz w:val="22"/>
-                <w:szCs w:val="22"/>
-                <w:color w:val="000000"/>
-              </w:rPr>
-            </w:pPr>
-            <w:r>
-              <w:rPr>
-                <w:rFonts w:ascii="Helvetica" w:hAnsi="Helvetica" w:eastAsia="Helvetica" w:cs="Helvetica"/>
-                <w:i w:val="false"/>
-                <w:b w:val="false"/>
-                <w:u w:val="none"/>
-                <w:sz w:val="22"/>
-                <w:szCs w:val="22"/>
-                <w:color w:val="000000"/>
-              </w:rPr>
-              <w:t xml:space="preserve">0.31, 9.35</w:t>
-            </w:r>
-          </w:p>
-        </w:tc>
-        <w:tc>
-          <w:tcPr>
-            <w:tcBorders>
-              <w:bottom w:val="none" w:sz="0" w:space="0" w:color="000000"/>
-              <w:top w:val="none" w:sz="0" w:space="0" w:color="000000"/>
-              <w:left w:val="none" w:sz="0" w:space="0" w:color="000000"/>
-              <w:right w:val="none" w:sz="0" w:space="0" w:color="000000"/>
-            </w:tcBorders>
-            <w:shd w:val="clear" w:color="auto" w:fill="FFFFFF"/>
-            <w:tcMar>
-              <w:top w:w="0" w:type="dxa"/>
-              <w:bottom w:w="0" w:type="dxa"/>
-              <w:left w:w="0" w:type="dxa"/>
-              <w:right w:w="0" w:type="dxa"/>
-            </w:tcMar>
-            <w:vAlign w:val="top"/>
-          </w:tcPr>
-          <w:p>
-            <w:pPr>
-              <w:pStyle w:val="Normal"/>
-              <w:jc w:val="center"/>
-              <w:pBdr>
-                <w:bottom w:val="none" w:sz="0" w:space="0" w:color="000000"/>
-                <w:top w:val="none" w:sz="0" w:space="0" w:color="000000"/>
-                <w:left w:val="none" w:sz="0" w:space="0" w:color="000000"/>
-                <w:right w:val="none" w:sz="0" w:space="0" w:color="000000"/>
-              </w:pBdr>
-              <w:spacing w:after="100" w:before="100" w:line="240"/>
-              <w:ind w:left="100" w:right="100" w:firstLine="0" w:firstLineChars="0"/>
-              <w:rPr>
-                <w:rFonts w:ascii="Helvetica" w:hAnsi="Helvetica" w:eastAsia="Helvetica" w:cs="Helvetica"/>
-                <w:i w:val="false"/>
-                <w:b w:val="false"/>
-                <w:u w:val="none"/>
-                <w:sz w:val="22"/>
-                <w:szCs w:val="22"/>
-                <w:color w:val="000000"/>
-              </w:rPr>
-            </w:pPr>
-            <w:r>
-              <w:rPr>
-                <w:rFonts w:ascii="Helvetica" w:hAnsi="Helvetica" w:eastAsia="Helvetica" w:cs="Helvetica"/>
-                <w:i w:val="false"/>
-                <w:b w:val="false"/>
-                <w:u w:val="none"/>
-                <w:sz w:val="22"/>
-                <w:szCs w:val="22"/>
-                <w:color w:val="000000"/>
-              </w:rPr>
-              <w:t xml:space="preserve">0.540</w:t>
+              <w:t xml:space="preserve">1.49</w:t>
+            </w:r>
+          </w:p>
+        </w:tc>
+        <w:tc>
+          <w:tcPr>
+            <w:tcBorders>
+              <w:bottom w:val="none" w:sz="0" w:space="0" w:color="000000"/>
+              <w:top w:val="none" w:sz="0" w:space="0" w:color="000000"/>
+              <w:left w:val="none" w:sz="0" w:space="0" w:color="000000"/>
+              <w:right w:val="none" w:sz="0" w:space="0" w:color="000000"/>
+            </w:tcBorders>
+            <w:shd w:val="clear" w:color="auto" w:fill="FFFFFF"/>
+            <w:tcMar>
+              <w:top w:w="0" w:type="dxa"/>
+              <w:bottom w:w="0" w:type="dxa"/>
+              <w:left w:w="0" w:type="dxa"/>
+              <w:right w:w="0" w:type="dxa"/>
+            </w:tcMar>
+            <w:vAlign w:val="top"/>
+          </w:tcPr>
+          <w:p>
+            <w:pPr>
+              <w:pStyle w:val="Normal"/>
+              <w:jc w:val="center"/>
+              <w:pBdr>
+                <w:bottom w:val="none" w:sz="0" w:space="0" w:color="000000"/>
+                <w:top w:val="none" w:sz="0" w:space="0" w:color="000000"/>
+                <w:left w:val="none" w:sz="0" w:space="0" w:color="000000"/>
+                <w:right w:val="none" w:sz="0" w:space="0" w:color="000000"/>
+              </w:pBdr>
+              <w:spacing w:after="100" w:before="100" w:line="240"/>
+              <w:ind w:left="100" w:right="100" w:firstLine="0" w:firstLineChars="0"/>
+              <w:rPr>
+                <w:rFonts w:ascii="Helvetica" w:hAnsi="Helvetica" w:eastAsia="Helvetica" w:cs="Helvetica"/>
+                <w:i w:val="false"/>
+                <w:b w:val="false"/>
+                <w:u w:val="none"/>
+                <w:sz w:val="22"/>
+                <w:szCs w:val="22"/>
+                <w:color w:val="000000"/>
+              </w:rPr>
+            </w:pPr>
+            <w:r>
+              <w:rPr>
+                <w:rFonts w:ascii="Helvetica" w:hAnsi="Helvetica" w:eastAsia="Helvetica" w:cs="Helvetica"/>
+                <w:i w:val="false"/>
+                <w:b w:val="false"/>
+                <w:u w:val="none"/>
+                <w:sz w:val="22"/>
+                <w:szCs w:val="22"/>
+                <w:color w:val="000000"/>
+              </w:rPr>
+              <w:t xml:space="preserve">0.33, 6.75</w:t>
+            </w:r>
+          </w:p>
+        </w:tc>
+        <w:tc>
+          <w:tcPr>
+            <w:tcBorders>
+              <w:bottom w:val="none" w:sz="0" w:space="0" w:color="000000"/>
+              <w:top w:val="none" w:sz="0" w:space="0" w:color="000000"/>
+              <w:left w:val="none" w:sz="0" w:space="0" w:color="000000"/>
+              <w:right w:val="none" w:sz="0" w:space="0" w:color="000000"/>
+            </w:tcBorders>
+            <w:shd w:val="clear" w:color="auto" w:fill="FFFFFF"/>
+            <w:tcMar>
+              <w:top w:w="0" w:type="dxa"/>
+              <w:bottom w:w="0" w:type="dxa"/>
+              <w:left w:w="0" w:type="dxa"/>
+              <w:right w:w="0" w:type="dxa"/>
+            </w:tcMar>
+            <w:vAlign w:val="top"/>
+          </w:tcPr>
+          <w:p>
+            <w:pPr>
+              <w:pStyle w:val="Normal"/>
+              <w:jc w:val="center"/>
+              <w:pBdr>
+                <w:bottom w:val="none" w:sz="0" w:space="0" w:color="000000"/>
+                <w:top w:val="none" w:sz="0" w:space="0" w:color="000000"/>
+                <w:left w:val="none" w:sz="0" w:space="0" w:color="000000"/>
+                <w:right w:val="none" w:sz="0" w:space="0" w:color="000000"/>
+              </w:pBdr>
+              <w:spacing w:after="100" w:before="100" w:line="240"/>
+              <w:ind w:left="100" w:right="100" w:firstLine="0" w:firstLineChars="0"/>
+              <w:rPr>
+                <w:rFonts w:ascii="Helvetica" w:hAnsi="Helvetica" w:eastAsia="Helvetica" w:cs="Helvetica"/>
+                <w:i w:val="false"/>
+                <w:b w:val="false"/>
+                <w:u w:val="none"/>
+                <w:sz w:val="22"/>
+                <w:szCs w:val="22"/>
+                <w:color w:val="000000"/>
+              </w:rPr>
+            </w:pPr>
+            <w:r>
+              <w:rPr>
+                <w:rFonts w:ascii="Helvetica" w:hAnsi="Helvetica" w:eastAsia="Helvetica" w:cs="Helvetica"/>
+                <w:i w:val="false"/>
+                <w:b w:val="false"/>
+                <w:u w:val="none"/>
+                <w:sz w:val="22"/>
+                <w:szCs w:val="22"/>
+                <w:color w:val="000000"/>
+              </w:rPr>
+              <w:t xml:space="preserve">0.610</w:t>
+            </w:r>
+          </w:p>
+        </w:tc>
+      </w:tr>
+      <w:tr>
+        <w:trPr>
+          <w:trHeight w:val="614" w:hRule="auto"/>
+        </w:trPr>
+        body 6
+        <w:tc>
+          <w:tcPr>
+            <w:tcBorders>
+              <w:bottom w:val="none" w:sz="0" w:space="0" w:color="000000"/>
+              <w:top w:val="none" w:sz="0" w:space="0" w:color="000000"/>
+              <w:left w:val="none" w:sz="0" w:space="0" w:color="000000"/>
+              <w:right w:val="none" w:sz="0" w:space="0" w:color="000000"/>
+            </w:tcBorders>
+            <w:shd w:val="clear" w:color="auto" w:fill="FFFFFF"/>
+            <w:tcMar>
+              <w:top w:w="0" w:type="dxa"/>
+              <w:bottom w:w="0" w:type="dxa"/>
+              <w:left w:w="0" w:type="dxa"/>
+              <w:right w:w="0" w:type="dxa"/>
+            </w:tcMar>
+            <w:vAlign w:val="top"/>
+          </w:tcPr>
+          <w:p>
+            <w:pPr>
+              <w:pStyle w:val="Normal"/>
+              <w:jc w:val="left"/>
+              <w:pBdr>
+                <w:bottom w:val="none" w:sz="0" w:space="0" w:color="000000"/>
+                <w:top w:val="none" w:sz="0" w:space="0" w:color="000000"/>
+                <w:left w:val="none" w:sz="0" w:space="0" w:color="000000"/>
+                <w:right w:val="none" w:sz="0" w:space="0" w:color="000000"/>
+              </w:pBdr>
+              <w:spacing w:after="100" w:before="100" w:line="240"/>
+              <w:ind w:left="100" w:right="100" w:firstLine="0" w:firstLineChars="0"/>
+              <w:rPr>
+                <w:rFonts w:ascii="Helvetica" w:hAnsi="Helvetica" w:eastAsia="Helvetica" w:cs="Helvetica"/>
+                <w:i w:val="false"/>
+                <w:b w:val="false"/>
+                <w:u w:val="none"/>
+                <w:sz w:val="22"/>
+                <w:szCs w:val="22"/>
+                <w:color w:val="000000"/>
+              </w:rPr>
+            </w:pPr>
+            <w:r>
+              <w:rPr>
+                <w:rFonts w:ascii="Helvetica" w:hAnsi="Helvetica" w:eastAsia="Helvetica" w:cs="Helvetica"/>
+                <w:i w:val="false"/>
+                <w:b w:val="false"/>
+                <w:u w:val="none"/>
+                <w:sz w:val="22"/>
+                <w:szCs w:val="22"/>
+                <w:color w:val="000000"/>
+              </w:rPr>
+              <w:t xml:space="preserve">ecog_score_cat2</w:t>
+            </w:r>
+          </w:p>
+        </w:tc>
+        <w:tc>
+          <w:tcPr>
+            <w:tcBorders>
+              <w:bottom w:val="none" w:sz="0" w:space="0" w:color="000000"/>
+              <w:top w:val="none" w:sz="0" w:space="0" w:color="000000"/>
+              <w:left w:val="none" w:sz="0" w:space="0" w:color="000000"/>
+              <w:right w:val="none" w:sz="0" w:space="0" w:color="000000"/>
+            </w:tcBorders>
+            <w:shd w:val="clear" w:color="auto" w:fill="FFFFFF"/>
+            <w:tcMar>
+              <w:top w:w="0" w:type="dxa"/>
+              <w:bottom w:w="0" w:type="dxa"/>
+              <w:left w:w="0" w:type="dxa"/>
+              <w:right w:w="0" w:type="dxa"/>
+            </w:tcMar>
+            <w:vAlign w:val="top"/>
+          </w:tcPr>
+          <w:p>
+            <w:pPr>
+              <w:pStyle w:val="Normal"/>
+              <w:jc w:val="center"/>
+              <w:pBdr>
+                <w:bottom w:val="none" w:sz="0" w:space="0" w:color="000000"/>
+                <w:top w:val="none" w:sz="0" w:space="0" w:color="000000"/>
+                <w:left w:val="none" w:sz="0" w:space="0" w:color="000000"/>
+                <w:right w:val="none" w:sz="0" w:space="0" w:color="000000"/>
+              </w:pBdr>
+              <w:spacing w:after="100" w:before="100" w:line="240"/>
+              <w:ind w:left="100" w:right="100" w:firstLine="0" w:firstLineChars="0"/>
+              <w:rPr>
+                <w:rFonts w:ascii="Helvetica" w:hAnsi="Helvetica" w:eastAsia="Helvetica" w:cs="Helvetica"/>
+                <w:i w:val="false"/>
+                <w:b w:val="false"/>
+                <w:u w:val="none"/>
+                <w:sz w:val="22"/>
+                <w:szCs w:val="22"/>
+                <w:color w:val="000000"/>
+              </w:rPr>
+            </w:pPr>
+            <w:r>
+              <w:rPr>
+                <w:rFonts w:ascii="Helvetica" w:hAnsi="Helvetica" w:eastAsia="Helvetica" w:cs="Helvetica"/>
+                <w:i w:val="false"/>
+                <w:b w:val="false"/>
+                <w:u w:val="none"/>
+                <w:sz w:val="22"/>
+                <w:szCs w:val="22"/>
+                <w:color w:val="000000"/>
+              </w:rPr>
+              <w:t xml:space="preserve">121</w:t>
+            </w:r>
+          </w:p>
+        </w:tc>
+        <w:tc>
+          <w:tcPr>
+            <w:tcBorders>
+              <w:bottom w:val="none" w:sz="0" w:space="0" w:color="000000"/>
+              <w:top w:val="none" w:sz="0" w:space="0" w:color="000000"/>
+              <w:left w:val="none" w:sz="0" w:space="0" w:color="000000"/>
+              <w:right w:val="none" w:sz="0" w:space="0" w:color="000000"/>
+            </w:tcBorders>
+            <w:shd w:val="clear" w:color="auto" w:fill="FFFFFF"/>
+            <w:tcMar>
+              <w:top w:w="0" w:type="dxa"/>
+              <w:bottom w:w="0" w:type="dxa"/>
+              <w:left w:w="0" w:type="dxa"/>
+              <w:right w:w="0" w:type="dxa"/>
+            </w:tcMar>
+            <w:vAlign w:val="top"/>
+          </w:tcPr>
+          <w:p>
+            <w:pPr>
+              <w:pStyle w:val="Normal"/>
+              <w:jc w:val="center"/>
+              <w:pBdr>
+                <w:bottom w:val="none" w:sz="0" w:space="0" w:color="000000"/>
+                <w:top w:val="none" w:sz="0" w:space="0" w:color="000000"/>
+                <w:left w:val="none" w:sz="0" w:space="0" w:color="000000"/>
+                <w:right w:val="none" w:sz="0" w:space="0" w:color="000000"/>
+              </w:pBdr>
+              <w:spacing w:after="100" w:before="100" w:line="240"/>
+              <w:ind w:left="100" w:right="100" w:firstLine="0" w:firstLineChars="0"/>
+              <w:rPr>
+                <w:rFonts w:ascii="Helvetica" w:hAnsi="Helvetica" w:eastAsia="Helvetica" w:cs="Helvetica"/>
+                <w:i w:val="false"/>
+                <w:b w:val="false"/>
+                <w:u w:val="none"/>
+                <w:sz w:val="22"/>
+                <w:szCs w:val="22"/>
+                <w:color w:val="000000"/>
+              </w:rPr>
+            </w:pPr>
+            <w:r>
+              <w:rPr>
+                <w:rFonts w:ascii="Helvetica" w:hAnsi="Helvetica" w:eastAsia="Helvetica" w:cs="Helvetica"/>
+                <w:i w:val="false"/>
+                <w:b w:val="false"/>
+                <w:u w:val="none"/>
+                <w:sz w:val="22"/>
+                <w:szCs w:val="22"/>
+                <w:color w:val="000000"/>
+              </w:rPr>
+              <w:t xml:space="preserve"/>
+            </w:r>
+          </w:p>
+        </w:tc>
+        <w:tc>
+          <w:tcPr>
+            <w:tcBorders>
+              <w:bottom w:val="none" w:sz="0" w:space="0" w:color="000000"/>
+              <w:top w:val="none" w:sz="0" w:space="0" w:color="000000"/>
+              <w:left w:val="none" w:sz="0" w:space="0" w:color="000000"/>
+              <w:right w:val="none" w:sz="0" w:space="0" w:color="000000"/>
+            </w:tcBorders>
+            <w:shd w:val="clear" w:color="auto" w:fill="FFFFFF"/>
+            <w:tcMar>
+              <w:top w:w="0" w:type="dxa"/>
+              <w:bottom w:w="0" w:type="dxa"/>
+              <w:left w:w="0" w:type="dxa"/>
+              <w:right w:w="0" w:type="dxa"/>
+            </w:tcMar>
+            <w:vAlign w:val="top"/>
+          </w:tcPr>
+          <w:p>
+            <w:pPr>
+              <w:pStyle w:val="Normal"/>
+              <w:jc w:val="center"/>
+              <w:pBdr>
+                <w:bottom w:val="none" w:sz="0" w:space="0" w:color="000000"/>
+                <w:top w:val="none" w:sz="0" w:space="0" w:color="000000"/>
+                <w:left w:val="none" w:sz="0" w:space="0" w:color="000000"/>
+                <w:right w:val="none" w:sz="0" w:space="0" w:color="000000"/>
+              </w:pBdr>
+              <w:spacing w:after="100" w:before="100" w:line="240"/>
+              <w:ind w:left="100" w:right="100" w:firstLine="0" w:firstLineChars="0"/>
+              <w:rPr>
+                <w:rFonts w:ascii="Helvetica" w:hAnsi="Helvetica" w:eastAsia="Helvetica" w:cs="Helvetica"/>
+                <w:i w:val="false"/>
+                <w:b w:val="false"/>
+                <w:u w:val="none"/>
+                <w:sz w:val="22"/>
+                <w:szCs w:val="22"/>
+                <w:color w:val="000000"/>
+              </w:rPr>
+            </w:pPr>
+            <w:r>
+              <w:rPr>
+                <w:rFonts w:ascii="Helvetica" w:hAnsi="Helvetica" w:eastAsia="Helvetica" w:cs="Helvetica"/>
+                <w:i w:val="false"/>
+                <w:b w:val="false"/>
+                <w:u w:val="none"/>
+                <w:sz w:val="22"/>
+                <w:szCs w:val="22"/>
+                <w:color w:val="000000"/>
+              </w:rPr>
+              <w:t xml:space="preserve"/>
+            </w:r>
+          </w:p>
+        </w:tc>
+        <w:tc>
+          <w:tcPr>
+            <w:tcBorders>
+              <w:bottom w:val="none" w:sz="0" w:space="0" w:color="000000"/>
+              <w:top w:val="none" w:sz="0" w:space="0" w:color="000000"/>
+              <w:left w:val="none" w:sz="0" w:space="0" w:color="000000"/>
+              <w:right w:val="none" w:sz="0" w:space="0" w:color="000000"/>
+            </w:tcBorders>
+            <w:shd w:val="clear" w:color="auto" w:fill="FFFFFF"/>
+            <w:tcMar>
+              <w:top w:w="0" w:type="dxa"/>
+              <w:bottom w:w="0" w:type="dxa"/>
+              <w:left w:w="0" w:type="dxa"/>
+              <w:right w:w="0" w:type="dxa"/>
+            </w:tcMar>
+            <w:vAlign w:val="top"/>
+          </w:tcPr>
+          <w:p>
+            <w:pPr>
+              <w:pStyle w:val="Normal"/>
+              <w:jc w:val="center"/>
+              <w:pBdr>
+                <w:bottom w:val="none" w:sz="0" w:space="0" w:color="000000"/>
+                <w:top w:val="none" w:sz="0" w:space="0" w:color="000000"/>
+                <w:left w:val="none" w:sz="0" w:space="0" w:color="000000"/>
+                <w:right w:val="none" w:sz="0" w:space="0" w:color="000000"/>
+              </w:pBdr>
+              <w:spacing w:after="100" w:before="100" w:line="240"/>
+              <w:ind w:left="100" w:right="100" w:firstLine="0" w:firstLineChars="0"/>
+              <w:rPr>
+                <w:rFonts w:ascii="Helvetica" w:hAnsi="Helvetica" w:eastAsia="Helvetica" w:cs="Helvetica"/>
+                <w:i w:val="false"/>
+                <w:b w:val="false"/>
+                <w:u w:val="none"/>
+                <w:sz w:val="22"/>
+                <w:szCs w:val="22"/>
+                <w:color w:val="000000"/>
+              </w:rPr>
+            </w:pPr>
+            <w:r>
+              <w:rPr>
+                <w:rFonts w:ascii="Helvetica" w:hAnsi="Helvetica" w:eastAsia="Helvetica" w:cs="Helvetica"/>
+                <w:i w:val="false"/>
+                <w:b w:val="false"/>
+                <w:u w:val="none"/>
+                <w:sz w:val="22"/>
+                <w:szCs w:val="22"/>
+                <w:color w:val="000000"/>
+              </w:rPr>
+              <w:t xml:space="preserve"/>
+            </w:r>
+          </w:p>
+        </w:tc>
+        <w:tc>
+          <w:tcPr>
+            <w:tcBorders>
+              <w:bottom w:val="none" w:sz="0" w:space="0" w:color="000000"/>
+              <w:top w:val="none" w:sz="0" w:space="0" w:color="000000"/>
+              <w:left w:val="none" w:sz="0" w:space="0" w:color="000000"/>
+              <w:right w:val="none" w:sz="0" w:space="0" w:color="000000"/>
+            </w:tcBorders>
+            <w:shd w:val="clear" w:color="auto" w:fill="FFFFFF"/>
+            <w:tcMar>
+              <w:top w:w="0" w:type="dxa"/>
+              <w:bottom w:w="0" w:type="dxa"/>
+              <w:left w:w="0" w:type="dxa"/>
+              <w:right w:w="0" w:type="dxa"/>
+            </w:tcMar>
+            <w:vAlign w:val="top"/>
+          </w:tcPr>
+          <w:p>
+            <w:pPr>
+              <w:pStyle w:val="Normal"/>
+              <w:jc w:val="center"/>
+              <w:pBdr>
+                <w:bottom w:val="none" w:sz="0" w:space="0" w:color="000000"/>
+                <w:top w:val="none" w:sz="0" w:space="0" w:color="000000"/>
+                <w:left w:val="none" w:sz="0" w:space="0" w:color="000000"/>
+                <w:right w:val="none" w:sz="0" w:space="0" w:color="000000"/>
+              </w:pBdr>
+              <w:spacing w:after="100" w:before="100" w:line="240"/>
+              <w:ind w:left="100" w:right="100" w:firstLine="0" w:firstLineChars="0"/>
+              <w:rPr>
+                <w:rFonts w:ascii="Helvetica" w:hAnsi="Helvetica" w:eastAsia="Helvetica" w:cs="Helvetica"/>
+                <w:i w:val="false"/>
+                <w:b w:val="false"/>
+                <w:u w:val="none"/>
+                <w:sz w:val="22"/>
+                <w:szCs w:val="22"/>
+                <w:color w:val="000000"/>
+              </w:rPr>
+            </w:pPr>
+            <w:r>
+              <w:rPr>
+                <w:rFonts w:ascii="Helvetica" w:hAnsi="Helvetica" w:eastAsia="Helvetica" w:cs="Helvetica"/>
+                <w:i w:val="false"/>
+                <w:b w:val="false"/>
+                <w:u w:val="none"/>
+                <w:sz w:val="22"/>
+                <w:szCs w:val="22"/>
+                <w:color w:val="000000"/>
+              </w:rPr>
+              <w:t xml:space="preserve">121</w:t>
+            </w:r>
+          </w:p>
+        </w:tc>
+        <w:tc>
+          <w:tcPr>
+            <w:tcBorders>
+              <w:bottom w:val="none" w:sz="0" w:space="0" w:color="000000"/>
+              <w:top w:val="none" w:sz="0" w:space="0" w:color="000000"/>
+              <w:left w:val="none" w:sz="0" w:space="0" w:color="000000"/>
+              <w:right w:val="none" w:sz="0" w:space="0" w:color="000000"/>
+            </w:tcBorders>
+            <w:shd w:val="clear" w:color="auto" w:fill="FFFFFF"/>
+            <w:tcMar>
+              <w:top w:w="0" w:type="dxa"/>
+              <w:bottom w:w="0" w:type="dxa"/>
+              <w:left w:w="0" w:type="dxa"/>
+              <w:right w:w="0" w:type="dxa"/>
+            </w:tcMar>
+            <w:vAlign w:val="top"/>
+          </w:tcPr>
+          <w:p>
+            <w:pPr>
+              <w:pStyle w:val="Normal"/>
+              <w:jc w:val="center"/>
+              <w:pBdr>
+                <w:bottom w:val="none" w:sz="0" w:space="0" w:color="000000"/>
+                <w:top w:val="none" w:sz="0" w:space="0" w:color="000000"/>
+                <w:left w:val="none" w:sz="0" w:space="0" w:color="000000"/>
+                <w:right w:val="none" w:sz="0" w:space="0" w:color="000000"/>
+              </w:pBdr>
+              <w:spacing w:after="100" w:before="100" w:line="240"/>
+              <w:ind w:left="100" w:right="100" w:firstLine="0" w:firstLineChars="0"/>
+              <w:rPr>
+                <w:rFonts w:ascii="Helvetica" w:hAnsi="Helvetica" w:eastAsia="Helvetica" w:cs="Helvetica"/>
+                <w:i w:val="false"/>
+                <w:b w:val="false"/>
+                <w:u w:val="none"/>
+                <w:sz w:val="22"/>
+                <w:szCs w:val="22"/>
+                <w:color w:val="000000"/>
+              </w:rPr>
+            </w:pPr>
+            <w:r>
+              <w:rPr>
+                <w:rFonts w:ascii="Helvetica" w:hAnsi="Helvetica" w:eastAsia="Helvetica" w:cs="Helvetica"/>
+                <w:i w:val="false"/>
+                <w:b w:val="false"/>
+                <w:u w:val="none"/>
+                <w:sz w:val="22"/>
+                <w:szCs w:val="22"/>
+                <w:color w:val="000000"/>
+              </w:rPr>
+              <w:t xml:space="preserve"/>
+            </w:r>
+          </w:p>
+        </w:tc>
+        <w:tc>
+          <w:tcPr>
+            <w:tcBorders>
+              <w:bottom w:val="none" w:sz="0" w:space="0" w:color="000000"/>
+              <w:top w:val="none" w:sz="0" w:space="0" w:color="000000"/>
+              <w:left w:val="none" w:sz="0" w:space="0" w:color="000000"/>
+              <w:right w:val="none" w:sz="0" w:space="0" w:color="000000"/>
+            </w:tcBorders>
+            <w:shd w:val="clear" w:color="auto" w:fill="FFFFFF"/>
+            <w:tcMar>
+              <w:top w:w="0" w:type="dxa"/>
+              <w:bottom w:w="0" w:type="dxa"/>
+              <w:left w:w="0" w:type="dxa"/>
+              <w:right w:w="0" w:type="dxa"/>
+            </w:tcMar>
+            <w:vAlign w:val="top"/>
+          </w:tcPr>
+          <w:p>
+            <w:pPr>
+              <w:pStyle w:val="Normal"/>
+              <w:jc w:val="center"/>
+              <w:pBdr>
+                <w:bottom w:val="none" w:sz="0" w:space="0" w:color="000000"/>
+                <w:top w:val="none" w:sz="0" w:space="0" w:color="000000"/>
+                <w:left w:val="none" w:sz="0" w:space="0" w:color="000000"/>
+                <w:right w:val="none" w:sz="0" w:space="0" w:color="000000"/>
+              </w:pBdr>
+              <w:spacing w:after="100" w:before="100" w:line="240"/>
+              <w:ind w:left="100" w:right="100" w:firstLine="0" w:firstLineChars="0"/>
+              <w:rPr>
+                <w:rFonts w:ascii="Helvetica" w:hAnsi="Helvetica" w:eastAsia="Helvetica" w:cs="Helvetica"/>
+                <w:i w:val="false"/>
+                <w:b w:val="false"/>
+                <w:u w:val="none"/>
+                <w:sz w:val="22"/>
+                <w:szCs w:val="22"/>
+                <w:color w:val="000000"/>
+              </w:rPr>
+            </w:pPr>
+            <w:r>
+              <w:rPr>
+                <w:rFonts w:ascii="Helvetica" w:hAnsi="Helvetica" w:eastAsia="Helvetica" w:cs="Helvetica"/>
+                <w:i w:val="false"/>
+                <w:b w:val="false"/>
+                <w:u w:val="none"/>
+                <w:sz w:val="22"/>
+                <w:szCs w:val="22"/>
+                <w:color w:val="000000"/>
+              </w:rPr>
+              <w:t xml:space="preserve"/>
+            </w:r>
+          </w:p>
+        </w:tc>
+        <w:tc>
+          <w:tcPr>
+            <w:tcBorders>
+              <w:bottom w:val="none" w:sz="0" w:space="0" w:color="000000"/>
+              <w:top w:val="none" w:sz="0" w:space="0" w:color="000000"/>
+              <w:left w:val="none" w:sz="0" w:space="0" w:color="000000"/>
+              <w:right w:val="none" w:sz="0" w:space="0" w:color="000000"/>
+            </w:tcBorders>
+            <w:shd w:val="clear" w:color="auto" w:fill="FFFFFF"/>
+            <w:tcMar>
+              <w:top w:w="0" w:type="dxa"/>
+              <w:bottom w:w="0" w:type="dxa"/>
+              <w:left w:w="0" w:type="dxa"/>
+              <w:right w:w="0" w:type="dxa"/>
+            </w:tcMar>
+            <w:vAlign w:val="top"/>
+          </w:tcPr>
+          <w:p>
+            <w:pPr>
+              <w:pStyle w:val="Normal"/>
+              <w:jc w:val="center"/>
+              <w:pBdr>
+                <w:bottom w:val="none" w:sz="0" w:space="0" w:color="000000"/>
+                <w:top w:val="none" w:sz="0" w:space="0" w:color="000000"/>
+                <w:left w:val="none" w:sz="0" w:space="0" w:color="000000"/>
+                <w:right w:val="none" w:sz="0" w:space="0" w:color="000000"/>
+              </w:pBdr>
+              <w:spacing w:after="100" w:before="100" w:line="240"/>
+              <w:ind w:left="100" w:right="100" w:firstLine="0" w:firstLineChars="0"/>
+              <w:rPr>
+                <w:rFonts w:ascii="Helvetica" w:hAnsi="Helvetica" w:eastAsia="Helvetica" w:cs="Helvetica"/>
+                <w:i w:val="false"/>
+                <w:b w:val="false"/>
+                <w:u w:val="none"/>
+                <w:sz w:val="22"/>
+                <w:szCs w:val="22"/>
+                <w:color w:val="000000"/>
+              </w:rPr>
+            </w:pPr>
+            <w:r>
+              <w:rPr>
+                <w:rFonts w:ascii="Helvetica" w:hAnsi="Helvetica" w:eastAsia="Helvetica" w:cs="Helvetica"/>
+                <w:i w:val="false"/>
+                <w:b w:val="false"/>
+                <w:u w:val="none"/>
+                <w:sz w:val="22"/>
+                <w:szCs w:val="22"/>
+                <w:color w:val="000000"/>
+              </w:rPr>
+              <w:t xml:space="preserve"/>
+            </w:r>
+          </w:p>
+        </w:tc>
+      </w:tr>
+      <w:tr>
+        <w:trPr>
+          <w:trHeight w:val="569" w:hRule="auto"/>
+        </w:trPr>
+        body 7
+        <w:tc>
+          <w:tcPr>
+            <w:tcBorders>
+              <w:bottom w:val="none" w:sz="0" w:space="0" w:color="000000"/>
+              <w:top w:val="none" w:sz="0" w:space="0" w:color="000000"/>
+              <w:left w:val="none" w:sz="0" w:space="0" w:color="000000"/>
+              <w:right w:val="none" w:sz="0" w:space="0" w:color="000000"/>
+            </w:tcBorders>
+            <w:shd w:val="clear" w:color="auto" w:fill="FFFFFF"/>
+            <w:tcMar>
+              <w:top w:w="0" w:type="dxa"/>
+              <w:bottom w:w="0" w:type="dxa"/>
+              <w:left w:w="0" w:type="dxa"/>
+              <w:right w:w="0" w:type="dxa"/>
+            </w:tcMar>
+            <w:vAlign w:val="top"/>
+          </w:tcPr>
+          <w:p>
+            <w:pPr>
+              <w:pStyle w:val="Normal"/>
+              <w:jc w:val="left"/>
+              <w:pBdr>
+                <w:bottom w:val="none" w:sz="0" w:space="0" w:color="000000"/>
+                <w:top w:val="none" w:sz="0" w:space="0" w:color="000000"/>
+                <w:left w:val="none" w:sz="0" w:space="0" w:color="000000"/>
+                <w:right w:val="none" w:sz="0" w:space="0" w:color="000000"/>
+              </w:pBdr>
+              <w:spacing w:after="100" w:before="100" w:line="240"/>
+              <w:ind w:left="300" w:right="100" w:firstLine="0" w:firstLineChars="0"/>
+              <w:rPr>
+                <w:rFonts w:ascii="Helvetica" w:hAnsi="Helvetica" w:eastAsia="Helvetica" w:cs="Helvetica"/>
+                <w:i w:val="false"/>
+                <w:b w:val="false"/>
+                <w:u w:val="none"/>
+                <w:sz w:val="22"/>
+                <w:szCs w:val="22"/>
+                <w:color w:val="000000"/>
+              </w:rPr>
+            </w:pPr>
+            <w:r>
+              <w:rPr>
+                <w:rFonts w:ascii="Helvetica" w:hAnsi="Helvetica" w:eastAsia="Helvetica" w:cs="Helvetica"/>
+                <w:i w:val="false"/>
+                <w:b w:val="false"/>
+                <w:u w:val="none"/>
+                <w:sz w:val="22"/>
+                <w:szCs w:val="22"/>
+                <w:color w:val="000000"/>
+              </w:rPr>
+              <w:t xml:space="preserve">0</w:t>
+            </w:r>
+          </w:p>
+        </w:tc>
+        <w:tc>
+          <w:tcPr>
+            <w:tcBorders>
+              <w:bottom w:val="none" w:sz="0" w:space="0" w:color="000000"/>
+              <w:top w:val="none" w:sz="0" w:space="0" w:color="000000"/>
+              <w:left w:val="none" w:sz="0" w:space="0" w:color="000000"/>
+              <w:right w:val="none" w:sz="0" w:space="0" w:color="000000"/>
+            </w:tcBorders>
+            <w:shd w:val="clear" w:color="auto" w:fill="FFFFFF"/>
+            <w:tcMar>
+              <w:top w:w="0" w:type="dxa"/>
+              <w:bottom w:w="0" w:type="dxa"/>
+              <w:left w:w="0" w:type="dxa"/>
+              <w:right w:w="0" w:type="dxa"/>
+            </w:tcMar>
+            <w:vAlign w:val="top"/>
+          </w:tcPr>
+          <w:p>
+            <w:pPr>
+              <w:pStyle w:val="Normal"/>
+              <w:jc w:val="center"/>
+              <w:pBdr>
+                <w:bottom w:val="none" w:sz="0" w:space="0" w:color="000000"/>
+                <w:top w:val="none" w:sz="0" w:space="0" w:color="000000"/>
+                <w:left w:val="none" w:sz="0" w:space="0" w:color="000000"/>
+                <w:right w:val="none" w:sz="0" w:space="0" w:color="000000"/>
+              </w:pBdr>
+              <w:spacing w:after="100" w:before="100" w:line="240"/>
+              <w:ind w:left="100" w:right="100" w:firstLine="0" w:firstLineChars="0"/>
+              <w:rPr>
+                <w:rFonts w:ascii="Helvetica" w:hAnsi="Helvetica" w:eastAsia="Helvetica" w:cs="Helvetica"/>
+                <w:i w:val="false"/>
+                <w:b w:val="false"/>
+                <w:u w:val="none"/>
+                <w:sz w:val="22"/>
+                <w:szCs w:val="22"/>
+                <w:color w:val="000000"/>
+              </w:rPr>
+            </w:pPr>
+            <w:r>
+              <w:rPr>
+                <w:rFonts w:ascii="Helvetica" w:hAnsi="Helvetica" w:eastAsia="Helvetica" w:cs="Helvetica"/>
+                <w:i w:val="false"/>
+                <w:b w:val="false"/>
+                <w:u w:val="none"/>
+                <w:sz w:val="22"/>
+                <w:szCs w:val="22"/>
+                <w:color w:val="000000"/>
+              </w:rPr>
+              <w:t xml:space="preserve"/>
+            </w:r>
+          </w:p>
+        </w:tc>
+        <w:tc>
+          <w:tcPr>
+            <w:tcBorders>
+              <w:bottom w:val="none" w:sz="0" w:space="0" w:color="000000"/>
+              <w:top w:val="none" w:sz="0" w:space="0" w:color="000000"/>
+              <w:left w:val="none" w:sz="0" w:space="0" w:color="000000"/>
+              <w:right w:val="none" w:sz="0" w:space="0" w:color="000000"/>
+            </w:tcBorders>
+            <w:shd w:val="clear" w:color="auto" w:fill="FFFFFF"/>
+            <w:tcMar>
+              <w:top w:w="0" w:type="dxa"/>
+              <w:bottom w:w="0" w:type="dxa"/>
+              <w:left w:w="0" w:type="dxa"/>
+              <w:right w:w="0" w:type="dxa"/>
+            </w:tcMar>
+            <w:vAlign w:val="top"/>
+          </w:tcPr>
+          <w:p>
+            <w:pPr>
+              <w:pStyle w:val="Normal"/>
+              <w:jc w:val="center"/>
+              <w:pBdr>
+                <w:bottom w:val="none" w:sz="0" w:space="0" w:color="000000"/>
+                <w:top w:val="none" w:sz="0" w:space="0" w:color="000000"/>
+                <w:left w:val="none" w:sz="0" w:space="0" w:color="000000"/>
+                <w:right w:val="none" w:sz="0" w:space="0" w:color="000000"/>
+              </w:pBdr>
+              <w:spacing w:after="100" w:before="100" w:line="240"/>
+              <w:ind w:left="100" w:right="100" w:firstLine="0" w:firstLineChars="0"/>
+              <w:rPr>
+                <w:rFonts w:ascii="Helvetica" w:hAnsi="Helvetica" w:eastAsia="Helvetica" w:cs="Helvetica"/>
+                <w:i w:val="false"/>
+                <w:b w:val="false"/>
+                <w:u w:val="none"/>
+                <w:sz w:val="22"/>
+                <w:szCs w:val="22"/>
+                <w:color w:val="000000"/>
+              </w:rPr>
+            </w:pPr>
+            <w:r>
+              <w:rPr>
+                <w:rFonts w:ascii="Helvetica" w:hAnsi="Helvetica" w:eastAsia="Helvetica" w:cs="Helvetica"/>
+                <w:i w:val="false"/>
+                <w:b w:val="false"/>
+                <w:u w:val="none"/>
+                <w:sz w:val="22"/>
+                <w:szCs w:val="22"/>
+                <w:color w:val="000000"/>
+              </w:rPr>
+              <w:t xml:space="preserve">—</w:t>
+            </w:r>
+          </w:p>
+        </w:tc>
+        <w:tc>
+          <w:tcPr>
+            <w:tcBorders>
+              <w:bottom w:val="none" w:sz="0" w:space="0" w:color="000000"/>
+              <w:top w:val="none" w:sz="0" w:space="0" w:color="000000"/>
+              <w:left w:val="none" w:sz="0" w:space="0" w:color="000000"/>
+              <w:right w:val="none" w:sz="0" w:space="0" w:color="000000"/>
+            </w:tcBorders>
+            <w:shd w:val="clear" w:color="auto" w:fill="FFFFFF"/>
+            <w:tcMar>
+              <w:top w:w="0" w:type="dxa"/>
+              <w:bottom w:w="0" w:type="dxa"/>
+              <w:left w:w="0" w:type="dxa"/>
+              <w:right w:w="0" w:type="dxa"/>
+            </w:tcMar>
+            <w:vAlign w:val="top"/>
+          </w:tcPr>
+          <w:p>
+            <w:pPr>
+              <w:pStyle w:val="Normal"/>
+              <w:jc w:val="center"/>
+              <w:pBdr>
+                <w:bottom w:val="none" w:sz="0" w:space="0" w:color="000000"/>
+                <w:top w:val="none" w:sz="0" w:space="0" w:color="000000"/>
+                <w:left w:val="none" w:sz="0" w:space="0" w:color="000000"/>
+                <w:right w:val="none" w:sz="0" w:space="0" w:color="000000"/>
+              </w:pBdr>
+              <w:spacing w:after="100" w:before="100" w:line="240"/>
+              <w:ind w:left="100" w:right="100" w:firstLine="0" w:firstLineChars="0"/>
+              <w:rPr>
+                <w:rFonts w:ascii="Helvetica" w:hAnsi="Helvetica" w:eastAsia="Helvetica" w:cs="Helvetica"/>
+                <w:i w:val="false"/>
+                <w:b w:val="false"/>
+                <w:u w:val="none"/>
+                <w:sz w:val="22"/>
+                <w:szCs w:val="22"/>
+                <w:color w:val="000000"/>
+              </w:rPr>
+            </w:pPr>
+            <w:r>
+              <w:rPr>
+                <w:rFonts w:ascii="Helvetica" w:hAnsi="Helvetica" w:eastAsia="Helvetica" w:cs="Helvetica"/>
+                <w:i w:val="false"/>
+                <w:b w:val="false"/>
+                <w:u w:val="none"/>
+                <w:sz w:val="22"/>
+                <w:szCs w:val="22"/>
+                <w:color w:val="000000"/>
+              </w:rPr>
+              <w:t xml:space="preserve">—</w:t>
+            </w:r>
+          </w:p>
+        </w:tc>
+        <w:tc>
+          <w:tcPr>
+            <w:tcBorders>
+              <w:bottom w:val="none" w:sz="0" w:space="0" w:color="000000"/>
+              <w:top w:val="none" w:sz="0" w:space="0" w:color="000000"/>
+              <w:left w:val="none" w:sz="0" w:space="0" w:color="000000"/>
+              <w:right w:val="none" w:sz="0" w:space="0" w:color="000000"/>
+            </w:tcBorders>
+            <w:shd w:val="clear" w:color="auto" w:fill="FFFFFF"/>
+            <w:tcMar>
+              <w:top w:w="0" w:type="dxa"/>
+              <w:bottom w:w="0" w:type="dxa"/>
+              <w:left w:w="0" w:type="dxa"/>
+              <w:right w:w="0" w:type="dxa"/>
+            </w:tcMar>
+            <w:vAlign w:val="top"/>
+          </w:tcPr>
+          <w:p>
+            <w:pPr>
+              <w:pStyle w:val="Normal"/>
+              <w:jc w:val="center"/>
+              <w:pBdr>
+                <w:bottom w:val="none" w:sz="0" w:space="0" w:color="000000"/>
+                <w:top w:val="none" w:sz="0" w:space="0" w:color="000000"/>
+                <w:left w:val="none" w:sz="0" w:space="0" w:color="000000"/>
+                <w:right w:val="none" w:sz="0" w:space="0" w:color="000000"/>
+              </w:pBdr>
+              <w:spacing w:after="100" w:before="100" w:line="240"/>
+              <w:ind w:left="100" w:right="100" w:firstLine="0" w:firstLineChars="0"/>
+              <w:rPr>
+                <w:rFonts w:ascii="Helvetica" w:hAnsi="Helvetica" w:eastAsia="Helvetica" w:cs="Helvetica"/>
+                <w:i w:val="false"/>
+                <w:b w:val="false"/>
+                <w:u w:val="none"/>
+                <w:sz w:val="22"/>
+                <w:szCs w:val="22"/>
+                <w:color w:val="000000"/>
+              </w:rPr>
+            </w:pPr>
+            <w:r>
+              <w:rPr>
+                <w:rFonts w:ascii="Helvetica" w:hAnsi="Helvetica" w:eastAsia="Helvetica" w:cs="Helvetica"/>
+                <w:i w:val="false"/>
+                <w:b w:val="false"/>
+                <w:u w:val="none"/>
+                <w:sz w:val="22"/>
+                <w:szCs w:val="22"/>
+                <w:color w:val="000000"/>
+              </w:rPr>
+              <w:t xml:space="preserve"/>
+            </w:r>
+          </w:p>
+        </w:tc>
+        <w:tc>
+          <w:tcPr>
+            <w:tcBorders>
+              <w:bottom w:val="none" w:sz="0" w:space="0" w:color="000000"/>
+              <w:top w:val="none" w:sz="0" w:space="0" w:color="000000"/>
+              <w:left w:val="none" w:sz="0" w:space="0" w:color="000000"/>
+              <w:right w:val="none" w:sz="0" w:space="0" w:color="000000"/>
+            </w:tcBorders>
+            <w:shd w:val="clear" w:color="auto" w:fill="FFFFFF"/>
+            <w:tcMar>
+              <w:top w:w="0" w:type="dxa"/>
+              <w:bottom w:w="0" w:type="dxa"/>
+              <w:left w:w="0" w:type="dxa"/>
+              <w:right w:w="0" w:type="dxa"/>
+            </w:tcMar>
+            <w:vAlign w:val="top"/>
+          </w:tcPr>
+          <w:p>
+            <w:pPr>
+              <w:pStyle w:val="Normal"/>
+              <w:jc w:val="center"/>
+              <w:pBdr>
+                <w:bottom w:val="none" w:sz="0" w:space="0" w:color="000000"/>
+                <w:top w:val="none" w:sz="0" w:space="0" w:color="000000"/>
+                <w:left w:val="none" w:sz="0" w:space="0" w:color="000000"/>
+                <w:right w:val="none" w:sz="0" w:space="0" w:color="000000"/>
+              </w:pBdr>
+              <w:spacing w:after="100" w:before="100" w:line="240"/>
+              <w:ind w:left="100" w:right="100" w:firstLine="0" w:firstLineChars="0"/>
+              <w:rPr>
+                <w:rFonts w:ascii="Helvetica" w:hAnsi="Helvetica" w:eastAsia="Helvetica" w:cs="Helvetica"/>
+                <w:i w:val="false"/>
+                <w:b w:val="false"/>
+                <w:u w:val="none"/>
+                <w:sz w:val="22"/>
+                <w:szCs w:val="22"/>
+                <w:color w:val="000000"/>
+              </w:rPr>
+            </w:pPr>
+            <w:r>
+              <w:rPr>
+                <w:rFonts w:ascii="Helvetica" w:hAnsi="Helvetica" w:eastAsia="Helvetica" w:cs="Helvetica"/>
+                <w:i w:val="false"/>
+                <w:b w:val="false"/>
+                <w:u w:val="none"/>
+                <w:sz w:val="22"/>
+                <w:szCs w:val="22"/>
+                <w:color w:val="000000"/>
+              </w:rPr>
+              <w:t xml:space="preserve"/>
+            </w:r>
+          </w:p>
+        </w:tc>
+        <w:tc>
+          <w:tcPr>
+            <w:tcBorders>
+              <w:bottom w:val="none" w:sz="0" w:space="0" w:color="000000"/>
+              <w:top w:val="none" w:sz="0" w:space="0" w:color="000000"/>
+              <w:left w:val="none" w:sz="0" w:space="0" w:color="000000"/>
+              <w:right w:val="none" w:sz="0" w:space="0" w:color="000000"/>
+            </w:tcBorders>
+            <w:shd w:val="clear" w:color="auto" w:fill="FFFFFF"/>
+            <w:tcMar>
+              <w:top w:w="0" w:type="dxa"/>
+              <w:bottom w:w="0" w:type="dxa"/>
+              <w:left w:w="0" w:type="dxa"/>
+              <w:right w:w="0" w:type="dxa"/>
+            </w:tcMar>
+            <w:vAlign w:val="top"/>
+          </w:tcPr>
+          <w:p>
+            <w:pPr>
+              <w:pStyle w:val="Normal"/>
+              <w:jc w:val="center"/>
+              <w:pBdr>
+                <w:bottom w:val="none" w:sz="0" w:space="0" w:color="000000"/>
+                <w:top w:val="none" w:sz="0" w:space="0" w:color="000000"/>
+                <w:left w:val="none" w:sz="0" w:space="0" w:color="000000"/>
+                <w:right w:val="none" w:sz="0" w:space="0" w:color="000000"/>
+              </w:pBdr>
+              <w:spacing w:after="100" w:before="100" w:line="240"/>
+              <w:ind w:left="100" w:right="100" w:firstLine="0" w:firstLineChars="0"/>
+              <w:rPr>
+                <w:rFonts w:ascii="Helvetica" w:hAnsi="Helvetica" w:eastAsia="Helvetica" w:cs="Helvetica"/>
+                <w:i w:val="false"/>
+                <w:b w:val="false"/>
+                <w:u w:val="none"/>
+                <w:sz w:val="22"/>
+                <w:szCs w:val="22"/>
+                <w:color w:val="000000"/>
+              </w:rPr>
+            </w:pPr>
+            <w:r>
+              <w:rPr>
+                <w:rFonts w:ascii="Helvetica" w:hAnsi="Helvetica" w:eastAsia="Helvetica" w:cs="Helvetica"/>
+                <w:i w:val="false"/>
+                <w:b w:val="false"/>
+                <w:u w:val="none"/>
+                <w:sz w:val="22"/>
+                <w:szCs w:val="22"/>
+                <w:color w:val="000000"/>
+              </w:rPr>
+              <w:t xml:space="preserve">—</w:t>
+            </w:r>
+          </w:p>
+        </w:tc>
+        <w:tc>
+          <w:tcPr>
+            <w:tcBorders>
+              <w:bottom w:val="none" w:sz="0" w:space="0" w:color="000000"/>
+              <w:top w:val="none" w:sz="0" w:space="0" w:color="000000"/>
+              <w:left w:val="none" w:sz="0" w:space="0" w:color="000000"/>
+              <w:right w:val="none" w:sz="0" w:space="0" w:color="000000"/>
+            </w:tcBorders>
+            <w:shd w:val="clear" w:color="auto" w:fill="FFFFFF"/>
+            <w:tcMar>
+              <w:top w:w="0" w:type="dxa"/>
+              <w:bottom w:w="0" w:type="dxa"/>
+              <w:left w:w="0" w:type="dxa"/>
+              <w:right w:w="0" w:type="dxa"/>
+            </w:tcMar>
+            <w:vAlign w:val="top"/>
+          </w:tcPr>
+          <w:p>
+            <w:pPr>
+              <w:pStyle w:val="Normal"/>
+              <w:jc w:val="center"/>
+              <w:pBdr>
+                <w:bottom w:val="none" w:sz="0" w:space="0" w:color="000000"/>
+                <w:top w:val="none" w:sz="0" w:space="0" w:color="000000"/>
+                <w:left w:val="none" w:sz="0" w:space="0" w:color="000000"/>
+                <w:right w:val="none" w:sz="0" w:space="0" w:color="000000"/>
+              </w:pBdr>
+              <w:spacing w:after="100" w:before="100" w:line="240"/>
+              <w:ind w:left="100" w:right="100" w:firstLine="0" w:firstLineChars="0"/>
+              <w:rPr>
+                <w:rFonts w:ascii="Helvetica" w:hAnsi="Helvetica" w:eastAsia="Helvetica" w:cs="Helvetica"/>
+                <w:i w:val="false"/>
+                <w:b w:val="false"/>
+                <w:u w:val="none"/>
+                <w:sz w:val="22"/>
+                <w:szCs w:val="22"/>
+                <w:color w:val="000000"/>
+              </w:rPr>
+            </w:pPr>
+            <w:r>
+              <w:rPr>
+                <w:rFonts w:ascii="Helvetica" w:hAnsi="Helvetica" w:eastAsia="Helvetica" w:cs="Helvetica"/>
+                <w:i w:val="false"/>
+                <w:b w:val="false"/>
+                <w:u w:val="none"/>
+                <w:sz w:val="22"/>
+                <w:szCs w:val="22"/>
+                <w:color w:val="000000"/>
+              </w:rPr>
+              <w:t xml:space="preserve">—</w:t>
+            </w:r>
+          </w:p>
+        </w:tc>
+        <w:tc>
+          <w:tcPr>
+            <w:tcBorders>
+              <w:bottom w:val="none" w:sz="0" w:space="0" w:color="000000"/>
+              <w:top w:val="none" w:sz="0" w:space="0" w:color="000000"/>
+              <w:left w:val="none" w:sz="0" w:space="0" w:color="000000"/>
+              <w:right w:val="none" w:sz="0" w:space="0" w:color="000000"/>
+            </w:tcBorders>
+            <w:shd w:val="clear" w:color="auto" w:fill="FFFFFF"/>
+            <w:tcMar>
+              <w:top w:w="0" w:type="dxa"/>
+              <w:bottom w:w="0" w:type="dxa"/>
+              <w:left w:w="0" w:type="dxa"/>
+              <w:right w:w="0" w:type="dxa"/>
+            </w:tcMar>
+            <w:vAlign w:val="top"/>
+          </w:tcPr>
+          <w:p>
+            <w:pPr>
+              <w:pStyle w:val="Normal"/>
+              <w:jc w:val="center"/>
+              <w:pBdr>
+                <w:bottom w:val="none" w:sz="0" w:space="0" w:color="000000"/>
+                <w:top w:val="none" w:sz="0" w:space="0" w:color="000000"/>
+                <w:left w:val="none" w:sz="0" w:space="0" w:color="000000"/>
+                <w:right w:val="none" w:sz="0" w:space="0" w:color="000000"/>
+              </w:pBdr>
+              <w:spacing w:after="100" w:before="100" w:line="240"/>
+              <w:ind w:left="100" w:right="100" w:firstLine="0" w:firstLineChars="0"/>
+              <w:rPr>
+                <w:rFonts w:ascii="Helvetica" w:hAnsi="Helvetica" w:eastAsia="Helvetica" w:cs="Helvetica"/>
+                <w:i w:val="false"/>
+                <w:b w:val="false"/>
+                <w:u w:val="none"/>
+                <w:sz w:val="22"/>
+                <w:szCs w:val="22"/>
+                <w:color w:val="000000"/>
+              </w:rPr>
+            </w:pPr>
+            <w:r>
+              <w:rPr>
+                <w:rFonts w:ascii="Helvetica" w:hAnsi="Helvetica" w:eastAsia="Helvetica" w:cs="Helvetica"/>
+                <w:i w:val="false"/>
+                <w:b w:val="false"/>
+                <w:u w:val="none"/>
+                <w:sz w:val="22"/>
+                <w:szCs w:val="22"/>
+                <w:color w:val="000000"/>
+              </w:rPr>
+              <w:t xml:space="preserve"/>
             </w:r>
           </w:p>
         </w:tc>
@@ -3150,7 +4116,7 @@
         <w:trPr>
           <w:trHeight w:val="598" w:hRule="auto"/>
         </w:trPr>
-        body6
+        body 8
         <w:tc>
           <w:tcPr>
             <w:tcBorders>
@@ -3179,452 +4145,452 @@
                 <w:right w:val="none" w:sz="0" w:space="0" w:color="000000"/>
               </w:pBdr>
               <w:spacing w:after="100" w:before="100" w:line="240"/>
-              <w:ind w:left="100" w:right="100" w:firstLine="0" w:firstLineChars="0"/>
-              <w:rPr>
-                <w:rFonts w:ascii="Helvetica" w:hAnsi="Helvetica" w:eastAsia="Helvetica" w:cs="Helvetica"/>
-                <w:i w:val="false"/>
-                <w:b w:val="false"/>
-                <w:u w:val="none"/>
-                <w:sz w:val="22"/>
-                <w:szCs w:val="22"/>
-                <w:color w:val="000000"/>
-              </w:rPr>
-            </w:pPr>
-            <w:r>
-              <w:rPr>
-                <w:rFonts w:ascii="Helvetica" w:hAnsi="Helvetica" w:eastAsia="Helvetica" w:cs="Helvetica"/>
-                <w:i w:val="false"/>
-                <w:b w:val="false"/>
-                <w:u w:val="none"/>
-                <w:sz w:val="22"/>
-                <w:szCs w:val="22"/>
-                <w:color w:val="000000"/>
-              </w:rPr>
-              <w:t xml:space="preserve">ecog_score</w:t>
-            </w:r>
-          </w:p>
-        </w:tc>
-        <w:tc>
-          <w:tcPr>
-            <w:tcBorders>
-              <w:bottom w:val="none" w:sz="0" w:space="0" w:color="000000"/>
-              <w:top w:val="none" w:sz="0" w:space="0" w:color="000000"/>
-              <w:left w:val="none" w:sz="0" w:space="0" w:color="000000"/>
-              <w:right w:val="none" w:sz="0" w:space="0" w:color="000000"/>
-            </w:tcBorders>
-            <w:shd w:val="clear" w:color="auto" w:fill="FFFFFF"/>
-            <w:tcMar>
-              <w:top w:w="0" w:type="dxa"/>
-              <w:bottom w:w="0" w:type="dxa"/>
-              <w:left w:w="0" w:type="dxa"/>
-              <w:right w:w="0" w:type="dxa"/>
-            </w:tcMar>
-            <w:vAlign w:val="top"/>
-          </w:tcPr>
-          <w:p>
-            <w:pPr>
-              <w:pStyle w:val="Normal"/>
-              <w:jc w:val="center"/>
-              <w:pBdr>
-                <w:bottom w:val="none" w:sz="0" w:space="0" w:color="000000"/>
-                <w:top w:val="none" w:sz="0" w:space="0" w:color="000000"/>
-                <w:left w:val="none" w:sz="0" w:space="0" w:color="000000"/>
-                <w:right w:val="none" w:sz="0" w:space="0" w:color="000000"/>
-              </w:pBdr>
-              <w:spacing w:after="100" w:before="100" w:line="240"/>
-              <w:ind w:left="100" w:right="100" w:firstLine="0" w:firstLineChars="0"/>
-              <w:rPr>
-                <w:rFonts w:ascii="Helvetica" w:hAnsi="Helvetica" w:eastAsia="Helvetica" w:cs="Helvetica"/>
-                <w:i w:val="false"/>
-                <w:b w:val="false"/>
-                <w:u w:val="none"/>
-                <w:sz w:val="22"/>
-                <w:szCs w:val="22"/>
-                <w:color w:val="000000"/>
-              </w:rPr>
-            </w:pPr>
-            <w:r>
-              <w:rPr>
-                <w:rFonts w:ascii="Helvetica" w:hAnsi="Helvetica" w:eastAsia="Helvetica" w:cs="Helvetica"/>
-                <w:i w:val="false"/>
-                <w:b w:val="false"/>
-                <w:u w:val="none"/>
-                <w:sz w:val="22"/>
-                <w:szCs w:val="22"/>
-                <w:color w:val="000000"/>
-              </w:rPr>
-              <w:t xml:space="preserve">121</w:t>
-            </w:r>
-          </w:p>
-        </w:tc>
-        <w:tc>
-          <w:tcPr>
-            <w:tcBorders>
-              <w:bottom w:val="none" w:sz="0" w:space="0" w:color="000000"/>
-              <w:top w:val="none" w:sz="0" w:space="0" w:color="000000"/>
-              <w:left w:val="none" w:sz="0" w:space="0" w:color="000000"/>
-              <w:right w:val="none" w:sz="0" w:space="0" w:color="000000"/>
-            </w:tcBorders>
-            <w:shd w:val="clear" w:color="auto" w:fill="FFFFFF"/>
-            <w:tcMar>
-              <w:top w:w="0" w:type="dxa"/>
-              <w:bottom w:w="0" w:type="dxa"/>
-              <w:left w:w="0" w:type="dxa"/>
-              <w:right w:w="0" w:type="dxa"/>
-            </w:tcMar>
-            <w:vAlign w:val="top"/>
-          </w:tcPr>
-          <w:p>
-            <w:pPr>
-              <w:pStyle w:val="Normal"/>
-              <w:jc w:val="center"/>
-              <w:pBdr>
-                <w:bottom w:val="none" w:sz="0" w:space="0" w:color="000000"/>
-                <w:top w:val="none" w:sz="0" w:space="0" w:color="000000"/>
-                <w:left w:val="none" w:sz="0" w:space="0" w:color="000000"/>
-                <w:right w:val="none" w:sz="0" w:space="0" w:color="000000"/>
-              </w:pBdr>
-              <w:spacing w:after="100" w:before="100" w:line="240"/>
-              <w:ind w:left="100" w:right="100" w:firstLine="0" w:firstLineChars="0"/>
-              <w:rPr>
-                <w:rFonts w:ascii="Helvetica" w:hAnsi="Helvetica" w:eastAsia="Helvetica" w:cs="Helvetica"/>
-                <w:i w:val="false"/>
-                <w:b w:val="false"/>
-                <w:u w:val="none"/>
-                <w:sz w:val="22"/>
-                <w:szCs w:val="22"/>
-                <w:color w:val="000000"/>
-              </w:rPr>
-            </w:pPr>
-            <w:r>
-              <w:rPr>
-                <w:rFonts w:ascii="Helvetica" w:hAnsi="Helvetica" w:eastAsia="Helvetica" w:cs="Helvetica"/>
-                <w:i w:val="false"/>
-                <w:b w:val="false"/>
-                <w:u w:val="none"/>
-                <w:sz w:val="22"/>
-                <w:szCs w:val="22"/>
-                <w:color w:val="000000"/>
-              </w:rPr>
-              <w:t xml:space="preserve">2.33</w:t>
-            </w:r>
-          </w:p>
-        </w:tc>
-        <w:tc>
-          <w:tcPr>
-            <w:tcBorders>
-              <w:bottom w:val="none" w:sz="0" w:space="0" w:color="000000"/>
-              <w:top w:val="none" w:sz="0" w:space="0" w:color="000000"/>
-              <w:left w:val="none" w:sz="0" w:space="0" w:color="000000"/>
-              <w:right w:val="none" w:sz="0" w:space="0" w:color="000000"/>
-            </w:tcBorders>
-            <w:shd w:val="clear" w:color="auto" w:fill="FFFFFF"/>
-            <w:tcMar>
-              <w:top w:w="0" w:type="dxa"/>
-              <w:bottom w:w="0" w:type="dxa"/>
-              <w:left w:w="0" w:type="dxa"/>
-              <w:right w:w="0" w:type="dxa"/>
-            </w:tcMar>
-            <w:vAlign w:val="top"/>
-          </w:tcPr>
-          <w:p>
-            <w:pPr>
-              <w:pStyle w:val="Normal"/>
-              <w:jc w:val="center"/>
-              <w:pBdr>
-                <w:bottom w:val="none" w:sz="0" w:space="0" w:color="000000"/>
-                <w:top w:val="none" w:sz="0" w:space="0" w:color="000000"/>
-                <w:left w:val="none" w:sz="0" w:space="0" w:color="000000"/>
-                <w:right w:val="none" w:sz="0" w:space="0" w:color="000000"/>
-              </w:pBdr>
-              <w:spacing w:after="100" w:before="100" w:line="240"/>
-              <w:ind w:left="100" w:right="100" w:firstLine="0" w:firstLineChars="0"/>
-              <w:rPr>
-                <w:rFonts w:ascii="Helvetica" w:hAnsi="Helvetica" w:eastAsia="Helvetica" w:cs="Helvetica"/>
-                <w:i w:val="false"/>
-                <w:b w:val="false"/>
-                <w:u w:val="none"/>
-                <w:sz w:val="22"/>
-                <w:szCs w:val="22"/>
-                <w:color w:val="000000"/>
-              </w:rPr>
-            </w:pPr>
-            <w:r>
-              <w:rPr>
-                <w:rFonts w:ascii="Helvetica" w:hAnsi="Helvetica" w:eastAsia="Helvetica" w:cs="Helvetica"/>
-                <w:i w:val="false"/>
-                <w:b w:val="false"/>
-                <w:u w:val="none"/>
-                <w:sz w:val="22"/>
-                <w:szCs w:val="22"/>
-                <w:color w:val="000000"/>
-              </w:rPr>
-              <w:t xml:space="preserve">1.29, 4.22</w:t>
-            </w:r>
-          </w:p>
-        </w:tc>
-        <w:tc>
-          <w:tcPr>
-            <w:tcBorders>
-              <w:bottom w:val="none" w:sz="0" w:space="0" w:color="000000"/>
-              <w:top w:val="none" w:sz="0" w:space="0" w:color="000000"/>
-              <w:left w:val="none" w:sz="0" w:space="0" w:color="000000"/>
-              <w:right w:val="none" w:sz="0" w:space="0" w:color="000000"/>
-            </w:tcBorders>
-            <w:shd w:val="clear" w:color="auto" w:fill="FFFFFF"/>
-            <w:tcMar>
-              <w:top w:w="0" w:type="dxa"/>
-              <w:bottom w:w="0" w:type="dxa"/>
-              <w:left w:w="0" w:type="dxa"/>
-              <w:right w:w="0" w:type="dxa"/>
-            </w:tcMar>
-            <w:vAlign w:val="top"/>
-          </w:tcPr>
-          <w:p>
-            <w:pPr>
-              <w:pStyle w:val="Normal"/>
-              <w:jc w:val="center"/>
-              <w:pBdr>
-                <w:bottom w:val="none" w:sz="0" w:space="0" w:color="000000"/>
-                <w:top w:val="none" w:sz="0" w:space="0" w:color="000000"/>
-                <w:left w:val="none" w:sz="0" w:space="0" w:color="000000"/>
-                <w:right w:val="none" w:sz="0" w:space="0" w:color="000000"/>
-              </w:pBdr>
-              <w:spacing w:after="100" w:before="100" w:line="240"/>
-              <w:ind w:left="100" w:right="100" w:firstLine="0" w:firstLineChars="0"/>
-              <w:rPr>
-                <w:rFonts w:ascii="Helvetica" w:hAnsi="Helvetica" w:eastAsia="Helvetica" w:cs="Helvetica"/>
-                <w:i w:val="false"/>
-                <w:b w:val="false"/>
-                <w:u w:val="none"/>
-                <w:sz w:val="22"/>
-                <w:szCs w:val="22"/>
-                <w:color w:val="000000"/>
-              </w:rPr>
-            </w:pPr>
-            <w:r>
-              <w:rPr>
-                <w:rFonts w:ascii="Helvetica" w:hAnsi="Helvetica" w:eastAsia="Helvetica" w:cs="Helvetica"/>
-                <w:i w:val="false"/>
-                <w:b w:val="false"/>
-                <w:u w:val="none"/>
-                <w:sz w:val="22"/>
-                <w:szCs w:val="22"/>
-                <w:color w:val="000000"/>
-              </w:rPr>
-              <w:t xml:space="preserve">0.005</w:t>
-            </w:r>
-          </w:p>
-        </w:tc>
-        <w:tc>
-          <w:tcPr>
-            <w:tcBorders>
-              <w:bottom w:val="none" w:sz="0" w:space="0" w:color="000000"/>
-              <w:top w:val="none" w:sz="0" w:space="0" w:color="000000"/>
-              <w:left w:val="none" w:sz="0" w:space="0" w:color="000000"/>
-              <w:right w:val="none" w:sz="0" w:space="0" w:color="000000"/>
-            </w:tcBorders>
-            <w:shd w:val="clear" w:color="auto" w:fill="FFFFFF"/>
-            <w:tcMar>
-              <w:top w:w="0" w:type="dxa"/>
-              <w:bottom w:w="0" w:type="dxa"/>
-              <w:left w:w="0" w:type="dxa"/>
-              <w:right w:w="0" w:type="dxa"/>
-            </w:tcMar>
-            <w:vAlign w:val="top"/>
-          </w:tcPr>
-          <w:p>
-            <w:pPr>
-              <w:pStyle w:val="Normal"/>
-              <w:jc w:val="center"/>
-              <w:pBdr>
-                <w:bottom w:val="none" w:sz="0" w:space="0" w:color="000000"/>
-                <w:top w:val="none" w:sz="0" w:space="0" w:color="000000"/>
-                <w:left w:val="none" w:sz="0" w:space="0" w:color="000000"/>
-                <w:right w:val="none" w:sz="0" w:space="0" w:color="000000"/>
-              </w:pBdr>
-              <w:spacing w:after="100" w:before="100" w:line="240"/>
-              <w:ind w:left="100" w:right="100" w:firstLine="0" w:firstLineChars="0"/>
-              <w:rPr>
-                <w:rFonts w:ascii="Helvetica" w:hAnsi="Helvetica" w:eastAsia="Helvetica" w:cs="Helvetica"/>
-                <w:i w:val="false"/>
-                <w:b w:val="false"/>
-                <w:u w:val="none"/>
-                <w:sz w:val="22"/>
-                <w:szCs w:val="22"/>
-                <w:color w:val="000000"/>
-              </w:rPr>
-            </w:pPr>
-            <w:r>
-              <w:rPr>
-                <w:rFonts w:ascii="Helvetica" w:hAnsi="Helvetica" w:eastAsia="Helvetica" w:cs="Helvetica"/>
-                <w:i w:val="false"/>
-                <w:b w:val="false"/>
-                <w:u w:val="none"/>
-                <w:sz w:val="22"/>
-                <w:szCs w:val="22"/>
-                <w:color w:val="000000"/>
-              </w:rPr>
-              <w:t xml:space="preserve">121</w:t>
-            </w:r>
-          </w:p>
-        </w:tc>
-        <w:tc>
-          <w:tcPr>
-            <w:tcBorders>
-              <w:bottom w:val="none" w:sz="0" w:space="0" w:color="000000"/>
-              <w:top w:val="none" w:sz="0" w:space="0" w:color="000000"/>
-              <w:left w:val="none" w:sz="0" w:space="0" w:color="000000"/>
-              <w:right w:val="none" w:sz="0" w:space="0" w:color="000000"/>
-            </w:tcBorders>
-            <w:shd w:val="clear" w:color="auto" w:fill="FFFFFF"/>
-            <w:tcMar>
-              <w:top w:w="0" w:type="dxa"/>
-              <w:bottom w:w="0" w:type="dxa"/>
-              <w:left w:w="0" w:type="dxa"/>
-              <w:right w:w="0" w:type="dxa"/>
-            </w:tcMar>
-            <w:vAlign w:val="top"/>
-          </w:tcPr>
-          <w:p>
-            <w:pPr>
-              <w:pStyle w:val="Normal"/>
-              <w:jc w:val="center"/>
-              <w:pBdr>
-                <w:bottom w:val="none" w:sz="0" w:space="0" w:color="000000"/>
-                <w:top w:val="none" w:sz="0" w:space="0" w:color="000000"/>
-                <w:left w:val="none" w:sz="0" w:space="0" w:color="000000"/>
-                <w:right w:val="none" w:sz="0" w:space="0" w:color="000000"/>
-              </w:pBdr>
-              <w:spacing w:after="100" w:before="100" w:line="240"/>
-              <w:ind w:left="100" w:right="100" w:firstLine="0" w:firstLineChars="0"/>
-              <w:rPr>
-                <w:rFonts w:ascii="Helvetica" w:hAnsi="Helvetica" w:eastAsia="Helvetica" w:cs="Helvetica"/>
-                <w:i w:val="false"/>
-                <w:b w:val="false"/>
-                <w:u w:val="none"/>
-                <w:sz w:val="22"/>
-                <w:szCs w:val="22"/>
-                <w:color w:val="000000"/>
-              </w:rPr>
-            </w:pPr>
-            <w:r>
-              <w:rPr>
-                <w:rFonts w:ascii="Helvetica" w:hAnsi="Helvetica" w:eastAsia="Helvetica" w:cs="Helvetica"/>
-                <w:i w:val="false"/>
-                <w:b w:val="false"/>
-                <w:u w:val="none"/>
-                <w:sz w:val="22"/>
-                <w:szCs w:val="22"/>
-                <w:color w:val="000000"/>
-              </w:rPr>
-              <w:t xml:space="preserve">2.26</w:t>
-            </w:r>
-          </w:p>
-        </w:tc>
-        <w:tc>
-          <w:tcPr>
-            <w:tcBorders>
-              <w:bottom w:val="none" w:sz="0" w:space="0" w:color="000000"/>
-              <w:top w:val="none" w:sz="0" w:space="0" w:color="000000"/>
-              <w:left w:val="none" w:sz="0" w:space="0" w:color="000000"/>
-              <w:right w:val="none" w:sz="0" w:space="0" w:color="000000"/>
-            </w:tcBorders>
-            <w:shd w:val="clear" w:color="auto" w:fill="FFFFFF"/>
-            <w:tcMar>
-              <w:top w:w="0" w:type="dxa"/>
-              <w:bottom w:w="0" w:type="dxa"/>
-              <w:left w:w="0" w:type="dxa"/>
-              <w:right w:w="0" w:type="dxa"/>
-            </w:tcMar>
-            <w:vAlign w:val="top"/>
-          </w:tcPr>
-          <w:p>
-            <w:pPr>
-              <w:pStyle w:val="Normal"/>
-              <w:jc w:val="center"/>
-              <w:pBdr>
-                <w:bottom w:val="none" w:sz="0" w:space="0" w:color="000000"/>
-                <w:top w:val="none" w:sz="0" w:space="0" w:color="000000"/>
-                <w:left w:val="none" w:sz="0" w:space="0" w:color="000000"/>
-                <w:right w:val="none" w:sz="0" w:space="0" w:color="000000"/>
-              </w:pBdr>
-              <w:spacing w:after="100" w:before="100" w:line="240"/>
-              <w:ind w:left="100" w:right="100" w:firstLine="0" w:firstLineChars="0"/>
-              <w:rPr>
-                <w:rFonts w:ascii="Helvetica" w:hAnsi="Helvetica" w:eastAsia="Helvetica" w:cs="Helvetica"/>
-                <w:i w:val="false"/>
-                <w:b w:val="false"/>
-                <w:u w:val="none"/>
-                <w:sz w:val="22"/>
-                <w:szCs w:val="22"/>
-                <w:color w:val="000000"/>
-              </w:rPr>
-            </w:pPr>
-            <w:r>
-              <w:rPr>
-                <w:rFonts w:ascii="Helvetica" w:hAnsi="Helvetica" w:eastAsia="Helvetica" w:cs="Helvetica"/>
-                <w:i w:val="false"/>
-                <w:b w:val="false"/>
-                <w:u w:val="none"/>
-                <w:sz w:val="22"/>
-                <w:szCs w:val="22"/>
-                <w:color w:val="000000"/>
-              </w:rPr>
-              <w:t xml:space="preserve">0.74, 6.90</w:t>
-            </w:r>
-          </w:p>
-        </w:tc>
-        <w:tc>
-          <w:tcPr>
-            <w:tcBorders>
-              <w:bottom w:val="none" w:sz="0" w:space="0" w:color="000000"/>
-              <w:top w:val="none" w:sz="0" w:space="0" w:color="000000"/>
-              <w:left w:val="none" w:sz="0" w:space="0" w:color="000000"/>
-              <w:right w:val="none" w:sz="0" w:space="0" w:color="000000"/>
-            </w:tcBorders>
-            <w:shd w:val="clear" w:color="auto" w:fill="FFFFFF"/>
-            <w:tcMar>
-              <w:top w:w="0" w:type="dxa"/>
-              <w:bottom w:w="0" w:type="dxa"/>
-              <w:left w:w="0" w:type="dxa"/>
-              <w:right w:w="0" w:type="dxa"/>
-            </w:tcMar>
-            <w:vAlign w:val="top"/>
-          </w:tcPr>
-          <w:p>
-            <w:pPr>
-              <w:pStyle w:val="Normal"/>
-              <w:jc w:val="center"/>
-              <w:pBdr>
-                <w:bottom w:val="none" w:sz="0" w:space="0" w:color="000000"/>
-                <w:top w:val="none" w:sz="0" w:space="0" w:color="000000"/>
-                <w:left w:val="none" w:sz="0" w:space="0" w:color="000000"/>
-                <w:right w:val="none" w:sz="0" w:space="0" w:color="000000"/>
-              </w:pBdr>
-              <w:spacing w:after="100" w:before="100" w:line="240"/>
-              <w:ind w:left="100" w:right="100" w:firstLine="0" w:firstLineChars="0"/>
-              <w:rPr>
-                <w:rFonts w:ascii="Helvetica" w:hAnsi="Helvetica" w:eastAsia="Helvetica" w:cs="Helvetica"/>
-                <w:i w:val="false"/>
-                <w:b w:val="false"/>
-                <w:u w:val="none"/>
-                <w:sz w:val="22"/>
-                <w:szCs w:val="22"/>
-                <w:color w:val="000000"/>
-              </w:rPr>
-            </w:pPr>
-            <w:r>
-              <w:rPr>
-                <w:rFonts w:ascii="Helvetica" w:hAnsi="Helvetica" w:eastAsia="Helvetica" w:cs="Helvetica"/>
-                <w:i w:val="false"/>
-                <w:b w:val="false"/>
-                <w:u w:val="none"/>
-                <w:sz w:val="22"/>
-                <w:szCs w:val="22"/>
-                <w:color w:val="000000"/>
-              </w:rPr>
-              <w:t xml:space="preserve">0.150</w:t>
+              <w:ind w:left="300" w:right="100" w:firstLine="0" w:firstLineChars="0"/>
+              <w:rPr>
+                <w:rFonts w:ascii="Helvetica" w:hAnsi="Helvetica" w:eastAsia="Helvetica" w:cs="Helvetica"/>
+                <w:i w:val="false"/>
+                <w:b w:val="false"/>
+                <w:u w:val="none"/>
+                <w:sz w:val="22"/>
+                <w:szCs w:val="22"/>
+                <w:color w:val="000000"/>
+              </w:rPr>
+            </w:pPr>
+            <w:r>
+              <w:rPr>
+                <w:rFonts w:ascii="Helvetica" w:hAnsi="Helvetica" w:eastAsia="Helvetica" w:cs="Helvetica"/>
+                <w:i w:val="false"/>
+                <w:b w:val="false"/>
+                <w:u w:val="none"/>
+                <w:sz w:val="22"/>
+                <w:szCs w:val="22"/>
+                <w:color w:val="000000"/>
+              </w:rPr>
+              <w:t xml:space="preserve">&gt;=1</w:t>
+            </w:r>
+          </w:p>
+        </w:tc>
+        <w:tc>
+          <w:tcPr>
+            <w:tcBorders>
+              <w:bottom w:val="none" w:sz="0" w:space="0" w:color="000000"/>
+              <w:top w:val="none" w:sz="0" w:space="0" w:color="000000"/>
+              <w:left w:val="none" w:sz="0" w:space="0" w:color="000000"/>
+              <w:right w:val="none" w:sz="0" w:space="0" w:color="000000"/>
+            </w:tcBorders>
+            <w:shd w:val="clear" w:color="auto" w:fill="FFFFFF"/>
+            <w:tcMar>
+              <w:top w:w="0" w:type="dxa"/>
+              <w:bottom w:w="0" w:type="dxa"/>
+              <w:left w:w="0" w:type="dxa"/>
+              <w:right w:w="0" w:type="dxa"/>
+            </w:tcMar>
+            <w:vAlign w:val="top"/>
+          </w:tcPr>
+          <w:p>
+            <w:pPr>
+              <w:pStyle w:val="Normal"/>
+              <w:jc w:val="center"/>
+              <w:pBdr>
+                <w:bottom w:val="none" w:sz="0" w:space="0" w:color="000000"/>
+                <w:top w:val="none" w:sz="0" w:space="0" w:color="000000"/>
+                <w:left w:val="none" w:sz="0" w:space="0" w:color="000000"/>
+                <w:right w:val="none" w:sz="0" w:space="0" w:color="000000"/>
+              </w:pBdr>
+              <w:spacing w:after="100" w:before="100" w:line="240"/>
+              <w:ind w:left="100" w:right="100" w:firstLine="0" w:firstLineChars="0"/>
+              <w:rPr>
+                <w:rFonts w:ascii="Helvetica" w:hAnsi="Helvetica" w:eastAsia="Helvetica" w:cs="Helvetica"/>
+                <w:i w:val="false"/>
+                <w:b w:val="false"/>
+                <w:u w:val="none"/>
+                <w:sz w:val="22"/>
+                <w:szCs w:val="22"/>
+                <w:color w:val="000000"/>
+              </w:rPr>
+            </w:pPr>
+            <w:r>
+              <w:rPr>
+                <w:rFonts w:ascii="Helvetica" w:hAnsi="Helvetica" w:eastAsia="Helvetica" w:cs="Helvetica"/>
+                <w:i w:val="false"/>
+                <w:b w:val="false"/>
+                <w:u w:val="none"/>
+                <w:sz w:val="22"/>
+                <w:szCs w:val="22"/>
+                <w:color w:val="000000"/>
+              </w:rPr>
+              <w:t xml:space="preserve"/>
+            </w:r>
+          </w:p>
+        </w:tc>
+        <w:tc>
+          <w:tcPr>
+            <w:tcBorders>
+              <w:bottom w:val="none" w:sz="0" w:space="0" w:color="000000"/>
+              <w:top w:val="none" w:sz="0" w:space="0" w:color="000000"/>
+              <w:left w:val="none" w:sz="0" w:space="0" w:color="000000"/>
+              <w:right w:val="none" w:sz="0" w:space="0" w:color="000000"/>
+            </w:tcBorders>
+            <w:shd w:val="clear" w:color="auto" w:fill="FFFFFF"/>
+            <w:tcMar>
+              <w:top w:w="0" w:type="dxa"/>
+              <w:bottom w:w="0" w:type="dxa"/>
+              <w:left w:w="0" w:type="dxa"/>
+              <w:right w:w="0" w:type="dxa"/>
+            </w:tcMar>
+            <w:vAlign w:val="top"/>
+          </w:tcPr>
+          <w:p>
+            <w:pPr>
+              <w:pStyle w:val="Normal"/>
+              <w:jc w:val="center"/>
+              <w:pBdr>
+                <w:bottom w:val="none" w:sz="0" w:space="0" w:color="000000"/>
+                <w:top w:val="none" w:sz="0" w:space="0" w:color="000000"/>
+                <w:left w:val="none" w:sz="0" w:space="0" w:color="000000"/>
+                <w:right w:val="none" w:sz="0" w:space="0" w:color="000000"/>
+              </w:pBdr>
+              <w:spacing w:after="100" w:before="100" w:line="240"/>
+              <w:ind w:left="100" w:right="100" w:firstLine="0" w:firstLineChars="0"/>
+              <w:rPr>
+                <w:rFonts w:ascii="Helvetica" w:hAnsi="Helvetica" w:eastAsia="Helvetica" w:cs="Helvetica"/>
+                <w:i w:val="false"/>
+                <w:b w:val="false"/>
+                <w:u w:val="none"/>
+                <w:sz w:val="22"/>
+                <w:szCs w:val="22"/>
+                <w:color w:val="000000"/>
+              </w:rPr>
+            </w:pPr>
+            <w:r>
+              <w:rPr>
+                <w:rFonts w:ascii="Helvetica" w:hAnsi="Helvetica" w:eastAsia="Helvetica" w:cs="Helvetica"/>
+                <w:i w:val="false"/>
+                <w:b w:val="false"/>
+                <w:u w:val="none"/>
+                <w:sz w:val="22"/>
+                <w:szCs w:val="22"/>
+                <w:color w:val="000000"/>
+              </w:rPr>
+              <w:t xml:space="preserve">34,299</w:t>
+            </w:r>
+          </w:p>
+        </w:tc>
+        <w:tc>
+          <w:tcPr>
+            <w:tcBorders>
+              <w:bottom w:val="none" w:sz="0" w:space="0" w:color="000000"/>
+              <w:top w:val="none" w:sz="0" w:space="0" w:color="000000"/>
+              <w:left w:val="none" w:sz="0" w:space="0" w:color="000000"/>
+              <w:right w:val="none" w:sz="0" w:space="0" w:color="000000"/>
+            </w:tcBorders>
+            <w:shd w:val="clear" w:color="auto" w:fill="FFFFFF"/>
+            <w:tcMar>
+              <w:top w:w="0" w:type="dxa"/>
+              <w:bottom w:w="0" w:type="dxa"/>
+              <w:left w:w="0" w:type="dxa"/>
+              <w:right w:w="0" w:type="dxa"/>
+            </w:tcMar>
+            <w:vAlign w:val="top"/>
+          </w:tcPr>
+          <w:p>
+            <w:pPr>
+              <w:pStyle w:val="Normal"/>
+              <w:jc w:val="center"/>
+              <w:pBdr>
+                <w:bottom w:val="none" w:sz="0" w:space="0" w:color="000000"/>
+                <w:top w:val="none" w:sz="0" w:space="0" w:color="000000"/>
+                <w:left w:val="none" w:sz="0" w:space="0" w:color="000000"/>
+                <w:right w:val="none" w:sz="0" w:space="0" w:color="000000"/>
+              </w:pBdr>
+              <w:spacing w:after="100" w:before="100" w:line="240"/>
+              <w:ind w:left="100" w:right="100" w:firstLine="0" w:firstLineChars="0"/>
+              <w:rPr>
+                <w:rFonts w:ascii="Helvetica" w:hAnsi="Helvetica" w:eastAsia="Helvetica" w:cs="Helvetica"/>
+                <w:i w:val="false"/>
+                <w:b w:val="false"/>
+                <w:u w:val="none"/>
+                <w:sz w:val="22"/>
+                <w:szCs w:val="22"/>
+                <w:color w:val="000000"/>
+              </w:rPr>
+            </w:pPr>
+            <w:r>
+              <w:rPr>
+                <w:rFonts w:ascii="Helvetica" w:hAnsi="Helvetica" w:eastAsia="Helvetica" w:cs="Helvetica"/>
+                <w:i w:val="false"/>
+                <w:b w:val="false"/>
+                <w:u w:val="none"/>
+                <w:sz w:val="22"/>
+                <w:szCs w:val="22"/>
+                <w:color w:val="000000"/>
+              </w:rPr>
+              <w:t xml:space="preserve">15,717, 74,852</w:t>
+            </w:r>
+          </w:p>
+        </w:tc>
+        <w:tc>
+          <w:tcPr>
+            <w:tcBorders>
+              <w:bottom w:val="none" w:sz="0" w:space="0" w:color="000000"/>
+              <w:top w:val="none" w:sz="0" w:space="0" w:color="000000"/>
+              <w:left w:val="none" w:sz="0" w:space="0" w:color="000000"/>
+              <w:right w:val="none" w:sz="0" w:space="0" w:color="000000"/>
+            </w:tcBorders>
+            <w:shd w:val="clear" w:color="auto" w:fill="FFFFFF"/>
+            <w:tcMar>
+              <w:top w:w="0" w:type="dxa"/>
+              <w:bottom w:w="0" w:type="dxa"/>
+              <w:left w:w="0" w:type="dxa"/>
+              <w:right w:w="0" w:type="dxa"/>
+            </w:tcMar>
+            <w:vAlign w:val="top"/>
+          </w:tcPr>
+          <w:p>
+            <w:pPr>
+              <w:pStyle w:val="Normal"/>
+              <w:jc w:val="center"/>
+              <w:pBdr>
+                <w:bottom w:val="none" w:sz="0" w:space="0" w:color="000000"/>
+                <w:top w:val="none" w:sz="0" w:space="0" w:color="000000"/>
+                <w:left w:val="none" w:sz="0" w:space="0" w:color="000000"/>
+                <w:right w:val="none" w:sz="0" w:space="0" w:color="000000"/>
+              </w:pBdr>
+              <w:spacing w:after="100" w:before="100" w:line="240"/>
+              <w:ind w:left="100" w:right="100" w:firstLine="0" w:firstLineChars="0"/>
+              <w:rPr>
+                <w:rFonts w:ascii="Helvetica" w:hAnsi="Helvetica" w:eastAsia="Helvetica" w:cs="Helvetica"/>
+                <w:i w:val="false"/>
+                <w:b w:val="false"/>
+                <w:u w:val="none"/>
+                <w:sz w:val="22"/>
+                <w:szCs w:val="22"/>
+                <w:color w:val="000000"/>
+              </w:rPr>
+            </w:pPr>
+            <w:r>
+              <w:rPr>
+                <w:rFonts w:ascii="Helvetica" w:hAnsi="Helvetica" w:eastAsia="Helvetica" w:cs="Helvetica"/>
+                <w:i w:val="false"/>
+                <w:b w:val="false"/>
+                <w:u w:val="none"/>
+                <w:sz w:val="22"/>
+                <w:szCs w:val="22"/>
+                <w:color w:val="000000"/>
+              </w:rPr>
+              <w:t xml:space="preserve">&lt;0.001</w:t>
+            </w:r>
+          </w:p>
+        </w:tc>
+        <w:tc>
+          <w:tcPr>
+            <w:tcBorders>
+              <w:bottom w:val="none" w:sz="0" w:space="0" w:color="000000"/>
+              <w:top w:val="none" w:sz="0" w:space="0" w:color="000000"/>
+              <w:left w:val="none" w:sz="0" w:space="0" w:color="000000"/>
+              <w:right w:val="none" w:sz="0" w:space="0" w:color="000000"/>
+            </w:tcBorders>
+            <w:shd w:val="clear" w:color="auto" w:fill="FFFFFF"/>
+            <w:tcMar>
+              <w:top w:w="0" w:type="dxa"/>
+              <w:bottom w:w="0" w:type="dxa"/>
+              <w:left w:w="0" w:type="dxa"/>
+              <w:right w:w="0" w:type="dxa"/>
+            </w:tcMar>
+            <w:vAlign w:val="top"/>
+          </w:tcPr>
+          <w:p>
+            <w:pPr>
+              <w:pStyle w:val="Normal"/>
+              <w:jc w:val="center"/>
+              <w:pBdr>
+                <w:bottom w:val="none" w:sz="0" w:space="0" w:color="000000"/>
+                <w:top w:val="none" w:sz="0" w:space="0" w:color="000000"/>
+                <w:left w:val="none" w:sz="0" w:space="0" w:color="000000"/>
+                <w:right w:val="none" w:sz="0" w:space="0" w:color="000000"/>
+              </w:pBdr>
+              <w:spacing w:after="100" w:before="100" w:line="240"/>
+              <w:ind w:left="100" w:right="100" w:firstLine="0" w:firstLineChars="0"/>
+              <w:rPr>
+                <w:rFonts w:ascii="Helvetica" w:hAnsi="Helvetica" w:eastAsia="Helvetica" w:cs="Helvetica"/>
+                <w:i w:val="false"/>
+                <w:b w:val="false"/>
+                <w:u w:val="none"/>
+                <w:sz w:val="22"/>
+                <w:szCs w:val="22"/>
+                <w:color w:val="000000"/>
+              </w:rPr>
+            </w:pPr>
+            <w:r>
+              <w:rPr>
+                <w:rFonts w:ascii="Helvetica" w:hAnsi="Helvetica" w:eastAsia="Helvetica" w:cs="Helvetica"/>
+                <w:i w:val="false"/>
+                <w:b w:val="false"/>
+                <w:u w:val="none"/>
+                <w:sz w:val="22"/>
+                <w:szCs w:val="22"/>
+                <w:color w:val="000000"/>
+              </w:rPr>
+              <w:t xml:space="preserve"/>
+            </w:r>
+          </w:p>
+        </w:tc>
+        <w:tc>
+          <w:tcPr>
+            <w:tcBorders>
+              <w:bottom w:val="none" w:sz="0" w:space="0" w:color="000000"/>
+              <w:top w:val="none" w:sz="0" w:space="0" w:color="000000"/>
+              <w:left w:val="none" w:sz="0" w:space="0" w:color="000000"/>
+              <w:right w:val="none" w:sz="0" w:space="0" w:color="000000"/>
+            </w:tcBorders>
+            <w:shd w:val="clear" w:color="auto" w:fill="FFFFFF"/>
+            <w:tcMar>
+              <w:top w:w="0" w:type="dxa"/>
+              <w:bottom w:w="0" w:type="dxa"/>
+              <w:left w:w="0" w:type="dxa"/>
+              <w:right w:w="0" w:type="dxa"/>
+            </w:tcMar>
+            <w:vAlign w:val="top"/>
+          </w:tcPr>
+          <w:p>
+            <w:pPr>
+              <w:pStyle w:val="Normal"/>
+              <w:jc w:val="center"/>
+              <w:pBdr>
+                <w:bottom w:val="none" w:sz="0" w:space="0" w:color="000000"/>
+                <w:top w:val="none" w:sz="0" w:space="0" w:color="000000"/>
+                <w:left w:val="none" w:sz="0" w:space="0" w:color="000000"/>
+                <w:right w:val="none" w:sz="0" w:space="0" w:color="000000"/>
+              </w:pBdr>
+              <w:spacing w:after="100" w:before="100" w:line="240"/>
+              <w:ind w:left="100" w:right="100" w:firstLine="0" w:firstLineChars="0"/>
+              <w:rPr>
+                <w:rFonts w:ascii="Helvetica" w:hAnsi="Helvetica" w:eastAsia="Helvetica" w:cs="Helvetica"/>
+                <w:i w:val="false"/>
+                <w:b w:val="false"/>
+                <w:u w:val="none"/>
+                <w:sz w:val="22"/>
+                <w:szCs w:val="22"/>
+                <w:color w:val="000000"/>
+              </w:rPr>
+            </w:pPr>
+            <w:r>
+              <w:rPr>
+                <w:rFonts w:ascii="Helvetica" w:hAnsi="Helvetica" w:eastAsia="Helvetica" w:cs="Helvetica"/>
+                <w:i w:val="false"/>
+                <w:b w:val="false"/>
+                <w:u w:val="none"/>
+                <w:sz w:val="22"/>
+                <w:szCs w:val="22"/>
+                <w:color w:val="000000"/>
+              </w:rPr>
+              <w:t xml:space="preserve">25,419</w:t>
+            </w:r>
+          </w:p>
+        </w:tc>
+        <w:tc>
+          <w:tcPr>
+            <w:tcBorders>
+              <w:bottom w:val="none" w:sz="0" w:space="0" w:color="000000"/>
+              <w:top w:val="none" w:sz="0" w:space="0" w:color="000000"/>
+              <w:left w:val="none" w:sz="0" w:space="0" w:color="000000"/>
+              <w:right w:val="none" w:sz="0" w:space="0" w:color="000000"/>
+            </w:tcBorders>
+            <w:shd w:val="clear" w:color="auto" w:fill="FFFFFF"/>
+            <w:tcMar>
+              <w:top w:w="0" w:type="dxa"/>
+              <w:bottom w:w="0" w:type="dxa"/>
+              <w:left w:w="0" w:type="dxa"/>
+              <w:right w:w="0" w:type="dxa"/>
+            </w:tcMar>
+            <w:vAlign w:val="top"/>
+          </w:tcPr>
+          <w:p>
+            <w:pPr>
+              <w:pStyle w:val="Normal"/>
+              <w:jc w:val="center"/>
+              <w:pBdr>
+                <w:bottom w:val="none" w:sz="0" w:space="0" w:color="000000"/>
+                <w:top w:val="none" w:sz="0" w:space="0" w:color="000000"/>
+                <w:left w:val="none" w:sz="0" w:space="0" w:color="000000"/>
+                <w:right w:val="none" w:sz="0" w:space="0" w:color="000000"/>
+              </w:pBdr>
+              <w:spacing w:after="100" w:before="100" w:line="240"/>
+              <w:ind w:left="100" w:right="100" w:firstLine="0" w:firstLineChars="0"/>
+              <w:rPr>
+                <w:rFonts w:ascii="Helvetica" w:hAnsi="Helvetica" w:eastAsia="Helvetica" w:cs="Helvetica"/>
+                <w:i w:val="false"/>
+                <w:b w:val="false"/>
+                <w:u w:val="none"/>
+                <w:sz w:val="22"/>
+                <w:szCs w:val="22"/>
+                <w:color w:val="000000"/>
+              </w:rPr>
+            </w:pPr>
+            <w:r>
+              <w:rPr>
+                <w:rFonts w:ascii="Helvetica" w:hAnsi="Helvetica" w:eastAsia="Helvetica" w:cs="Helvetica"/>
+                <w:i w:val="false"/>
+                <w:b w:val="false"/>
+                <w:u w:val="none"/>
+                <w:sz w:val="22"/>
+                <w:szCs w:val="22"/>
+                <w:color w:val="000000"/>
+              </w:rPr>
+              <w:t xml:space="preserve">8,270, 78,128</w:t>
+            </w:r>
+          </w:p>
+        </w:tc>
+        <w:tc>
+          <w:tcPr>
+            <w:tcBorders>
+              <w:bottom w:val="none" w:sz="0" w:space="0" w:color="000000"/>
+              <w:top w:val="none" w:sz="0" w:space="0" w:color="000000"/>
+              <w:left w:val="none" w:sz="0" w:space="0" w:color="000000"/>
+              <w:right w:val="none" w:sz="0" w:space="0" w:color="000000"/>
+            </w:tcBorders>
+            <w:shd w:val="clear" w:color="auto" w:fill="FFFFFF"/>
+            <w:tcMar>
+              <w:top w:w="0" w:type="dxa"/>
+              <w:bottom w:w="0" w:type="dxa"/>
+              <w:left w:w="0" w:type="dxa"/>
+              <w:right w:w="0" w:type="dxa"/>
+            </w:tcMar>
+            <w:vAlign w:val="top"/>
+          </w:tcPr>
+          <w:p>
+            <w:pPr>
+              <w:pStyle w:val="Normal"/>
+              <w:jc w:val="center"/>
+              <w:pBdr>
+                <w:bottom w:val="none" w:sz="0" w:space="0" w:color="000000"/>
+                <w:top w:val="none" w:sz="0" w:space="0" w:color="000000"/>
+                <w:left w:val="none" w:sz="0" w:space="0" w:color="000000"/>
+                <w:right w:val="none" w:sz="0" w:space="0" w:color="000000"/>
+              </w:pBdr>
+              <w:spacing w:after="100" w:before="100" w:line="240"/>
+              <w:ind w:left="100" w:right="100" w:firstLine="0" w:firstLineChars="0"/>
+              <w:rPr>
+                <w:rFonts w:ascii="Helvetica" w:hAnsi="Helvetica" w:eastAsia="Helvetica" w:cs="Helvetica"/>
+                <w:i w:val="false"/>
+                <w:b w:val="false"/>
+                <w:u w:val="none"/>
+                <w:sz w:val="22"/>
+                <w:szCs w:val="22"/>
+                <w:color w:val="000000"/>
+              </w:rPr>
+            </w:pPr>
+            <w:r>
+              <w:rPr>
+                <w:rFonts w:ascii="Helvetica" w:hAnsi="Helvetica" w:eastAsia="Helvetica" w:cs="Helvetica"/>
+                <w:i w:val="false"/>
+                <w:b w:val="false"/>
+                <w:u w:val="none"/>
+                <w:sz w:val="22"/>
+                <w:szCs w:val="22"/>
+                <w:color w:val="000000"/>
+              </w:rPr>
+              <w:t xml:space="preserve">&lt;0.001</w:t>
             </w:r>
           </w:p>
         </w:tc>
@@ -3633,7 +4599,7 @@
         <w:trPr>
           <w:trHeight w:val="598" w:hRule="auto"/>
         </w:trPr>
-        body7
+        body 9
         <w:tc>
           <w:tcPr>
             <w:tcBorders>
@@ -4001,113 +4967,113 @@
                 <w:szCs w:val="22"/>
                 <w:color w:val="000000"/>
               </w:rPr>
-              <w:t xml:space="preserve">2.20</w:t>
-            </w:r>
-          </w:p>
-        </w:tc>
-        <w:tc>
-          <w:tcPr>
-            <w:tcBorders>
-              <w:bottom w:val="none" w:sz="0" w:space="0" w:color="000000"/>
-              <w:top w:val="none" w:sz="0" w:space="0" w:color="000000"/>
-              <w:left w:val="none" w:sz="0" w:space="0" w:color="000000"/>
-              <w:right w:val="none" w:sz="0" w:space="0" w:color="000000"/>
-            </w:tcBorders>
-            <w:shd w:val="clear" w:color="auto" w:fill="FFFFFF"/>
-            <w:tcMar>
-              <w:top w:w="0" w:type="dxa"/>
-              <w:bottom w:w="0" w:type="dxa"/>
-              <w:left w:w="0" w:type="dxa"/>
-              <w:right w:w="0" w:type="dxa"/>
-            </w:tcMar>
-            <w:vAlign w:val="top"/>
-          </w:tcPr>
-          <w:p>
-            <w:pPr>
-              <w:pStyle w:val="Normal"/>
-              <w:jc w:val="center"/>
-              <w:pBdr>
-                <w:bottom w:val="none" w:sz="0" w:space="0" w:color="000000"/>
-                <w:top w:val="none" w:sz="0" w:space="0" w:color="000000"/>
-                <w:left w:val="none" w:sz="0" w:space="0" w:color="000000"/>
-                <w:right w:val="none" w:sz="0" w:space="0" w:color="000000"/>
-              </w:pBdr>
-              <w:spacing w:after="100" w:before="100" w:line="240"/>
-              <w:ind w:left="100" w:right="100" w:firstLine="0" w:firstLineChars="0"/>
-              <w:rPr>
-                <w:rFonts w:ascii="Helvetica" w:hAnsi="Helvetica" w:eastAsia="Helvetica" w:cs="Helvetica"/>
-                <w:i w:val="false"/>
-                <w:b w:val="false"/>
-                <w:u w:val="none"/>
-                <w:sz w:val="22"/>
-                <w:szCs w:val="22"/>
-                <w:color w:val="000000"/>
-              </w:rPr>
-            </w:pPr>
-            <w:r>
-              <w:rPr>
-                <w:rFonts w:ascii="Helvetica" w:hAnsi="Helvetica" w:eastAsia="Helvetica" w:cs="Helvetica"/>
-                <w:i w:val="false"/>
-                <w:b w:val="false"/>
-                <w:u w:val="none"/>
-                <w:sz w:val="22"/>
-                <w:szCs w:val="22"/>
-                <w:color w:val="000000"/>
-              </w:rPr>
-              <w:t xml:space="preserve">0.44, 10.9</w:t>
-            </w:r>
-          </w:p>
-        </w:tc>
-        <w:tc>
-          <w:tcPr>
-            <w:tcBorders>
-              <w:bottom w:val="none" w:sz="0" w:space="0" w:color="000000"/>
-              <w:top w:val="none" w:sz="0" w:space="0" w:color="000000"/>
-              <w:left w:val="none" w:sz="0" w:space="0" w:color="000000"/>
-              <w:right w:val="none" w:sz="0" w:space="0" w:color="000000"/>
-            </w:tcBorders>
-            <w:shd w:val="clear" w:color="auto" w:fill="FFFFFF"/>
-            <w:tcMar>
-              <w:top w:w="0" w:type="dxa"/>
-              <w:bottom w:w="0" w:type="dxa"/>
-              <w:left w:w="0" w:type="dxa"/>
-              <w:right w:w="0" w:type="dxa"/>
-            </w:tcMar>
-            <w:vAlign w:val="top"/>
-          </w:tcPr>
-          <w:p>
-            <w:pPr>
-              <w:pStyle w:val="Normal"/>
-              <w:jc w:val="center"/>
-              <w:pBdr>
-                <w:bottom w:val="none" w:sz="0" w:space="0" w:color="000000"/>
-                <w:top w:val="none" w:sz="0" w:space="0" w:color="000000"/>
-                <w:left w:val="none" w:sz="0" w:space="0" w:color="000000"/>
-                <w:right w:val="none" w:sz="0" w:space="0" w:color="000000"/>
-              </w:pBdr>
-              <w:spacing w:after="100" w:before="100" w:line="240"/>
-              <w:ind w:left="100" w:right="100" w:firstLine="0" w:firstLineChars="0"/>
-              <w:rPr>
-                <w:rFonts w:ascii="Helvetica" w:hAnsi="Helvetica" w:eastAsia="Helvetica" w:cs="Helvetica"/>
-                <w:i w:val="false"/>
-                <w:b w:val="false"/>
-                <w:u w:val="none"/>
-                <w:sz w:val="22"/>
-                <w:szCs w:val="22"/>
-                <w:color w:val="000000"/>
-              </w:rPr>
-            </w:pPr>
-            <w:r>
-              <w:rPr>
-                <w:rFonts w:ascii="Helvetica" w:hAnsi="Helvetica" w:eastAsia="Helvetica" w:cs="Helvetica"/>
-                <w:i w:val="false"/>
-                <w:b w:val="false"/>
-                <w:u w:val="none"/>
-                <w:sz w:val="22"/>
-                <w:szCs w:val="22"/>
-                <w:color w:val="000000"/>
-              </w:rPr>
-              <w:t xml:space="preserve">0.330</w:t>
+              <w:t xml:space="preserve">1.60</w:t>
+            </w:r>
+          </w:p>
+        </w:tc>
+        <w:tc>
+          <w:tcPr>
+            <w:tcBorders>
+              <w:bottom w:val="none" w:sz="0" w:space="0" w:color="000000"/>
+              <w:top w:val="none" w:sz="0" w:space="0" w:color="000000"/>
+              <w:left w:val="none" w:sz="0" w:space="0" w:color="000000"/>
+              <w:right w:val="none" w:sz="0" w:space="0" w:color="000000"/>
+            </w:tcBorders>
+            <w:shd w:val="clear" w:color="auto" w:fill="FFFFFF"/>
+            <w:tcMar>
+              <w:top w:w="0" w:type="dxa"/>
+              <w:bottom w:w="0" w:type="dxa"/>
+              <w:left w:w="0" w:type="dxa"/>
+              <w:right w:w="0" w:type="dxa"/>
+            </w:tcMar>
+            <w:vAlign w:val="top"/>
+          </w:tcPr>
+          <w:p>
+            <w:pPr>
+              <w:pStyle w:val="Normal"/>
+              <w:jc w:val="center"/>
+              <w:pBdr>
+                <w:bottom w:val="none" w:sz="0" w:space="0" w:color="000000"/>
+                <w:top w:val="none" w:sz="0" w:space="0" w:color="000000"/>
+                <w:left w:val="none" w:sz="0" w:space="0" w:color="000000"/>
+                <w:right w:val="none" w:sz="0" w:space="0" w:color="000000"/>
+              </w:pBdr>
+              <w:spacing w:after="100" w:before="100" w:line="240"/>
+              <w:ind w:left="100" w:right="100" w:firstLine="0" w:firstLineChars="0"/>
+              <w:rPr>
+                <w:rFonts w:ascii="Helvetica" w:hAnsi="Helvetica" w:eastAsia="Helvetica" w:cs="Helvetica"/>
+                <w:i w:val="false"/>
+                <w:b w:val="false"/>
+                <w:u w:val="none"/>
+                <w:sz w:val="22"/>
+                <w:szCs w:val="22"/>
+                <w:color w:val="000000"/>
+              </w:rPr>
+            </w:pPr>
+            <w:r>
+              <w:rPr>
+                <w:rFonts w:ascii="Helvetica" w:hAnsi="Helvetica" w:eastAsia="Helvetica" w:cs="Helvetica"/>
+                <w:i w:val="false"/>
+                <w:b w:val="false"/>
+                <w:u w:val="none"/>
+                <w:sz w:val="22"/>
+                <w:szCs w:val="22"/>
+                <w:color w:val="000000"/>
+              </w:rPr>
+              <w:t xml:space="preserve">0.39, 6.61</w:t>
+            </w:r>
+          </w:p>
+        </w:tc>
+        <w:tc>
+          <w:tcPr>
+            <w:tcBorders>
+              <w:bottom w:val="none" w:sz="0" w:space="0" w:color="000000"/>
+              <w:top w:val="none" w:sz="0" w:space="0" w:color="000000"/>
+              <w:left w:val="none" w:sz="0" w:space="0" w:color="000000"/>
+              <w:right w:val="none" w:sz="0" w:space="0" w:color="000000"/>
+            </w:tcBorders>
+            <w:shd w:val="clear" w:color="auto" w:fill="FFFFFF"/>
+            <w:tcMar>
+              <w:top w:w="0" w:type="dxa"/>
+              <w:bottom w:w="0" w:type="dxa"/>
+              <w:left w:w="0" w:type="dxa"/>
+              <w:right w:w="0" w:type="dxa"/>
+            </w:tcMar>
+            <w:vAlign w:val="top"/>
+          </w:tcPr>
+          <w:p>
+            <w:pPr>
+              <w:pStyle w:val="Normal"/>
+              <w:jc w:val="center"/>
+              <w:pBdr>
+                <w:bottom w:val="none" w:sz="0" w:space="0" w:color="000000"/>
+                <w:top w:val="none" w:sz="0" w:space="0" w:color="000000"/>
+                <w:left w:val="none" w:sz="0" w:space="0" w:color="000000"/>
+                <w:right w:val="none" w:sz="0" w:space="0" w:color="000000"/>
+              </w:pBdr>
+              <w:spacing w:after="100" w:before="100" w:line="240"/>
+              <w:ind w:left="100" w:right="100" w:firstLine="0" w:firstLineChars="0"/>
+              <w:rPr>
+                <w:rFonts w:ascii="Helvetica" w:hAnsi="Helvetica" w:eastAsia="Helvetica" w:cs="Helvetica"/>
+                <w:i w:val="false"/>
+                <w:b w:val="false"/>
+                <w:u w:val="none"/>
+                <w:sz w:val="22"/>
+                <w:szCs w:val="22"/>
+                <w:color w:val="000000"/>
+              </w:rPr>
+            </w:pPr>
+            <w:r>
+              <w:rPr>
+                <w:rFonts w:ascii="Helvetica" w:hAnsi="Helvetica" w:eastAsia="Helvetica" w:cs="Helvetica"/>
+                <w:i w:val="false"/>
+                <w:b w:val="false"/>
+                <w:u w:val="none"/>
+                <w:sz w:val="22"/>
+                <w:szCs w:val="22"/>
+                <w:color w:val="000000"/>
+              </w:rPr>
+              <w:t xml:space="preserve">0.510</w:t>
             </w:r>
           </w:p>
         </w:tc>
@@ -4116,7 +5082,7 @@
         <w:trPr>
           <w:trHeight w:val="598" w:hRule="auto"/>
         </w:trPr>
-        body8
+        body10
         <w:tc>
           <w:tcPr>
             <w:tcBorders>
@@ -4484,7 +5450,7 @@
                 <w:szCs w:val="22"/>
                 <w:color w:val="000000"/>
               </w:rPr>
-              <w:t xml:space="preserve">1.00</w:t>
+              <w:t xml:space="preserve">1.01</w:t>
             </w:r>
           </w:p>
         </w:tc>
@@ -4590,7 +5556,7 @@
                 <w:szCs w:val="22"/>
                 <w:color w:val="000000"/>
               </w:rPr>
-              <w:t xml:space="preserve">0.760</w:t>
+              <w:t xml:space="preserve">0.520</w:t>
             </w:r>
           </w:p>
         </w:tc>
@@ -4599,7 +5565,7 @@
         <w:trPr>
           <w:trHeight w:val="360" w:hRule="auto"/>
         </w:trPr>
-        footer1
+        footer 1
         <w:tc>
           <w:tcPr>
             <w:gridSpan w:val="9"/>

</xml_diff>

<commit_message>
Use numeric ecog_score (0-5) in adjuster set, not binary ecog_score_cat2
Reverts the previous commit's switch to ecog_score_cat2 — ECOG is now
modeled as a continuous 0–5 score (1-df linear slope). All 10 adjuster
sets, caption, and descriptive paragraph updated. Output unchanged in
shape: 11 docx tables, 54 pptx plots, 0 Lapack errors, 4 small-cohort
fallbacks.

Co-Authored-By: Claude Opus 4.7 (1M context) <noreply@anthropic.com>
</commit_message>
<xml_diff>
--- a/docs/tables/carbo/sec5_aki_2.docx
+++ b/docs/tables/carbo/sec5_aki_2.docx
@@ -17,14 +17,14 @@
         <w:tblLook w:firstRow="1" w:lastRow="0" w:firstColumn="0" w:lastColumn="0" w:noHBand="0" w:noVBand="1"/>
       </w:tblPr>
       <w:tblGrid>
-        <w:gridCol w:w="2086"/>
+        <w:gridCol w:w="2025"/>
         <w:gridCol w:w="778"/>
-        <w:gridCol w:w="1084"/>
-        <w:gridCol w:w="1879"/>
+        <w:gridCol w:w="839"/>
+        <w:gridCol w:w="1389"/>
         <w:gridCol w:w="1181"/>
         <w:gridCol w:w="778"/>
-        <w:gridCol w:w="1084"/>
-        <w:gridCol w:w="1756"/>
+        <w:gridCol w:w="839"/>
+        <w:gridCol w:w="1389"/>
         <w:gridCol w:w="1181"/>
       </w:tblGrid>
       <w:tr>
@@ -32,7 +32,7 @@
           <w:trHeight w:val="574" w:hRule="auto"/>
           <w:tblHeader/>
         </w:trPr>
-        header 1
+        header1
         <w:tc>
           <w:tcPr>
             <w:tcBorders>
@@ -200,7 +200,7 @@
           <w:trHeight w:val="615" w:hRule="auto"/>
           <w:tblHeader/>
         </w:trPr>
-        header 2
+        header2
         <w:tc>
           <w:tcPr>
             <w:tcBorders>
@@ -735,7 +735,7 @@
         <w:trPr>
           <w:trHeight w:val="619" w:hRule="auto"/>
         </w:trPr>
-        body 1
+        body1
         <w:tc>
           <w:tcPr>
             <w:tcBorders>
@@ -1103,7 +1103,7 @@
                 <w:szCs w:val="22"/>
                 <w:color w:val="000000"/>
               </w:rPr>
-              <w:t xml:space="preserve">1.27</w:t>
+              <w:t xml:space="preserve">1.18</w:t>
             </w:r>
           </w:p>
         </w:tc>
@@ -1156,7 +1156,7 @@
                 <w:szCs w:val="22"/>
                 <w:color w:val="000000"/>
               </w:rPr>
-              <w:t xml:space="preserve">0.87, 1.85</w:t>
+              <w:t xml:space="preserve">0.79, 1.75</w:t>
             </w:r>
           </w:p>
         </w:tc>
@@ -1209,7 +1209,7 @@
                 <w:szCs w:val="22"/>
                 <w:color w:val="000000"/>
               </w:rPr>
-              <w:t xml:space="preserve">0.210</w:t>
+              <w:t xml:space="preserve">0.420</w:t>
             </w:r>
           </w:p>
         </w:tc>
@@ -1218,7 +1218,7 @@
         <w:trPr>
           <w:trHeight w:val="598" w:hRule="auto"/>
         </w:trPr>
-        body 2
+        body2
         <w:tc>
           <w:tcPr>
             <w:tcBorders>
@@ -1586,113 +1586,113 @@
                 <w:szCs w:val="22"/>
                 <w:color w:val="000000"/>
               </w:rPr>
-              <w:t xml:space="preserve">1.03</w:t>
-            </w:r>
-          </w:p>
-        </w:tc>
-        <w:tc>
-          <w:tcPr>
-            <w:tcBorders>
-              <w:bottom w:val="none" w:sz="0" w:space="0" w:color="000000"/>
-              <w:top w:val="none" w:sz="0" w:space="0" w:color="000000"/>
-              <w:left w:val="none" w:sz="0" w:space="0" w:color="000000"/>
-              <w:right w:val="none" w:sz="0" w:space="0" w:color="000000"/>
-            </w:tcBorders>
-            <w:shd w:val="clear" w:color="auto" w:fill="FFFFFF"/>
-            <w:tcMar>
-              <w:top w:w="0" w:type="dxa"/>
-              <w:bottom w:w="0" w:type="dxa"/>
-              <w:left w:w="0" w:type="dxa"/>
-              <w:right w:w="0" w:type="dxa"/>
-            </w:tcMar>
-            <w:vAlign w:val="top"/>
-          </w:tcPr>
-          <w:p>
-            <w:pPr>
-              <w:pStyle w:val="Normal"/>
-              <w:jc w:val="center"/>
-              <w:pBdr>
-                <w:bottom w:val="none" w:sz="0" w:space="0" w:color="000000"/>
-                <w:top w:val="none" w:sz="0" w:space="0" w:color="000000"/>
-                <w:left w:val="none" w:sz="0" w:space="0" w:color="000000"/>
-                <w:right w:val="none" w:sz="0" w:space="0" w:color="000000"/>
-              </w:pBdr>
-              <w:spacing w:after="100" w:before="100" w:line="240"/>
-              <w:ind w:left="100" w:right="100" w:firstLine="0" w:firstLineChars="0"/>
-              <w:rPr>
-                <w:rFonts w:ascii="Helvetica" w:hAnsi="Helvetica" w:eastAsia="Helvetica" w:cs="Helvetica"/>
-                <w:i w:val="false"/>
-                <w:b w:val="false"/>
-                <w:u w:val="none"/>
-                <w:sz w:val="22"/>
-                <w:szCs w:val="22"/>
-                <w:color w:val="000000"/>
-              </w:rPr>
-            </w:pPr>
-            <w:r>
-              <w:rPr>
-                <w:rFonts w:ascii="Helvetica" w:hAnsi="Helvetica" w:eastAsia="Helvetica" w:cs="Helvetica"/>
-                <w:i w:val="false"/>
-                <w:b w:val="false"/>
-                <w:u w:val="none"/>
-                <w:sz w:val="22"/>
-                <w:szCs w:val="22"/>
-                <w:color w:val="000000"/>
-              </w:rPr>
-              <w:t xml:space="preserve">0.93, 1.13</w:t>
-            </w:r>
-          </w:p>
-        </w:tc>
-        <w:tc>
-          <w:tcPr>
-            <w:tcBorders>
-              <w:bottom w:val="none" w:sz="0" w:space="0" w:color="000000"/>
-              <w:top w:val="none" w:sz="0" w:space="0" w:color="000000"/>
-              <w:left w:val="none" w:sz="0" w:space="0" w:color="000000"/>
-              <w:right w:val="none" w:sz="0" w:space="0" w:color="000000"/>
-            </w:tcBorders>
-            <w:shd w:val="clear" w:color="auto" w:fill="FFFFFF"/>
-            <w:tcMar>
-              <w:top w:w="0" w:type="dxa"/>
-              <w:bottom w:w="0" w:type="dxa"/>
-              <w:left w:w="0" w:type="dxa"/>
-              <w:right w:w="0" w:type="dxa"/>
-            </w:tcMar>
-            <w:vAlign w:val="top"/>
-          </w:tcPr>
-          <w:p>
-            <w:pPr>
-              <w:pStyle w:val="Normal"/>
-              <w:jc w:val="center"/>
-              <w:pBdr>
-                <w:bottom w:val="none" w:sz="0" w:space="0" w:color="000000"/>
-                <w:top w:val="none" w:sz="0" w:space="0" w:color="000000"/>
-                <w:left w:val="none" w:sz="0" w:space="0" w:color="000000"/>
-                <w:right w:val="none" w:sz="0" w:space="0" w:color="000000"/>
-              </w:pBdr>
-              <w:spacing w:after="100" w:before="100" w:line="240"/>
-              <w:ind w:left="100" w:right="100" w:firstLine="0" w:firstLineChars="0"/>
-              <w:rPr>
-                <w:rFonts w:ascii="Helvetica" w:hAnsi="Helvetica" w:eastAsia="Helvetica" w:cs="Helvetica"/>
-                <w:i w:val="false"/>
-                <w:b w:val="false"/>
-                <w:u w:val="none"/>
-                <w:sz w:val="22"/>
-                <w:szCs w:val="22"/>
-                <w:color w:val="000000"/>
-              </w:rPr>
-            </w:pPr>
-            <w:r>
-              <w:rPr>
-                <w:rFonts w:ascii="Helvetica" w:hAnsi="Helvetica" w:eastAsia="Helvetica" w:cs="Helvetica"/>
-                <w:i w:val="false"/>
-                <w:b w:val="false"/>
-                <w:u w:val="none"/>
-                <w:sz w:val="22"/>
-                <w:szCs w:val="22"/>
-                <w:color w:val="000000"/>
-              </w:rPr>
-              <w:t xml:space="preserve">0.600</w:t>
+              <w:t xml:space="preserve">1.02</w:t>
+            </w:r>
+          </w:p>
+        </w:tc>
+        <w:tc>
+          <w:tcPr>
+            <w:tcBorders>
+              <w:bottom w:val="none" w:sz="0" w:space="0" w:color="000000"/>
+              <w:top w:val="none" w:sz="0" w:space="0" w:color="000000"/>
+              <w:left w:val="none" w:sz="0" w:space="0" w:color="000000"/>
+              <w:right w:val="none" w:sz="0" w:space="0" w:color="000000"/>
+            </w:tcBorders>
+            <w:shd w:val="clear" w:color="auto" w:fill="FFFFFF"/>
+            <w:tcMar>
+              <w:top w:w="0" w:type="dxa"/>
+              <w:bottom w:w="0" w:type="dxa"/>
+              <w:left w:w="0" w:type="dxa"/>
+              <w:right w:w="0" w:type="dxa"/>
+            </w:tcMar>
+            <w:vAlign w:val="top"/>
+          </w:tcPr>
+          <w:p>
+            <w:pPr>
+              <w:pStyle w:val="Normal"/>
+              <w:jc w:val="center"/>
+              <w:pBdr>
+                <w:bottom w:val="none" w:sz="0" w:space="0" w:color="000000"/>
+                <w:top w:val="none" w:sz="0" w:space="0" w:color="000000"/>
+                <w:left w:val="none" w:sz="0" w:space="0" w:color="000000"/>
+                <w:right w:val="none" w:sz="0" w:space="0" w:color="000000"/>
+              </w:pBdr>
+              <w:spacing w:after="100" w:before="100" w:line="240"/>
+              <w:ind w:left="100" w:right="100" w:firstLine="0" w:firstLineChars="0"/>
+              <w:rPr>
+                <w:rFonts w:ascii="Helvetica" w:hAnsi="Helvetica" w:eastAsia="Helvetica" w:cs="Helvetica"/>
+                <w:i w:val="false"/>
+                <w:b w:val="false"/>
+                <w:u w:val="none"/>
+                <w:sz w:val="22"/>
+                <w:szCs w:val="22"/>
+                <w:color w:val="000000"/>
+              </w:rPr>
+            </w:pPr>
+            <w:r>
+              <w:rPr>
+                <w:rFonts w:ascii="Helvetica" w:hAnsi="Helvetica" w:eastAsia="Helvetica" w:cs="Helvetica"/>
+                <w:i w:val="false"/>
+                <w:b w:val="false"/>
+                <w:u w:val="none"/>
+                <w:sz w:val="22"/>
+                <w:szCs w:val="22"/>
+                <w:color w:val="000000"/>
+              </w:rPr>
+              <w:t xml:space="preserve">0.91, 1.14</w:t>
+            </w:r>
+          </w:p>
+        </w:tc>
+        <w:tc>
+          <w:tcPr>
+            <w:tcBorders>
+              <w:bottom w:val="none" w:sz="0" w:space="0" w:color="000000"/>
+              <w:top w:val="none" w:sz="0" w:space="0" w:color="000000"/>
+              <w:left w:val="none" w:sz="0" w:space="0" w:color="000000"/>
+              <w:right w:val="none" w:sz="0" w:space="0" w:color="000000"/>
+            </w:tcBorders>
+            <w:shd w:val="clear" w:color="auto" w:fill="FFFFFF"/>
+            <w:tcMar>
+              <w:top w:w="0" w:type="dxa"/>
+              <w:bottom w:w="0" w:type="dxa"/>
+              <w:left w:w="0" w:type="dxa"/>
+              <w:right w:w="0" w:type="dxa"/>
+            </w:tcMar>
+            <w:vAlign w:val="top"/>
+          </w:tcPr>
+          <w:p>
+            <w:pPr>
+              <w:pStyle w:val="Normal"/>
+              <w:jc w:val="center"/>
+              <w:pBdr>
+                <w:bottom w:val="none" w:sz="0" w:space="0" w:color="000000"/>
+                <w:top w:val="none" w:sz="0" w:space="0" w:color="000000"/>
+                <w:left w:val="none" w:sz="0" w:space="0" w:color="000000"/>
+                <w:right w:val="none" w:sz="0" w:space="0" w:color="000000"/>
+              </w:pBdr>
+              <w:spacing w:after="100" w:before="100" w:line="240"/>
+              <w:ind w:left="100" w:right="100" w:firstLine="0" w:firstLineChars="0"/>
+              <w:rPr>
+                <w:rFonts w:ascii="Helvetica" w:hAnsi="Helvetica" w:eastAsia="Helvetica" w:cs="Helvetica"/>
+                <w:i w:val="false"/>
+                <w:b w:val="false"/>
+                <w:u w:val="none"/>
+                <w:sz w:val="22"/>
+                <w:szCs w:val="22"/>
+                <w:color w:val="000000"/>
+              </w:rPr>
+            </w:pPr>
+            <w:r>
+              <w:rPr>
+                <w:rFonts w:ascii="Helvetica" w:hAnsi="Helvetica" w:eastAsia="Helvetica" w:cs="Helvetica"/>
+                <w:i w:val="false"/>
+                <w:b w:val="false"/>
+                <w:u w:val="none"/>
+                <w:sz w:val="22"/>
+                <w:szCs w:val="22"/>
+                <w:color w:val="000000"/>
+              </w:rPr>
+              <w:t xml:space="preserve">0.780</w:t>
             </w:r>
           </w:p>
         </w:tc>
@@ -1701,7 +1701,7 @@
         <w:trPr>
           <w:trHeight w:val="565" w:hRule="auto"/>
         </w:trPr>
-        body 3
+        body3
         <w:tc>
           <w:tcPr>
             <w:tcBorders>
@@ -2184,7 +2184,7 @@
         <w:trPr>
           <w:trHeight w:val="573" w:hRule="auto"/>
         </w:trPr>
-        body 4
+        body4
         <w:tc>
           <w:tcPr>
             <w:tcBorders>
@@ -2667,7 +2667,7 @@
         <w:trPr>
           <w:trHeight w:val="598" w:hRule="auto"/>
         </w:trPr>
-        body 5
+        body5
         <w:tc>
           <w:tcPr>
             <w:tcBorders>
@@ -3035,1079 +3035,113 @@
                 <w:szCs w:val="22"/>
                 <w:color w:val="000000"/>
               </w:rPr>
-              <w:t xml:space="preserve">1.49</w:t>
-            </w:r>
-          </w:p>
-        </w:tc>
-        <w:tc>
-          <w:tcPr>
-            <w:tcBorders>
-              <w:bottom w:val="none" w:sz="0" w:space="0" w:color="000000"/>
-              <w:top w:val="none" w:sz="0" w:space="0" w:color="000000"/>
-              <w:left w:val="none" w:sz="0" w:space="0" w:color="000000"/>
-              <w:right w:val="none" w:sz="0" w:space="0" w:color="000000"/>
-            </w:tcBorders>
-            <w:shd w:val="clear" w:color="auto" w:fill="FFFFFF"/>
-            <w:tcMar>
-              <w:top w:w="0" w:type="dxa"/>
-              <w:bottom w:w="0" w:type="dxa"/>
-              <w:left w:w="0" w:type="dxa"/>
-              <w:right w:w="0" w:type="dxa"/>
-            </w:tcMar>
-            <w:vAlign w:val="top"/>
-          </w:tcPr>
-          <w:p>
-            <w:pPr>
-              <w:pStyle w:val="Normal"/>
-              <w:jc w:val="center"/>
-              <w:pBdr>
-                <w:bottom w:val="none" w:sz="0" w:space="0" w:color="000000"/>
-                <w:top w:val="none" w:sz="0" w:space="0" w:color="000000"/>
-                <w:left w:val="none" w:sz="0" w:space="0" w:color="000000"/>
-                <w:right w:val="none" w:sz="0" w:space="0" w:color="000000"/>
-              </w:pBdr>
-              <w:spacing w:after="100" w:before="100" w:line="240"/>
-              <w:ind w:left="100" w:right="100" w:firstLine="0" w:firstLineChars="0"/>
-              <w:rPr>
-                <w:rFonts w:ascii="Helvetica" w:hAnsi="Helvetica" w:eastAsia="Helvetica" w:cs="Helvetica"/>
-                <w:i w:val="false"/>
-                <w:b w:val="false"/>
-                <w:u w:val="none"/>
-                <w:sz w:val="22"/>
-                <w:szCs w:val="22"/>
-                <w:color w:val="000000"/>
-              </w:rPr>
-            </w:pPr>
-            <w:r>
-              <w:rPr>
-                <w:rFonts w:ascii="Helvetica" w:hAnsi="Helvetica" w:eastAsia="Helvetica" w:cs="Helvetica"/>
-                <w:i w:val="false"/>
-                <w:b w:val="false"/>
-                <w:u w:val="none"/>
-                <w:sz w:val="22"/>
-                <w:szCs w:val="22"/>
-                <w:color w:val="000000"/>
-              </w:rPr>
-              <w:t xml:space="preserve">0.33, 6.75</w:t>
-            </w:r>
-          </w:p>
-        </w:tc>
-        <w:tc>
-          <w:tcPr>
-            <w:tcBorders>
-              <w:bottom w:val="none" w:sz="0" w:space="0" w:color="000000"/>
-              <w:top w:val="none" w:sz="0" w:space="0" w:color="000000"/>
-              <w:left w:val="none" w:sz="0" w:space="0" w:color="000000"/>
-              <w:right w:val="none" w:sz="0" w:space="0" w:color="000000"/>
-            </w:tcBorders>
-            <w:shd w:val="clear" w:color="auto" w:fill="FFFFFF"/>
-            <w:tcMar>
-              <w:top w:w="0" w:type="dxa"/>
-              <w:bottom w:w="0" w:type="dxa"/>
-              <w:left w:w="0" w:type="dxa"/>
-              <w:right w:w="0" w:type="dxa"/>
-            </w:tcMar>
-            <w:vAlign w:val="top"/>
-          </w:tcPr>
-          <w:p>
-            <w:pPr>
-              <w:pStyle w:val="Normal"/>
-              <w:jc w:val="center"/>
-              <w:pBdr>
-                <w:bottom w:val="none" w:sz="0" w:space="0" w:color="000000"/>
-                <w:top w:val="none" w:sz="0" w:space="0" w:color="000000"/>
-                <w:left w:val="none" w:sz="0" w:space="0" w:color="000000"/>
-                <w:right w:val="none" w:sz="0" w:space="0" w:color="000000"/>
-              </w:pBdr>
-              <w:spacing w:after="100" w:before="100" w:line="240"/>
-              <w:ind w:left="100" w:right="100" w:firstLine="0" w:firstLineChars="0"/>
-              <w:rPr>
-                <w:rFonts w:ascii="Helvetica" w:hAnsi="Helvetica" w:eastAsia="Helvetica" w:cs="Helvetica"/>
-                <w:i w:val="false"/>
-                <w:b w:val="false"/>
-                <w:u w:val="none"/>
-                <w:sz w:val="22"/>
-                <w:szCs w:val="22"/>
-                <w:color w:val="000000"/>
-              </w:rPr>
-            </w:pPr>
-            <w:r>
-              <w:rPr>
-                <w:rFonts w:ascii="Helvetica" w:hAnsi="Helvetica" w:eastAsia="Helvetica" w:cs="Helvetica"/>
-                <w:i w:val="false"/>
-                <w:b w:val="false"/>
-                <w:u w:val="none"/>
-                <w:sz w:val="22"/>
-                <w:szCs w:val="22"/>
-                <w:color w:val="000000"/>
-              </w:rPr>
-              <w:t xml:space="preserve">0.610</w:t>
-            </w:r>
-          </w:p>
-        </w:tc>
-      </w:tr>
-      <w:tr>
-        <w:trPr>
-          <w:trHeight w:val="614" w:hRule="auto"/>
-        </w:trPr>
-        body 6
-        <w:tc>
-          <w:tcPr>
-            <w:tcBorders>
-              <w:bottom w:val="none" w:sz="0" w:space="0" w:color="000000"/>
-              <w:top w:val="none" w:sz="0" w:space="0" w:color="000000"/>
-              <w:left w:val="none" w:sz="0" w:space="0" w:color="000000"/>
-              <w:right w:val="none" w:sz="0" w:space="0" w:color="000000"/>
-            </w:tcBorders>
-            <w:shd w:val="clear" w:color="auto" w:fill="FFFFFF"/>
-            <w:tcMar>
-              <w:top w:w="0" w:type="dxa"/>
-              <w:bottom w:w="0" w:type="dxa"/>
-              <w:left w:w="0" w:type="dxa"/>
-              <w:right w:w="0" w:type="dxa"/>
-            </w:tcMar>
-            <w:vAlign w:val="top"/>
-          </w:tcPr>
-          <w:p>
-            <w:pPr>
-              <w:pStyle w:val="Normal"/>
-              <w:jc w:val="left"/>
-              <w:pBdr>
-                <w:bottom w:val="none" w:sz="0" w:space="0" w:color="000000"/>
-                <w:top w:val="none" w:sz="0" w:space="0" w:color="000000"/>
-                <w:left w:val="none" w:sz="0" w:space="0" w:color="000000"/>
-                <w:right w:val="none" w:sz="0" w:space="0" w:color="000000"/>
-              </w:pBdr>
-              <w:spacing w:after="100" w:before="100" w:line="240"/>
-              <w:ind w:left="100" w:right="100" w:firstLine="0" w:firstLineChars="0"/>
-              <w:rPr>
-                <w:rFonts w:ascii="Helvetica" w:hAnsi="Helvetica" w:eastAsia="Helvetica" w:cs="Helvetica"/>
-                <w:i w:val="false"/>
-                <w:b w:val="false"/>
-                <w:u w:val="none"/>
-                <w:sz w:val="22"/>
-                <w:szCs w:val="22"/>
-                <w:color w:val="000000"/>
-              </w:rPr>
-            </w:pPr>
-            <w:r>
-              <w:rPr>
-                <w:rFonts w:ascii="Helvetica" w:hAnsi="Helvetica" w:eastAsia="Helvetica" w:cs="Helvetica"/>
-                <w:i w:val="false"/>
-                <w:b w:val="false"/>
-                <w:u w:val="none"/>
-                <w:sz w:val="22"/>
-                <w:szCs w:val="22"/>
-                <w:color w:val="000000"/>
-              </w:rPr>
-              <w:t xml:space="preserve">ecog_score_cat2</w:t>
-            </w:r>
-          </w:p>
-        </w:tc>
-        <w:tc>
-          <w:tcPr>
-            <w:tcBorders>
-              <w:bottom w:val="none" w:sz="0" w:space="0" w:color="000000"/>
-              <w:top w:val="none" w:sz="0" w:space="0" w:color="000000"/>
-              <w:left w:val="none" w:sz="0" w:space="0" w:color="000000"/>
-              <w:right w:val="none" w:sz="0" w:space="0" w:color="000000"/>
-            </w:tcBorders>
-            <w:shd w:val="clear" w:color="auto" w:fill="FFFFFF"/>
-            <w:tcMar>
-              <w:top w:w="0" w:type="dxa"/>
-              <w:bottom w:w="0" w:type="dxa"/>
-              <w:left w:w="0" w:type="dxa"/>
-              <w:right w:w="0" w:type="dxa"/>
-            </w:tcMar>
-            <w:vAlign w:val="top"/>
-          </w:tcPr>
-          <w:p>
-            <w:pPr>
-              <w:pStyle w:val="Normal"/>
-              <w:jc w:val="center"/>
-              <w:pBdr>
-                <w:bottom w:val="none" w:sz="0" w:space="0" w:color="000000"/>
-                <w:top w:val="none" w:sz="0" w:space="0" w:color="000000"/>
-                <w:left w:val="none" w:sz="0" w:space="0" w:color="000000"/>
-                <w:right w:val="none" w:sz="0" w:space="0" w:color="000000"/>
-              </w:pBdr>
-              <w:spacing w:after="100" w:before="100" w:line="240"/>
-              <w:ind w:left="100" w:right="100" w:firstLine="0" w:firstLineChars="0"/>
-              <w:rPr>
-                <w:rFonts w:ascii="Helvetica" w:hAnsi="Helvetica" w:eastAsia="Helvetica" w:cs="Helvetica"/>
-                <w:i w:val="false"/>
-                <w:b w:val="false"/>
-                <w:u w:val="none"/>
-                <w:sz w:val="22"/>
-                <w:szCs w:val="22"/>
-                <w:color w:val="000000"/>
-              </w:rPr>
-            </w:pPr>
-            <w:r>
-              <w:rPr>
-                <w:rFonts w:ascii="Helvetica" w:hAnsi="Helvetica" w:eastAsia="Helvetica" w:cs="Helvetica"/>
-                <w:i w:val="false"/>
-                <w:b w:val="false"/>
-                <w:u w:val="none"/>
-                <w:sz w:val="22"/>
-                <w:szCs w:val="22"/>
-                <w:color w:val="000000"/>
-              </w:rPr>
-              <w:t xml:space="preserve">121</w:t>
-            </w:r>
-          </w:p>
-        </w:tc>
-        <w:tc>
-          <w:tcPr>
-            <w:tcBorders>
-              <w:bottom w:val="none" w:sz="0" w:space="0" w:color="000000"/>
-              <w:top w:val="none" w:sz="0" w:space="0" w:color="000000"/>
-              <w:left w:val="none" w:sz="0" w:space="0" w:color="000000"/>
-              <w:right w:val="none" w:sz="0" w:space="0" w:color="000000"/>
-            </w:tcBorders>
-            <w:shd w:val="clear" w:color="auto" w:fill="FFFFFF"/>
-            <w:tcMar>
-              <w:top w:w="0" w:type="dxa"/>
-              <w:bottom w:w="0" w:type="dxa"/>
-              <w:left w:w="0" w:type="dxa"/>
-              <w:right w:w="0" w:type="dxa"/>
-            </w:tcMar>
-            <w:vAlign w:val="top"/>
-          </w:tcPr>
-          <w:p>
-            <w:pPr>
-              <w:pStyle w:val="Normal"/>
-              <w:jc w:val="center"/>
-              <w:pBdr>
-                <w:bottom w:val="none" w:sz="0" w:space="0" w:color="000000"/>
-                <w:top w:val="none" w:sz="0" w:space="0" w:color="000000"/>
-                <w:left w:val="none" w:sz="0" w:space="0" w:color="000000"/>
-                <w:right w:val="none" w:sz="0" w:space="0" w:color="000000"/>
-              </w:pBdr>
-              <w:spacing w:after="100" w:before="100" w:line="240"/>
-              <w:ind w:left="100" w:right="100" w:firstLine="0" w:firstLineChars="0"/>
-              <w:rPr>
-                <w:rFonts w:ascii="Helvetica" w:hAnsi="Helvetica" w:eastAsia="Helvetica" w:cs="Helvetica"/>
-                <w:i w:val="false"/>
-                <w:b w:val="false"/>
-                <w:u w:val="none"/>
-                <w:sz w:val="22"/>
-                <w:szCs w:val="22"/>
-                <w:color w:val="000000"/>
-              </w:rPr>
-            </w:pPr>
-            <w:r>
-              <w:rPr>
-                <w:rFonts w:ascii="Helvetica" w:hAnsi="Helvetica" w:eastAsia="Helvetica" w:cs="Helvetica"/>
-                <w:i w:val="false"/>
-                <w:b w:val="false"/>
-                <w:u w:val="none"/>
-                <w:sz w:val="22"/>
-                <w:szCs w:val="22"/>
-                <w:color w:val="000000"/>
-              </w:rPr>
-              <w:t xml:space="preserve"/>
-            </w:r>
-          </w:p>
-        </w:tc>
-        <w:tc>
-          <w:tcPr>
-            <w:tcBorders>
-              <w:bottom w:val="none" w:sz="0" w:space="0" w:color="000000"/>
-              <w:top w:val="none" w:sz="0" w:space="0" w:color="000000"/>
-              <w:left w:val="none" w:sz="0" w:space="0" w:color="000000"/>
-              <w:right w:val="none" w:sz="0" w:space="0" w:color="000000"/>
-            </w:tcBorders>
-            <w:shd w:val="clear" w:color="auto" w:fill="FFFFFF"/>
-            <w:tcMar>
-              <w:top w:w="0" w:type="dxa"/>
-              <w:bottom w:w="0" w:type="dxa"/>
-              <w:left w:w="0" w:type="dxa"/>
-              <w:right w:w="0" w:type="dxa"/>
-            </w:tcMar>
-            <w:vAlign w:val="top"/>
-          </w:tcPr>
-          <w:p>
-            <w:pPr>
-              <w:pStyle w:val="Normal"/>
-              <w:jc w:val="center"/>
-              <w:pBdr>
-                <w:bottom w:val="none" w:sz="0" w:space="0" w:color="000000"/>
-                <w:top w:val="none" w:sz="0" w:space="0" w:color="000000"/>
-                <w:left w:val="none" w:sz="0" w:space="0" w:color="000000"/>
-                <w:right w:val="none" w:sz="0" w:space="0" w:color="000000"/>
-              </w:pBdr>
-              <w:spacing w:after="100" w:before="100" w:line="240"/>
-              <w:ind w:left="100" w:right="100" w:firstLine="0" w:firstLineChars="0"/>
-              <w:rPr>
-                <w:rFonts w:ascii="Helvetica" w:hAnsi="Helvetica" w:eastAsia="Helvetica" w:cs="Helvetica"/>
-                <w:i w:val="false"/>
-                <w:b w:val="false"/>
-                <w:u w:val="none"/>
-                <w:sz w:val="22"/>
-                <w:szCs w:val="22"/>
-                <w:color w:val="000000"/>
-              </w:rPr>
-            </w:pPr>
-            <w:r>
-              <w:rPr>
-                <w:rFonts w:ascii="Helvetica" w:hAnsi="Helvetica" w:eastAsia="Helvetica" w:cs="Helvetica"/>
-                <w:i w:val="false"/>
-                <w:b w:val="false"/>
-                <w:u w:val="none"/>
-                <w:sz w:val="22"/>
-                <w:szCs w:val="22"/>
-                <w:color w:val="000000"/>
-              </w:rPr>
-              <w:t xml:space="preserve"/>
-            </w:r>
-          </w:p>
-        </w:tc>
-        <w:tc>
-          <w:tcPr>
-            <w:tcBorders>
-              <w:bottom w:val="none" w:sz="0" w:space="0" w:color="000000"/>
-              <w:top w:val="none" w:sz="0" w:space="0" w:color="000000"/>
-              <w:left w:val="none" w:sz="0" w:space="0" w:color="000000"/>
-              <w:right w:val="none" w:sz="0" w:space="0" w:color="000000"/>
-            </w:tcBorders>
-            <w:shd w:val="clear" w:color="auto" w:fill="FFFFFF"/>
-            <w:tcMar>
-              <w:top w:w="0" w:type="dxa"/>
-              <w:bottom w:w="0" w:type="dxa"/>
-              <w:left w:w="0" w:type="dxa"/>
-              <w:right w:w="0" w:type="dxa"/>
-            </w:tcMar>
-            <w:vAlign w:val="top"/>
-          </w:tcPr>
-          <w:p>
-            <w:pPr>
-              <w:pStyle w:val="Normal"/>
-              <w:jc w:val="center"/>
-              <w:pBdr>
-                <w:bottom w:val="none" w:sz="0" w:space="0" w:color="000000"/>
-                <w:top w:val="none" w:sz="0" w:space="0" w:color="000000"/>
-                <w:left w:val="none" w:sz="0" w:space="0" w:color="000000"/>
-                <w:right w:val="none" w:sz="0" w:space="0" w:color="000000"/>
-              </w:pBdr>
-              <w:spacing w:after="100" w:before="100" w:line="240"/>
-              <w:ind w:left="100" w:right="100" w:firstLine="0" w:firstLineChars="0"/>
-              <w:rPr>
-                <w:rFonts w:ascii="Helvetica" w:hAnsi="Helvetica" w:eastAsia="Helvetica" w:cs="Helvetica"/>
-                <w:i w:val="false"/>
-                <w:b w:val="false"/>
-                <w:u w:val="none"/>
-                <w:sz w:val="22"/>
-                <w:szCs w:val="22"/>
-                <w:color w:val="000000"/>
-              </w:rPr>
-            </w:pPr>
-            <w:r>
-              <w:rPr>
-                <w:rFonts w:ascii="Helvetica" w:hAnsi="Helvetica" w:eastAsia="Helvetica" w:cs="Helvetica"/>
-                <w:i w:val="false"/>
-                <w:b w:val="false"/>
-                <w:u w:val="none"/>
-                <w:sz w:val="22"/>
-                <w:szCs w:val="22"/>
-                <w:color w:val="000000"/>
-              </w:rPr>
-              <w:t xml:space="preserve"/>
-            </w:r>
-          </w:p>
-        </w:tc>
-        <w:tc>
-          <w:tcPr>
-            <w:tcBorders>
-              <w:bottom w:val="none" w:sz="0" w:space="0" w:color="000000"/>
-              <w:top w:val="none" w:sz="0" w:space="0" w:color="000000"/>
-              <w:left w:val="none" w:sz="0" w:space="0" w:color="000000"/>
-              <w:right w:val="none" w:sz="0" w:space="0" w:color="000000"/>
-            </w:tcBorders>
-            <w:shd w:val="clear" w:color="auto" w:fill="FFFFFF"/>
-            <w:tcMar>
-              <w:top w:w="0" w:type="dxa"/>
-              <w:bottom w:w="0" w:type="dxa"/>
-              <w:left w:w="0" w:type="dxa"/>
-              <w:right w:w="0" w:type="dxa"/>
-            </w:tcMar>
-            <w:vAlign w:val="top"/>
-          </w:tcPr>
-          <w:p>
-            <w:pPr>
-              <w:pStyle w:val="Normal"/>
-              <w:jc w:val="center"/>
-              <w:pBdr>
-                <w:bottom w:val="none" w:sz="0" w:space="0" w:color="000000"/>
-                <w:top w:val="none" w:sz="0" w:space="0" w:color="000000"/>
-                <w:left w:val="none" w:sz="0" w:space="0" w:color="000000"/>
-                <w:right w:val="none" w:sz="0" w:space="0" w:color="000000"/>
-              </w:pBdr>
-              <w:spacing w:after="100" w:before="100" w:line="240"/>
-              <w:ind w:left="100" w:right="100" w:firstLine="0" w:firstLineChars="0"/>
-              <w:rPr>
-                <w:rFonts w:ascii="Helvetica" w:hAnsi="Helvetica" w:eastAsia="Helvetica" w:cs="Helvetica"/>
-                <w:i w:val="false"/>
-                <w:b w:val="false"/>
-                <w:u w:val="none"/>
-                <w:sz w:val="22"/>
-                <w:szCs w:val="22"/>
-                <w:color w:val="000000"/>
-              </w:rPr>
-            </w:pPr>
-            <w:r>
-              <w:rPr>
-                <w:rFonts w:ascii="Helvetica" w:hAnsi="Helvetica" w:eastAsia="Helvetica" w:cs="Helvetica"/>
-                <w:i w:val="false"/>
-                <w:b w:val="false"/>
-                <w:u w:val="none"/>
-                <w:sz w:val="22"/>
-                <w:szCs w:val="22"/>
-                <w:color w:val="000000"/>
-              </w:rPr>
-              <w:t xml:space="preserve">121</w:t>
-            </w:r>
-          </w:p>
-        </w:tc>
-        <w:tc>
-          <w:tcPr>
-            <w:tcBorders>
-              <w:bottom w:val="none" w:sz="0" w:space="0" w:color="000000"/>
-              <w:top w:val="none" w:sz="0" w:space="0" w:color="000000"/>
-              <w:left w:val="none" w:sz="0" w:space="0" w:color="000000"/>
-              <w:right w:val="none" w:sz="0" w:space="0" w:color="000000"/>
-            </w:tcBorders>
-            <w:shd w:val="clear" w:color="auto" w:fill="FFFFFF"/>
-            <w:tcMar>
-              <w:top w:w="0" w:type="dxa"/>
-              <w:bottom w:w="0" w:type="dxa"/>
-              <w:left w:w="0" w:type="dxa"/>
-              <w:right w:w="0" w:type="dxa"/>
-            </w:tcMar>
-            <w:vAlign w:val="top"/>
-          </w:tcPr>
-          <w:p>
-            <w:pPr>
-              <w:pStyle w:val="Normal"/>
-              <w:jc w:val="center"/>
-              <w:pBdr>
-                <w:bottom w:val="none" w:sz="0" w:space="0" w:color="000000"/>
-                <w:top w:val="none" w:sz="0" w:space="0" w:color="000000"/>
-                <w:left w:val="none" w:sz="0" w:space="0" w:color="000000"/>
-                <w:right w:val="none" w:sz="0" w:space="0" w:color="000000"/>
-              </w:pBdr>
-              <w:spacing w:after="100" w:before="100" w:line="240"/>
-              <w:ind w:left="100" w:right="100" w:firstLine="0" w:firstLineChars="0"/>
-              <w:rPr>
-                <w:rFonts w:ascii="Helvetica" w:hAnsi="Helvetica" w:eastAsia="Helvetica" w:cs="Helvetica"/>
-                <w:i w:val="false"/>
-                <w:b w:val="false"/>
-                <w:u w:val="none"/>
-                <w:sz w:val="22"/>
-                <w:szCs w:val="22"/>
-                <w:color w:val="000000"/>
-              </w:rPr>
-            </w:pPr>
-            <w:r>
-              <w:rPr>
-                <w:rFonts w:ascii="Helvetica" w:hAnsi="Helvetica" w:eastAsia="Helvetica" w:cs="Helvetica"/>
-                <w:i w:val="false"/>
-                <w:b w:val="false"/>
-                <w:u w:val="none"/>
-                <w:sz w:val="22"/>
-                <w:szCs w:val="22"/>
-                <w:color w:val="000000"/>
-              </w:rPr>
-              <w:t xml:space="preserve"/>
-            </w:r>
-          </w:p>
-        </w:tc>
-        <w:tc>
-          <w:tcPr>
-            <w:tcBorders>
-              <w:bottom w:val="none" w:sz="0" w:space="0" w:color="000000"/>
-              <w:top w:val="none" w:sz="0" w:space="0" w:color="000000"/>
-              <w:left w:val="none" w:sz="0" w:space="0" w:color="000000"/>
-              <w:right w:val="none" w:sz="0" w:space="0" w:color="000000"/>
-            </w:tcBorders>
-            <w:shd w:val="clear" w:color="auto" w:fill="FFFFFF"/>
-            <w:tcMar>
-              <w:top w:w="0" w:type="dxa"/>
-              <w:bottom w:w="0" w:type="dxa"/>
-              <w:left w:w="0" w:type="dxa"/>
-              <w:right w:w="0" w:type="dxa"/>
-            </w:tcMar>
-            <w:vAlign w:val="top"/>
-          </w:tcPr>
-          <w:p>
-            <w:pPr>
-              <w:pStyle w:val="Normal"/>
-              <w:jc w:val="center"/>
-              <w:pBdr>
-                <w:bottom w:val="none" w:sz="0" w:space="0" w:color="000000"/>
-                <w:top w:val="none" w:sz="0" w:space="0" w:color="000000"/>
-                <w:left w:val="none" w:sz="0" w:space="0" w:color="000000"/>
-                <w:right w:val="none" w:sz="0" w:space="0" w:color="000000"/>
-              </w:pBdr>
-              <w:spacing w:after="100" w:before="100" w:line="240"/>
-              <w:ind w:left="100" w:right="100" w:firstLine="0" w:firstLineChars="0"/>
-              <w:rPr>
-                <w:rFonts w:ascii="Helvetica" w:hAnsi="Helvetica" w:eastAsia="Helvetica" w:cs="Helvetica"/>
-                <w:i w:val="false"/>
-                <w:b w:val="false"/>
-                <w:u w:val="none"/>
-                <w:sz w:val="22"/>
-                <w:szCs w:val="22"/>
-                <w:color w:val="000000"/>
-              </w:rPr>
-            </w:pPr>
-            <w:r>
-              <w:rPr>
-                <w:rFonts w:ascii="Helvetica" w:hAnsi="Helvetica" w:eastAsia="Helvetica" w:cs="Helvetica"/>
-                <w:i w:val="false"/>
-                <w:b w:val="false"/>
-                <w:u w:val="none"/>
-                <w:sz w:val="22"/>
-                <w:szCs w:val="22"/>
-                <w:color w:val="000000"/>
-              </w:rPr>
-              <w:t xml:space="preserve"/>
-            </w:r>
-          </w:p>
-        </w:tc>
-        <w:tc>
-          <w:tcPr>
-            <w:tcBorders>
-              <w:bottom w:val="none" w:sz="0" w:space="0" w:color="000000"/>
-              <w:top w:val="none" w:sz="0" w:space="0" w:color="000000"/>
-              <w:left w:val="none" w:sz="0" w:space="0" w:color="000000"/>
-              <w:right w:val="none" w:sz="0" w:space="0" w:color="000000"/>
-            </w:tcBorders>
-            <w:shd w:val="clear" w:color="auto" w:fill="FFFFFF"/>
-            <w:tcMar>
-              <w:top w:w="0" w:type="dxa"/>
-              <w:bottom w:w="0" w:type="dxa"/>
-              <w:left w:w="0" w:type="dxa"/>
-              <w:right w:w="0" w:type="dxa"/>
-            </w:tcMar>
-            <w:vAlign w:val="top"/>
-          </w:tcPr>
-          <w:p>
-            <w:pPr>
-              <w:pStyle w:val="Normal"/>
-              <w:jc w:val="center"/>
-              <w:pBdr>
-                <w:bottom w:val="none" w:sz="0" w:space="0" w:color="000000"/>
-                <w:top w:val="none" w:sz="0" w:space="0" w:color="000000"/>
-                <w:left w:val="none" w:sz="0" w:space="0" w:color="000000"/>
-                <w:right w:val="none" w:sz="0" w:space="0" w:color="000000"/>
-              </w:pBdr>
-              <w:spacing w:after="100" w:before="100" w:line="240"/>
-              <w:ind w:left="100" w:right="100" w:firstLine="0" w:firstLineChars="0"/>
-              <w:rPr>
-                <w:rFonts w:ascii="Helvetica" w:hAnsi="Helvetica" w:eastAsia="Helvetica" w:cs="Helvetica"/>
-                <w:i w:val="false"/>
-                <w:b w:val="false"/>
-                <w:u w:val="none"/>
-                <w:sz w:val="22"/>
-                <w:szCs w:val="22"/>
-                <w:color w:val="000000"/>
-              </w:rPr>
-            </w:pPr>
-            <w:r>
-              <w:rPr>
-                <w:rFonts w:ascii="Helvetica" w:hAnsi="Helvetica" w:eastAsia="Helvetica" w:cs="Helvetica"/>
-                <w:i w:val="false"/>
-                <w:b w:val="false"/>
-                <w:u w:val="none"/>
-                <w:sz w:val="22"/>
-                <w:szCs w:val="22"/>
-                <w:color w:val="000000"/>
-              </w:rPr>
-              <w:t xml:space="preserve"/>
-            </w:r>
-          </w:p>
-        </w:tc>
-      </w:tr>
-      <w:tr>
-        <w:trPr>
-          <w:trHeight w:val="569" w:hRule="auto"/>
-        </w:trPr>
-        body 7
-        <w:tc>
-          <w:tcPr>
-            <w:tcBorders>
-              <w:bottom w:val="none" w:sz="0" w:space="0" w:color="000000"/>
-              <w:top w:val="none" w:sz="0" w:space="0" w:color="000000"/>
-              <w:left w:val="none" w:sz="0" w:space="0" w:color="000000"/>
-              <w:right w:val="none" w:sz="0" w:space="0" w:color="000000"/>
-            </w:tcBorders>
-            <w:shd w:val="clear" w:color="auto" w:fill="FFFFFF"/>
-            <w:tcMar>
-              <w:top w:w="0" w:type="dxa"/>
-              <w:bottom w:w="0" w:type="dxa"/>
-              <w:left w:w="0" w:type="dxa"/>
-              <w:right w:w="0" w:type="dxa"/>
-            </w:tcMar>
-            <w:vAlign w:val="top"/>
-          </w:tcPr>
-          <w:p>
-            <w:pPr>
-              <w:pStyle w:val="Normal"/>
-              <w:jc w:val="left"/>
-              <w:pBdr>
-                <w:bottom w:val="none" w:sz="0" w:space="0" w:color="000000"/>
-                <w:top w:val="none" w:sz="0" w:space="0" w:color="000000"/>
-                <w:left w:val="none" w:sz="0" w:space="0" w:color="000000"/>
-                <w:right w:val="none" w:sz="0" w:space="0" w:color="000000"/>
-              </w:pBdr>
-              <w:spacing w:after="100" w:before="100" w:line="240"/>
-              <w:ind w:left="300" w:right="100" w:firstLine="0" w:firstLineChars="0"/>
-              <w:rPr>
-                <w:rFonts w:ascii="Helvetica" w:hAnsi="Helvetica" w:eastAsia="Helvetica" w:cs="Helvetica"/>
-                <w:i w:val="false"/>
-                <w:b w:val="false"/>
-                <w:u w:val="none"/>
-                <w:sz w:val="22"/>
-                <w:szCs w:val="22"/>
-                <w:color w:val="000000"/>
-              </w:rPr>
-            </w:pPr>
-            <w:r>
-              <w:rPr>
-                <w:rFonts w:ascii="Helvetica" w:hAnsi="Helvetica" w:eastAsia="Helvetica" w:cs="Helvetica"/>
-                <w:i w:val="false"/>
-                <w:b w:val="false"/>
-                <w:u w:val="none"/>
-                <w:sz w:val="22"/>
-                <w:szCs w:val="22"/>
-                <w:color w:val="000000"/>
-              </w:rPr>
-              <w:t xml:space="preserve">0</w:t>
-            </w:r>
-          </w:p>
-        </w:tc>
-        <w:tc>
-          <w:tcPr>
-            <w:tcBorders>
-              <w:bottom w:val="none" w:sz="0" w:space="0" w:color="000000"/>
-              <w:top w:val="none" w:sz="0" w:space="0" w:color="000000"/>
-              <w:left w:val="none" w:sz="0" w:space="0" w:color="000000"/>
-              <w:right w:val="none" w:sz="0" w:space="0" w:color="000000"/>
-            </w:tcBorders>
-            <w:shd w:val="clear" w:color="auto" w:fill="FFFFFF"/>
-            <w:tcMar>
-              <w:top w:w="0" w:type="dxa"/>
-              <w:bottom w:w="0" w:type="dxa"/>
-              <w:left w:w="0" w:type="dxa"/>
-              <w:right w:w="0" w:type="dxa"/>
-            </w:tcMar>
-            <w:vAlign w:val="top"/>
-          </w:tcPr>
-          <w:p>
-            <w:pPr>
-              <w:pStyle w:val="Normal"/>
-              <w:jc w:val="center"/>
-              <w:pBdr>
-                <w:bottom w:val="none" w:sz="0" w:space="0" w:color="000000"/>
-                <w:top w:val="none" w:sz="0" w:space="0" w:color="000000"/>
-                <w:left w:val="none" w:sz="0" w:space="0" w:color="000000"/>
-                <w:right w:val="none" w:sz="0" w:space="0" w:color="000000"/>
-              </w:pBdr>
-              <w:spacing w:after="100" w:before="100" w:line="240"/>
-              <w:ind w:left="100" w:right="100" w:firstLine="0" w:firstLineChars="0"/>
-              <w:rPr>
-                <w:rFonts w:ascii="Helvetica" w:hAnsi="Helvetica" w:eastAsia="Helvetica" w:cs="Helvetica"/>
-                <w:i w:val="false"/>
-                <w:b w:val="false"/>
-                <w:u w:val="none"/>
-                <w:sz w:val="22"/>
-                <w:szCs w:val="22"/>
-                <w:color w:val="000000"/>
-              </w:rPr>
-            </w:pPr>
-            <w:r>
-              <w:rPr>
-                <w:rFonts w:ascii="Helvetica" w:hAnsi="Helvetica" w:eastAsia="Helvetica" w:cs="Helvetica"/>
-                <w:i w:val="false"/>
-                <w:b w:val="false"/>
-                <w:u w:val="none"/>
-                <w:sz w:val="22"/>
-                <w:szCs w:val="22"/>
-                <w:color w:val="000000"/>
-              </w:rPr>
-              <w:t xml:space="preserve"/>
-            </w:r>
-          </w:p>
-        </w:tc>
-        <w:tc>
-          <w:tcPr>
-            <w:tcBorders>
-              <w:bottom w:val="none" w:sz="0" w:space="0" w:color="000000"/>
-              <w:top w:val="none" w:sz="0" w:space="0" w:color="000000"/>
-              <w:left w:val="none" w:sz="0" w:space="0" w:color="000000"/>
-              <w:right w:val="none" w:sz="0" w:space="0" w:color="000000"/>
-            </w:tcBorders>
-            <w:shd w:val="clear" w:color="auto" w:fill="FFFFFF"/>
-            <w:tcMar>
-              <w:top w:w="0" w:type="dxa"/>
-              <w:bottom w:w="0" w:type="dxa"/>
-              <w:left w:w="0" w:type="dxa"/>
-              <w:right w:w="0" w:type="dxa"/>
-            </w:tcMar>
-            <w:vAlign w:val="top"/>
-          </w:tcPr>
-          <w:p>
-            <w:pPr>
-              <w:pStyle w:val="Normal"/>
-              <w:jc w:val="center"/>
-              <w:pBdr>
-                <w:bottom w:val="none" w:sz="0" w:space="0" w:color="000000"/>
-                <w:top w:val="none" w:sz="0" w:space="0" w:color="000000"/>
-                <w:left w:val="none" w:sz="0" w:space="0" w:color="000000"/>
-                <w:right w:val="none" w:sz="0" w:space="0" w:color="000000"/>
-              </w:pBdr>
-              <w:spacing w:after="100" w:before="100" w:line="240"/>
-              <w:ind w:left="100" w:right="100" w:firstLine="0" w:firstLineChars="0"/>
-              <w:rPr>
-                <w:rFonts w:ascii="Helvetica" w:hAnsi="Helvetica" w:eastAsia="Helvetica" w:cs="Helvetica"/>
-                <w:i w:val="false"/>
-                <w:b w:val="false"/>
-                <w:u w:val="none"/>
-                <w:sz w:val="22"/>
-                <w:szCs w:val="22"/>
-                <w:color w:val="000000"/>
-              </w:rPr>
-            </w:pPr>
-            <w:r>
-              <w:rPr>
-                <w:rFonts w:ascii="Helvetica" w:hAnsi="Helvetica" w:eastAsia="Helvetica" w:cs="Helvetica"/>
-                <w:i w:val="false"/>
-                <w:b w:val="false"/>
-                <w:u w:val="none"/>
-                <w:sz w:val="22"/>
-                <w:szCs w:val="22"/>
-                <w:color w:val="000000"/>
-              </w:rPr>
-              <w:t xml:space="preserve">—</w:t>
-            </w:r>
-          </w:p>
-        </w:tc>
-        <w:tc>
-          <w:tcPr>
-            <w:tcBorders>
-              <w:bottom w:val="none" w:sz="0" w:space="0" w:color="000000"/>
-              <w:top w:val="none" w:sz="0" w:space="0" w:color="000000"/>
-              <w:left w:val="none" w:sz="0" w:space="0" w:color="000000"/>
-              <w:right w:val="none" w:sz="0" w:space="0" w:color="000000"/>
-            </w:tcBorders>
-            <w:shd w:val="clear" w:color="auto" w:fill="FFFFFF"/>
-            <w:tcMar>
-              <w:top w:w="0" w:type="dxa"/>
-              <w:bottom w:w="0" w:type="dxa"/>
-              <w:left w:w="0" w:type="dxa"/>
-              <w:right w:w="0" w:type="dxa"/>
-            </w:tcMar>
-            <w:vAlign w:val="top"/>
-          </w:tcPr>
-          <w:p>
-            <w:pPr>
-              <w:pStyle w:val="Normal"/>
-              <w:jc w:val="center"/>
-              <w:pBdr>
-                <w:bottom w:val="none" w:sz="0" w:space="0" w:color="000000"/>
-                <w:top w:val="none" w:sz="0" w:space="0" w:color="000000"/>
-                <w:left w:val="none" w:sz="0" w:space="0" w:color="000000"/>
-                <w:right w:val="none" w:sz="0" w:space="0" w:color="000000"/>
-              </w:pBdr>
-              <w:spacing w:after="100" w:before="100" w:line="240"/>
-              <w:ind w:left="100" w:right="100" w:firstLine="0" w:firstLineChars="0"/>
-              <w:rPr>
-                <w:rFonts w:ascii="Helvetica" w:hAnsi="Helvetica" w:eastAsia="Helvetica" w:cs="Helvetica"/>
-                <w:i w:val="false"/>
-                <w:b w:val="false"/>
-                <w:u w:val="none"/>
-                <w:sz w:val="22"/>
-                <w:szCs w:val="22"/>
-                <w:color w:val="000000"/>
-              </w:rPr>
-            </w:pPr>
-            <w:r>
-              <w:rPr>
-                <w:rFonts w:ascii="Helvetica" w:hAnsi="Helvetica" w:eastAsia="Helvetica" w:cs="Helvetica"/>
-                <w:i w:val="false"/>
-                <w:b w:val="false"/>
-                <w:u w:val="none"/>
-                <w:sz w:val="22"/>
-                <w:szCs w:val="22"/>
-                <w:color w:val="000000"/>
-              </w:rPr>
-              <w:t xml:space="preserve">—</w:t>
-            </w:r>
-          </w:p>
-        </w:tc>
-        <w:tc>
-          <w:tcPr>
-            <w:tcBorders>
-              <w:bottom w:val="none" w:sz="0" w:space="0" w:color="000000"/>
-              <w:top w:val="none" w:sz="0" w:space="0" w:color="000000"/>
-              <w:left w:val="none" w:sz="0" w:space="0" w:color="000000"/>
-              <w:right w:val="none" w:sz="0" w:space="0" w:color="000000"/>
-            </w:tcBorders>
-            <w:shd w:val="clear" w:color="auto" w:fill="FFFFFF"/>
-            <w:tcMar>
-              <w:top w:w="0" w:type="dxa"/>
-              <w:bottom w:w="0" w:type="dxa"/>
-              <w:left w:w="0" w:type="dxa"/>
-              <w:right w:w="0" w:type="dxa"/>
-            </w:tcMar>
-            <w:vAlign w:val="top"/>
-          </w:tcPr>
-          <w:p>
-            <w:pPr>
-              <w:pStyle w:val="Normal"/>
-              <w:jc w:val="center"/>
-              <w:pBdr>
-                <w:bottom w:val="none" w:sz="0" w:space="0" w:color="000000"/>
-                <w:top w:val="none" w:sz="0" w:space="0" w:color="000000"/>
-                <w:left w:val="none" w:sz="0" w:space="0" w:color="000000"/>
-                <w:right w:val="none" w:sz="0" w:space="0" w:color="000000"/>
-              </w:pBdr>
-              <w:spacing w:after="100" w:before="100" w:line="240"/>
-              <w:ind w:left="100" w:right="100" w:firstLine="0" w:firstLineChars="0"/>
-              <w:rPr>
-                <w:rFonts w:ascii="Helvetica" w:hAnsi="Helvetica" w:eastAsia="Helvetica" w:cs="Helvetica"/>
-                <w:i w:val="false"/>
-                <w:b w:val="false"/>
-                <w:u w:val="none"/>
-                <w:sz w:val="22"/>
-                <w:szCs w:val="22"/>
-                <w:color w:val="000000"/>
-              </w:rPr>
-            </w:pPr>
-            <w:r>
-              <w:rPr>
-                <w:rFonts w:ascii="Helvetica" w:hAnsi="Helvetica" w:eastAsia="Helvetica" w:cs="Helvetica"/>
-                <w:i w:val="false"/>
-                <w:b w:val="false"/>
-                <w:u w:val="none"/>
-                <w:sz w:val="22"/>
-                <w:szCs w:val="22"/>
-                <w:color w:val="000000"/>
-              </w:rPr>
-              <w:t xml:space="preserve"/>
-            </w:r>
-          </w:p>
-        </w:tc>
-        <w:tc>
-          <w:tcPr>
-            <w:tcBorders>
-              <w:bottom w:val="none" w:sz="0" w:space="0" w:color="000000"/>
-              <w:top w:val="none" w:sz="0" w:space="0" w:color="000000"/>
-              <w:left w:val="none" w:sz="0" w:space="0" w:color="000000"/>
-              <w:right w:val="none" w:sz="0" w:space="0" w:color="000000"/>
-            </w:tcBorders>
-            <w:shd w:val="clear" w:color="auto" w:fill="FFFFFF"/>
-            <w:tcMar>
-              <w:top w:w="0" w:type="dxa"/>
-              <w:bottom w:w="0" w:type="dxa"/>
-              <w:left w:w="0" w:type="dxa"/>
-              <w:right w:w="0" w:type="dxa"/>
-            </w:tcMar>
-            <w:vAlign w:val="top"/>
-          </w:tcPr>
-          <w:p>
-            <w:pPr>
-              <w:pStyle w:val="Normal"/>
-              <w:jc w:val="center"/>
-              <w:pBdr>
-                <w:bottom w:val="none" w:sz="0" w:space="0" w:color="000000"/>
-                <w:top w:val="none" w:sz="0" w:space="0" w:color="000000"/>
-                <w:left w:val="none" w:sz="0" w:space="0" w:color="000000"/>
-                <w:right w:val="none" w:sz="0" w:space="0" w:color="000000"/>
-              </w:pBdr>
-              <w:spacing w:after="100" w:before="100" w:line="240"/>
-              <w:ind w:left="100" w:right="100" w:firstLine="0" w:firstLineChars="0"/>
-              <w:rPr>
-                <w:rFonts w:ascii="Helvetica" w:hAnsi="Helvetica" w:eastAsia="Helvetica" w:cs="Helvetica"/>
-                <w:i w:val="false"/>
-                <w:b w:val="false"/>
-                <w:u w:val="none"/>
-                <w:sz w:val="22"/>
-                <w:szCs w:val="22"/>
-                <w:color w:val="000000"/>
-              </w:rPr>
-            </w:pPr>
-            <w:r>
-              <w:rPr>
-                <w:rFonts w:ascii="Helvetica" w:hAnsi="Helvetica" w:eastAsia="Helvetica" w:cs="Helvetica"/>
-                <w:i w:val="false"/>
-                <w:b w:val="false"/>
-                <w:u w:val="none"/>
-                <w:sz w:val="22"/>
-                <w:szCs w:val="22"/>
-                <w:color w:val="000000"/>
-              </w:rPr>
-              <w:t xml:space="preserve"/>
-            </w:r>
-          </w:p>
-        </w:tc>
-        <w:tc>
-          <w:tcPr>
-            <w:tcBorders>
-              <w:bottom w:val="none" w:sz="0" w:space="0" w:color="000000"/>
-              <w:top w:val="none" w:sz="0" w:space="0" w:color="000000"/>
-              <w:left w:val="none" w:sz="0" w:space="0" w:color="000000"/>
-              <w:right w:val="none" w:sz="0" w:space="0" w:color="000000"/>
-            </w:tcBorders>
-            <w:shd w:val="clear" w:color="auto" w:fill="FFFFFF"/>
-            <w:tcMar>
-              <w:top w:w="0" w:type="dxa"/>
-              <w:bottom w:w="0" w:type="dxa"/>
-              <w:left w:w="0" w:type="dxa"/>
-              <w:right w:w="0" w:type="dxa"/>
-            </w:tcMar>
-            <w:vAlign w:val="top"/>
-          </w:tcPr>
-          <w:p>
-            <w:pPr>
-              <w:pStyle w:val="Normal"/>
-              <w:jc w:val="center"/>
-              <w:pBdr>
-                <w:bottom w:val="none" w:sz="0" w:space="0" w:color="000000"/>
-                <w:top w:val="none" w:sz="0" w:space="0" w:color="000000"/>
-                <w:left w:val="none" w:sz="0" w:space="0" w:color="000000"/>
-                <w:right w:val="none" w:sz="0" w:space="0" w:color="000000"/>
-              </w:pBdr>
-              <w:spacing w:after="100" w:before="100" w:line="240"/>
-              <w:ind w:left="100" w:right="100" w:firstLine="0" w:firstLineChars="0"/>
-              <w:rPr>
-                <w:rFonts w:ascii="Helvetica" w:hAnsi="Helvetica" w:eastAsia="Helvetica" w:cs="Helvetica"/>
-                <w:i w:val="false"/>
-                <w:b w:val="false"/>
-                <w:u w:val="none"/>
-                <w:sz w:val="22"/>
-                <w:szCs w:val="22"/>
-                <w:color w:val="000000"/>
-              </w:rPr>
-            </w:pPr>
-            <w:r>
-              <w:rPr>
-                <w:rFonts w:ascii="Helvetica" w:hAnsi="Helvetica" w:eastAsia="Helvetica" w:cs="Helvetica"/>
-                <w:i w:val="false"/>
-                <w:b w:val="false"/>
-                <w:u w:val="none"/>
-                <w:sz w:val="22"/>
-                <w:szCs w:val="22"/>
-                <w:color w:val="000000"/>
-              </w:rPr>
-              <w:t xml:space="preserve">—</w:t>
-            </w:r>
-          </w:p>
-        </w:tc>
-        <w:tc>
-          <w:tcPr>
-            <w:tcBorders>
-              <w:bottom w:val="none" w:sz="0" w:space="0" w:color="000000"/>
-              <w:top w:val="none" w:sz="0" w:space="0" w:color="000000"/>
-              <w:left w:val="none" w:sz="0" w:space="0" w:color="000000"/>
-              <w:right w:val="none" w:sz="0" w:space="0" w:color="000000"/>
-            </w:tcBorders>
-            <w:shd w:val="clear" w:color="auto" w:fill="FFFFFF"/>
-            <w:tcMar>
-              <w:top w:w="0" w:type="dxa"/>
-              <w:bottom w:w="0" w:type="dxa"/>
-              <w:left w:w="0" w:type="dxa"/>
-              <w:right w:w="0" w:type="dxa"/>
-            </w:tcMar>
-            <w:vAlign w:val="top"/>
-          </w:tcPr>
-          <w:p>
-            <w:pPr>
-              <w:pStyle w:val="Normal"/>
-              <w:jc w:val="center"/>
-              <w:pBdr>
-                <w:bottom w:val="none" w:sz="0" w:space="0" w:color="000000"/>
-                <w:top w:val="none" w:sz="0" w:space="0" w:color="000000"/>
-                <w:left w:val="none" w:sz="0" w:space="0" w:color="000000"/>
-                <w:right w:val="none" w:sz="0" w:space="0" w:color="000000"/>
-              </w:pBdr>
-              <w:spacing w:after="100" w:before="100" w:line="240"/>
-              <w:ind w:left="100" w:right="100" w:firstLine="0" w:firstLineChars="0"/>
-              <w:rPr>
-                <w:rFonts w:ascii="Helvetica" w:hAnsi="Helvetica" w:eastAsia="Helvetica" w:cs="Helvetica"/>
-                <w:i w:val="false"/>
-                <w:b w:val="false"/>
-                <w:u w:val="none"/>
-                <w:sz w:val="22"/>
-                <w:szCs w:val="22"/>
-                <w:color w:val="000000"/>
-              </w:rPr>
-            </w:pPr>
-            <w:r>
-              <w:rPr>
-                <w:rFonts w:ascii="Helvetica" w:hAnsi="Helvetica" w:eastAsia="Helvetica" w:cs="Helvetica"/>
-                <w:i w:val="false"/>
-                <w:b w:val="false"/>
-                <w:u w:val="none"/>
-                <w:sz w:val="22"/>
-                <w:szCs w:val="22"/>
-                <w:color w:val="000000"/>
-              </w:rPr>
-              <w:t xml:space="preserve">—</w:t>
-            </w:r>
-          </w:p>
-        </w:tc>
-        <w:tc>
-          <w:tcPr>
-            <w:tcBorders>
-              <w:bottom w:val="none" w:sz="0" w:space="0" w:color="000000"/>
-              <w:top w:val="none" w:sz="0" w:space="0" w:color="000000"/>
-              <w:left w:val="none" w:sz="0" w:space="0" w:color="000000"/>
-              <w:right w:val="none" w:sz="0" w:space="0" w:color="000000"/>
-            </w:tcBorders>
-            <w:shd w:val="clear" w:color="auto" w:fill="FFFFFF"/>
-            <w:tcMar>
-              <w:top w:w="0" w:type="dxa"/>
-              <w:bottom w:w="0" w:type="dxa"/>
-              <w:left w:w="0" w:type="dxa"/>
-              <w:right w:w="0" w:type="dxa"/>
-            </w:tcMar>
-            <w:vAlign w:val="top"/>
-          </w:tcPr>
-          <w:p>
-            <w:pPr>
-              <w:pStyle w:val="Normal"/>
-              <w:jc w:val="center"/>
-              <w:pBdr>
-                <w:bottom w:val="none" w:sz="0" w:space="0" w:color="000000"/>
-                <w:top w:val="none" w:sz="0" w:space="0" w:color="000000"/>
-                <w:left w:val="none" w:sz="0" w:space="0" w:color="000000"/>
-                <w:right w:val="none" w:sz="0" w:space="0" w:color="000000"/>
-              </w:pBdr>
-              <w:spacing w:after="100" w:before="100" w:line="240"/>
-              <w:ind w:left="100" w:right="100" w:firstLine="0" w:firstLineChars="0"/>
-              <w:rPr>
-                <w:rFonts w:ascii="Helvetica" w:hAnsi="Helvetica" w:eastAsia="Helvetica" w:cs="Helvetica"/>
-                <w:i w:val="false"/>
-                <w:b w:val="false"/>
-                <w:u w:val="none"/>
-                <w:sz w:val="22"/>
-                <w:szCs w:val="22"/>
-                <w:color w:val="000000"/>
-              </w:rPr>
-            </w:pPr>
-            <w:r>
-              <w:rPr>
-                <w:rFonts w:ascii="Helvetica" w:hAnsi="Helvetica" w:eastAsia="Helvetica" w:cs="Helvetica"/>
-                <w:i w:val="false"/>
-                <w:b w:val="false"/>
-                <w:u w:val="none"/>
-                <w:sz w:val="22"/>
-                <w:szCs w:val="22"/>
-                <w:color w:val="000000"/>
-              </w:rPr>
-              <w:t xml:space="preserve"/>
+              <w:t xml:space="preserve">1.70</w:t>
+            </w:r>
+          </w:p>
+        </w:tc>
+        <w:tc>
+          <w:tcPr>
+            <w:tcBorders>
+              <w:bottom w:val="none" w:sz="0" w:space="0" w:color="000000"/>
+              <w:top w:val="none" w:sz="0" w:space="0" w:color="000000"/>
+              <w:left w:val="none" w:sz="0" w:space="0" w:color="000000"/>
+              <w:right w:val="none" w:sz="0" w:space="0" w:color="000000"/>
+            </w:tcBorders>
+            <w:shd w:val="clear" w:color="auto" w:fill="FFFFFF"/>
+            <w:tcMar>
+              <w:top w:w="0" w:type="dxa"/>
+              <w:bottom w:w="0" w:type="dxa"/>
+              <w:left w:w="0" w:type="dxa"/>
+              <w:right w:w="0" w:type="dxa"/>
+            </w:tcMar>
+            <w:vAlign w:val="top"/>
+          </w:tcPr>
+          <w:p>
+            <w:pPr>
+              <w:pStyle w:val="Normal"/>
+              <w:jc w:val="center"/>
+              <w:pBdr>
+                <w:bottom w:val="none" w:sz="0" w:space="0" w:color="000000"/>
+                <w:top w:val="none" w:sz="0" w:space="0" w:color="000000"/>
+                <w:left w:val="none" w:sz="0" w:space="0" w:color="000000"/>
+                <w:right w:val="none" w:sz="0" w:space="0" w:color="000000"/>
+              </w:pBdr>
+              <w:spacing w:after="100" w:before="100" w:line="240"/>
+              <w:ind w:left="100" w:right="100" w:firstLine="0" w:firstLineChars="0"/>
+              <w:rPr>
+                <w:rFonts w:ascii="Helvetica" w:hAnsi="Helvetica" w:eastAsia="Helvetica" w:cs="Helvetica"/>
+                <w:i w:val="false"/>
+                <w:b w:val="false"/>
+                <w:u w:val="none"/>
+                <w:sz w:val="22"/>
+                <w:szCs w:val="22"/>
+                <w:color w:val="000000"/>
+              </w:rPr>
+            </w:pPr>
+            <w:r>
+              <w:rPr>
+                <w:rFonts w:ascii="Helvetica" w:hAnsi="Helvetica" w:eastAsia="Helvetica" w:cs="Helvetica"/>
+                <w:i w:val="false"/>
+                <w:b w:val="false"/>
+                <w:u w:val="none"/>
+                <w:sz w:val="22"/>
+                <w:szCs w:val="22"/>
+                <w:color w:val="000000"/>
+              </w:rPr>
+              <w:t xml:space="preserve">0.31, 9.35</w:t>
+            </w:r>
+          </w:p>
+        </w:tc>
+        <w:tc>
+          <w:tcPr>
+            <w:tcBorders>
+              <w:bottom w:val="none" w:sz="0" w:space="0" w:color="000000"/>
+              <w:top w:val="none" w:sz="0" w:space="0" w:color="000000"/>
+              <w:left w:val="none" w:sz="0" w:space="0" w:color="000000"/>
+              <w:right w:val="none" w:sz="0" w:space="0" w:color="000000"/>
+            </w:tcBorders>
+            <w:shd w:val="clear" w:color="auto" w:fill="FFFFFF"/>
+            <w:tcMar>
+              <w:top w:w="0" w:type="dxa"/>
+              <w:bottom w:w="0" w:type="dxa"/>
+              <w:left w:w="0" w:type="dxa"/>
+              <w:right w:w="0" w:type="dxa"/>
+            </w:tcMar>
+            <w:vAlign w:val="top"/>
+          </w:tcPr>
+          <w:p>
+            <w:pPr>
+              <w:pStyle w:val="Normal"/>
+              <w:jc w:val="center"/>
+              <w:pBdr>
+                <w:bottom w:val="none" w:sz="0" w:space="0" w:color="000000"/>
+                <w:top w:val="none" w:sz="0" w:space="0" w:color="000000"/>
+                <w:left w:val="none" w:sz="0" w:space="0" w:color="000000"/>
+                <w:right w:val="none" w:sz="0" w:space="0" w:color="000000"/>
+              </w:pBdr>
+              <w:spacing w:after="100" w:before="100" w:line="240"/>
+              <w:ind w:left="100" w:right="100" w:firstLine="0" w:firstLineChars="0"/>
+              <w:rPr>
+                <w:rFonts w:ascii="Helvetica" w:hAnsi="Helvetica" w:eastAsia="Helvetica" w:cs="Helvetica"/>
+                <w:i w:val="false"/>
+                <w:b w:val="false"/>
+                <w:u w:val="none"/>
+                <w:sz w:val="22"/>
+                <w:szCs w:val="22"/>
+                <w:color w:val="000000"/>
+              </w:rPr>
+            </w:pPr>
+            <w:r>
+              <w:rPr>
+                <w:rFonts w:ascii="Helvetica" w:hAnsi="Helvetica" w:eastAsia="Helvetica" w:cs="Helvetica"/>
+                <w:i w:val="false"/>
+                <w:b w:val="false"/>
+                <w:u w:val="none"/>
+                <w:sz w:val="22"/>
+                <w:szCs w:val="22"/>
+                <w:color w:val="000000"/>
+              </w:rPr>
+              <w:t xml:space="preserve">0.540</w:t>
             </w:r>
           </w:p>
         </w:tc>
@@ -4116,7 +3150,7 @@
         <w:trPr>
           <w:trHeight w:val="598" w:hRule="auto"/>
         </w:trPr>
-        body 8
+        body6
         <w:tc>
           <w:tcPr>
             <w:tcBorders>
@@ -4145,452 +3179,452 @@
                 <w:right w:val="none" w:sz="0" w:space="0" w:color="000000"/>
               </w:pBdr>
               <w:spacing w:after="100" w:before="100" w:line="240"/>
-              <w:ind w:left="300" w:right="100" w:firstLine="0" w:firstLineChars="0"/>
-              <w:rPr>
-                <w:rFonts w:ascii="Helvetica" w:hAnsi="Helvetica" w:eastAsia="Helvetica" w:cs="Helvetica"/>
-                <w:i w:val="false"/>
-                <w:b w:val="false"/>
-                <w:u w:val="none"/>
-                <w:sz w:val="22"/>
-                <w:szCs w:val="22"/>
-                <w:color w:val="000000"/>
-              </w:rPr>
-            </w:pPr>
-            <w:r>
-              <w:rPr>
-                <w:rFonts w:ascii="Helvetica" w:hAnsi="Helvetica" w:eastAsia="Helvetica" w:cs="Helvetica"/>
-                <w:i w:val="false"/>
-                <w:b w:val="false"/>
-                <w:u w:val="none"/>
-                <w:sz w:val="22"/>
-                <w:szCs w:val="22"/>
-                <w:color w:val="000000"/>
-              </w:rPr>
-              <w:t xml:space="preserve">&gt;=1</w:t>
-            </w:r>
-          </w:p>
-        </w:tc>
-        <w:tc>
-          <w:tcPr>
-            <w:tcBorders>
-              <w:bottom w:val="none" w:sz="0" w:space="0" w:color="000000"/>
-              <w:top w:val="none" w:sz="0" w:space="0" w:color="000000"/>
-              <w:left w:val="none" w:sz="0" w:space="0" w:color="000000"/>
-              <w:right w:val="none" w:sz="0" w:space="0" w:color="000000"/>
-            </w:tcBorders>
-            <w:shd w:val="clear" w:color="auto" w:fill="FFFFFF"/>
-            <w:tcMar>
-              <w:top w:w="0" w:type="dxa"/>
-              <w:bottom w:w="0" w:type="dxa"/>
-              <w:left w:w="0" w:type="dxa"/>
-              <w:right w:w="0" w:type="dxa"/>
-            </w:tcMar>
-            <w:vAlign w:val="top"/>
-          </w:tcPr>
-          <w:p>
-            <w:pPr>
-              <w:pStyle w:val="Normal"/>
-              <w:jc w:val="center"/>
-              <w:pBdr>
-                <w:bottom w:val="none" w:sz="0" w:space="0" w:color="000000"/>
-                <w:top w:val="none" w:sz="0" w:space="0" w:color="000000"/>
-                <w:left w:val="none" w:sz="0" w:space="0" w:color="000000"/>
-                <w:right w:val="none" w:sz="0" w:space="0" w:color="000000"/>
-              </w:pBdr>
-              <w:spacing w:after="100" w:before="100" w:line="240"/>
-              <w:ind w:left="100" w:right="100" w:firstLine="0" w:firstLineChars="0"/>
-              <w:rPr>
-                <w:rFonts w:ascii="Helvetica" w:hAnsi="Helvetica" w:eastAsia="Helvetica" w:cs="Helvetica"/>
-                <w:i w:val="false"/>
-                <w:b w:val="false"/>
-                <w:u w:val="none"/>
-                <w:sz w:val="22"/>
-                <w:szCs w:val="22"/>
-                <w:color w:val="000000"/>
-              </w:rPr>
-            </w:pPr>
-            <w:r>
-              <w:rPr>
-                <w:rFonts w:ascii="Helvetica" w:hAnsi="Helvetica" w:eastAsia="Helvetica" w:cs="Helvetica"/>
-                <w:i w:val="false"/>
-                <w:b w:val="false"/>
-                <w:u w:val="none"/>
-                <w:sz w:val="22"/>
-                <w:szCs w:val="22"/>
-                <w:color w:val="000000"/>
-              </w:rPr>
-              <w:t xml:space="preserve"/>
-            </w:r>
-          </w:p>
-        </w:tc>
-        <w:tc>
-          <w:tcPr>
-            <w:tcBorders>
-              <w:bottom w:val="none" w:sz="0" w:space="0" w:color="000000"/>
-              <w:top w:val="none" w:sz="0" w:space="0" w:color="000000"/>
-              <w:left w:val="none" w:sz="0" w:space="0" w:color="000000"/>
-              <w:right w:val="none" w:sz="0" w:space="0" w:color="000000"/>
-            </w:tcBorders>
-            <w:shd w:val="clear" w:color="auto" w:fill="FFFFFF"/>
-            <w:tcMar>
-              <w:top w:w="0" w:type="dxa"/>
-              <w:bottom w:w="0" w:type="dxa"/>
-              <w:left w:w="0" w:type="dxa"/>
-              <w:right w:w="0" w:type="dxa"/>
-            </w:tcMar>
-            <w:vAlign w:val="top"/>
-          </w:tcPr>
-          <w:p>
-            <w:pPr>
-              <w:pStyle w:val="Normal"/>
-              <w:jc w:val="center"/>
-              <w:pBdr>
-                <w:bottom w:val="none" w:sz="0" w:space="0" w:color="000000"/>
-                <w:top w:val="none" w:sz="0" w:space="0" w:color="000000"/>
-                <w:left w:val="none" w:sz="0" w:space="0" w:color="000000"/>
-                <w:right w:val="none" w:sz="0" w:space="0" w:color="000000"/>
-              </w:pBdr>
-              <w:spacing w:after="100" w:before="100" w:line="240"/>
-              <w:ind w:left="100" w:right="100" w:firstLine="0" w:firstLineChars="0"/>
-              <w:rPr>
-                <w:rFonts w:ascii="Helvetica" w:hAnsi="Helvetica" w:eastAsia="Helvetica" w:cs="Helvetica"/>
-                <w:i w:val="false"/>
-                <w:b w:val="false"/>
-                <w:u w:val="none"/>
-                <w:sz w:val="22"/>
-                <w:szCs w:val="22"/>
-                <w:color w:val="000000"/>
-              </w:rPr>
-            </w:pPr>
-            <w:r>
-              <w:rPr>
-                <w:rFonts w:ascii="Helvetica" w:hAnsi="Helvetica" w:eastAsia="Helvetica" w:cs="Helvetica"/>
-                <w:i w:val="false"/>
-                <w:b w:val="false"/>
-                <w:u w:val="none"/>
-                <w:sz w:val="22"/>
-                <w:szCs w:val="22"/>
-                <w:color w:val="000000"/>
-              </w:rPr>
-              <w:t xml:space="preserve">34,299</w:t>
-            </w:r>
-          </w:p>
-        </w:tc>
-        <w:tc>
-          <w:tcPr>
-            <w:tcBorders>
-              <w:bottom w:val="none" w:sz="0" w:space="0" w:color="000000"/>
-              <w:top w:val="none" w:sz="0" w:space="0" w:color="000000"/>
-              <w:left w:val="none" w:sz="0" w:space="0" w:color="000000"/>
-              <w:right w:val="none" w:sz="0" w:space="0" w:color="000000"/>
-            </w:tcBorders>
-            <w:shd w:val="clear" w:color="auto" w:fill="FFFFFF"/>
-            <w:tcMar>
-              <w:top w:w="0" w:type="dxa"/>
-              <w:bottom w:w="0" w:type="dxa"/>
-              <w:left w:w="0" w:type="dxa"/>
-              <w:right w:w="0" w:type="dxa"/>
-            </w:tcMar>
-            <w:vAlign w:val="top"/>
-          </w:tcPr>
-          <w:p>
-            <w:pPr>
-              <w:pStyle w:val="Normal"/>
-              <w:jc w:val="center"/>
-              <w:pBdr>
-                <w:bottom w:val="none" w:sz="0" w:space="0" w:color="000000"/>
-                <w:top w:val="none" w:sz="0" w:space="0" w:color="000000"/>
-                <w:left w:val="none" w:sz="0" w:space="0" w:color="000000"/>
-                <w:right w:val="none" w:sz="0" w:space="0" w:color="000000"/>
-              </w:pBdr>
-              <w:spacing w:after="100" w:before="100" w:line="240"/>
-              <w:ind w:left="100" w:right="100" w:firstLine="0" w:firstLineChars="0"/>
-              <w:rPr>
-                <w:rFonts w:ascii="Helvetica" w:hAnsi="Helvetica" w:eastAsia="Helvetica" w:cs="Helvetica"/>
-                <w:i w:val="false"/>
-                <w:b w:val="false"/>
-                <w:u w:val="none"/>
-                <w:sz w:val="22"/>
-                <w:szCs w:val="22"/>
-                <w:color w:val="000000"/>
-              </w:rPr>
-            </w:pPr>
-            <w:r>
-              <w:rPr>
-                <w:rFonts w:ascii="Helvetica" w:hAnsi="Helvetica" w:eastAsia="Helvetica" w:cs="Helvetica"/>
-                <w:i w:val="false"/>
-                <w:b w:val="false"/>
-                <w:u w:val="none"/>
-                <w:sz w:val="22"/>
-                <w:szCs w:val="22"/>
-                <w:color w:val="000000"/>
-              </w:rPr>
-              <w:t xml:space="preserve">15,717, 74,852</w:t>
-            </w:r>
-          </w:p>
-        </w:tc>
-        <w:tc>
-          <w:tcPr>
-            <w:tcBorders>
-              <w:bottom w:val="none" w:sz="0" w:space="0" w:color="000000"/>
-              <w:top w:val="none" w:sz="0" w:space="0" w:color="000000"/>
-              <w:left w:val="none" w:sz="0" w:space="0" w:color="000000"/>
-              <w:right w:val="none" w:sz="0" w:space="0" w:color="000000"/>
-            </w:tcBorders>
-            <w:shd w:val="clear" w:color="auto" w:fill="FFFFFF"/>
-            <w:tcMar>
-              <w:top w:w="0" w:type="dxa"/>
-              <w:bottom w:w="0" w:type="dxa"/>
-              <w:left w:w="0" w:type="dxa"/>
-              <w:right w:w="0" w:type="dxa"/>
-            </w:tcMar>
-            <w:vAlign w:val="top"/>
-          </w:tcPr>
-          <w:p>
-            <w:pPr>
-              <w:pStyle w:val="Normal"/>
-              <w:jc w:val="center"/>
-              <w:pBdr>
-                <w:bottom w:val="none" w:sz="0" w:space="0" w:color="000000"/>
-                <w:top w:val="none" w:sz="0" w:space="0" w:color="000000"/>
-                <w:left w:val="none" w:sz="0" w:space="0" w:color="000000"/>
-                <w:right w:val="none" w:sz="0" w:space="0" w:color="000000"/>
-              </w:pBdr>
-              <w:spacing w:after="100" w:before="100" w:line="240"/>
-              <w:ind w:left="100" w:right="100" w:firstLine="0" w:firstLineChars="0"/>
-              <w:rPr>
-                <w:rFonts w:ascii="Helvetica" w:hAnsi="Helvetica" w:eastAsia="Helvetica" w:cs="Helvetica"/>
-                <w:i w:val="false"/>
-                <w:b w:val="false"/>
-                <w:u w:val="none"/>
-                <w:sz w:val="22"/>
-                <w:szCs w:val="22"/>
-                <w:color w:val="000000"/>
-              </w:rPr>
-            </w:pPr>
-            <w:r>
-              <w:rPr>
-                <w:rFonts w:ascii="Helvetica" w:hAnsi="Helvetica" w:eastAsia="Helvetica" w:cs="Helvetica"/>
-                <w:i w:val="false"/>
-                <w:b w:val="false"/>
-                <w:u w:val="none"/>
-                <w:sz w:val="22"/>
-                <w:szCs w:val="22"/>
-                <w:color w:val="000000"/>
-              </w:rPr>
-              <w:t xml:space="preserve">&lt;0.001</w:t>
-            </w:r>
-          </w:p>
-        </w:tc>
-        <w:tc>
-          <w:tcPr>
-            <w:tcBorders>
-              <w:bottom w:val="none" w:sz="0" w:space="0" w:color="000000"/>
-              <w:top w:val="none" w:sz="0" w:space="0" w:color="000000"/>
-              <w:left w:val="none" w:sz="0" w:space="0" w:color="000000"/>
-              <w:right w:val="none" w:sz="0" w:space="0" w:color="000000"/>
-            </w:tcBorders>
-            <w:shd w:val="clear" w:color="auto" w:fill="FFFFFF"/>
-            <w:tcMar>
-              <w:top w:w="0" w:type="dxa"/>
-              <w:bottom w:w="0" w:type="dxa"/>
-              <w:left w:w="0" w:type="dxa"/>
-              <w:right w:w="0" w:type="dxa"/>
-            </w:tcMar>
-            <w:vAlign w:val="top"/>
-          </w:tcPr>
-          <w:p>
-            <w:pPr>
-              <w:pStyle w:val="Normal"/>
-              <w:jc w:val="center"/>
-              <w:pBdr>
-                <w:bottom w:val="none" w:sz="0" w:space="0" w:color="000000"/>
-                <w:top w:val="none" w:sz="0" w:space="0" w:color="000000"/>
-                <w:left w:val="none" w:sz="0" w:space="0" w:color="000000"/>
-                <w:right w:val="none" w:sz="0" w:space="0" w:color="000000"/>
-              </w:pBdr>
-              <w:spacing w:after="100" w:before="100" w:line="240"/>
-              <w:ind w:left="100" w:right="100" w:firstLine="0" w:firstLineChars="0"/>
-              <w:rPr>
-                <w:rFonts w:ascii="Helvetica" w:hAnsi="Helvetica" w:eastAsia="Helvetica" w:cs="Helvetica"/>
-                <w:i w:val="false"/>
-                <w:b w:val="false"/>
-                <w:u w:val="none"/>
-                <w:sz w:val="22"/>
-                <w:szCs w:val="22"/>
-                <w:color w:val="000000"/>
-              </w:rPr>
-            </w:pPr>
-            <w:r>
-              <w:rPr>
-                <w:rFonts w:ascii="Helvetica" w:hAnsi="Helvetica" w:eastAsia="Helvetica" w:cs="Helvetica"/>
-                <w:i w:val="false"/>
-                <w:b w:val="false"/>
-                <w:u w:val="none"/>
-                <w:sz w:val="22"/>
-                <w:szCs w:val="22"/>
-                <w:color w:val="000000"/>
-              </w:rPr>
-              <w:t xml:space="preserve"/>
-            </w:r>
-          </w:p>
-        </w:tc>
-        <w:tc>
-          <w:tcPr>
-            <w:tcBorders>
-              <w:bottom w:val="none" w:sz="0" w:space="0" w:color="000000"/>
-              <w:top w:val="none" w:sz="0" w:space="0" w:color="000000"/>
-              <w:left w:val="none" w:sz="0" w:space="0" w:color="000000"/>
-              <w:right w:val="none" w:sz="0" w:space="0" w:color="000000"/>
-            </w:tcBorders>
-            <w:shd w:val="clear" w:color="auto" w:fill="FFFFFF"/>
-            <w:tcMar>
-              <w:top w:w="0" w:type="dxa"/>
-              <w:bottom w:w="0" w:type="dxa"/>
-              <w:left w:w="0" w:type="dxa"/>
-              <w:right w:w="0" w:type="dxa"/>
-            </w:tcMar>
-            <w:vAlign w:val="top"/>
-          </w:tcPr>
-          <w:p>
-            <w:pPr>
-              <w:pStyle w:val="Normal"/>
-              <w:jc w:val="center"/>
-              <w:pBdr>
-                <w:bottom w:val="none" w:sz="0" w:space="0" w:color="000000"/>
-                <w:top w:val="none" w:sz="0" w:space="0" w:color="000000"/>
-                <w:left w:val="none" w:sz="0" w:space="0" w:color="000000"/>
-                <w:right w:val="none" w:sz="0" w:space="0" w:color="000000"/>
-              </w:pBdr>
-              <w:spacing w:after="100" w:before="100" w:line="240"/>
-              <w:ind w:left="100" w:right="100" w:firstLine="0" w:firstLineChars="0"/>
-              <w:rPr>
-                <w:rFonts w:ascii="Helvetica" w:hAnsi="Helvetica" w:eastAsia="Helvetica" w:cs="Helvetica"/>
-                <w:i w:val="false"/>
-                <w:b w:val="false"/>
-                <w:u w:val="none"/>
-                <w:sz w:val="22"/>
-                <w:szCs w:val="22"/>
-                <w:color w:val="000000"/>
-              </w:rPr>
-            </w:pPr>
-            <w:r>
-              <w:rPr>
-                <w:rFonts w:ascii="Helvetica" w:hAnsi="Helvetica" w:eastAsia="Helvetica" w:cs="Helvetica"/>
-                <w:i w:val="false"/>
-                <w:b w:val="false"/>
-                <w:u w:val="none"/>
-                <w:sz w:val="22"/>
-                <w:szCs w:val="22"/>
-                <w:color w:val="000000"/>
-              </w:rPr>
-              <w:t xml:space="preserve">25,419</w:t>
-            </w:r>
-          </w:p>
-        </w:tc>
-        <w:tc>
-          <w:tcPr>
-            <w:tcBorders>
-              <w:bottom w:val="none" w:sz="0" w:space="0" w:color="000000"/>
-              <w:top w:val="none" w:sz="0" w:space="0" w:color="000000"/>
-              <w:left w:val="none" w:sz="0" w:space="0" w:color="000000"/>
-              <w:right w:val="none" w:sz="0" w:space="0" w:color="000000"/>
-            </w:tcBorders>
-            <w:shd w:val="clear" w:color="auto" w:fill="FFFFFF"/>
-            <w:tcMar>
-              <w:top w:w="0" w:type="dxa"/>
-              <w:bottom w:w="0" w:type="dxa"/>
-              <w:left w:w="0" w:type="dxa"/>
-              <w:right w:w="0" w:type="dxa"/>
-            </w:tcMar>
-            <w:vAlign w:val="top"/>
-          </w:tcPr>
-          <w:p>
-            <w:pPr>
-              <w:pStyle w:val="Normal"/>
-              <w:jc w:val="center"/>
-              <w:pBdr>
-                <w:bottom w:val="none" w:sz="0" w:space="0" w:color="000000"/>
-                <w:top w:val="none" w:sz="0" w:space="0" w:color="000000"/>
-                <w:left w:val="none" w:sz="0" w:space="0" w:color="000000"/>
-                <w:right w:val="none" w:sz="0" w:space="0" w:color="000000"/>
-              </w:pBdr>
-              <w:spacing w:after="100" w:before="100" w:line="240"/>
-              <w:ind w:left="100" w:right="100" w:firstLine="0" w:firstLineChars="0"/>
-              <w:rPr>
-                <w:rFonts w:ascii="Helvetica" w:hAnsi="Helvetica" w:eastAsia="Helvetica" w:cs="Helvetica"/>
-                <w:i w:val="false"/>
-                <w:b w:val="false"/>
-                <w:u w:val="none"/>
-                <w:sz w:val="22"/>
-                <w:szCs w:val="22"/>
-                <w:color w:val="000000"/>
-              </w:rPr>
-            </w:pPr>
-            <w:r>
-              <w:rPr>
-                <w:rFonts w:ascii="Helvetica" w:hAnsi="Helvetica" w:eastAsia="Helvetica" w:cs="Helvetica"/>
-                <w:i w:val="false"/>
-                <w:b w:val="false"/>
-                <w:u w:val="none"/>
-                <w:sz w:val="22"/>
-                <w:szCs w:val="22"/>
-                <w:color w:val="000000"/>
-              </w:rPr>
-              <w:t xml:space="preserve">8,270, 78,128</w:t>
-            </w:r>
-          </w:p>
-        </w:tc>
-        <w:tc>
-          <w:tcPr>
-            <w:tcBorders>
-              <w:bottom w:val="none" w:sz="0" w:space="0" w:color="000000"/>
-              <w:top w:val="none" w:sz="0" w:space="0" w:color="000000"/>
-              <w:left w:val="none" w:sz="0" w:space="0" w:color="000000"/>
-              <w:right w:val="none" w:sz="0" w:space="0" w:color="000000"/>
-            </w:tcBorders>
-            <w:shd w:val="clear" w:color="auto" w:fill="FFFFFF"/>
-            <w:tcMar>
-              <w:top w:w="0" w:type="dxa"/>
-              <w:bottom w:w="0" w:type="dxa"/>
-              <w:left w:w="0" w:type="dxa"/>
-              <w:right w:w="0" w:type="dxa"/>
-            </w:tcMar>
-            <w:vAlign w:val="top"/>
-          </w:tcPr>
-          <w:p>
-            <w:pPr>
-              <w:pStyle w:val="Normal"/>
-              <w:jc w:val="center"/>
-              <w:pBdr>
-                <w:bottom w:val="none" w:sz="0" w:space="0" w:color="000000"/>
-                <w:top w:val="none" w:sz="0" w:space="0" w:color="000000"/>
-                <w:left w:val="none" w:sz="0" w:space="0" w:color="000000"/>
-                <w:right w:val="none" w:sz="0" w:space="0" w:color="000000"/>
-              </w:pBdr>
-              <w:spacing w:after="100" w:before="100" w:line="240"/>
-              <w:ind w:left="100" w:right="100" w:firstLine="0" w:firstLineChars="0"/>
-              <w:rPr>
-                <w:rFonts w:ascii="Helvetica" w:hAnsi="Helvetica" w:eastAsia="Helvetica" w:cs="Helvetica"/>
-                <w:i w:val="false"/>
-                <w:b w:val="false"/>
-                <w:u w:val="none"/>
-                <w:sz w:val="22"/>
-                <w:szCs w:val="22"/>
-                <w:color w:val="000000"/>
-              </w:rPr>
-            </w:pPr>
-            <w:r>
-              <w:rPr>
-                <w:rFonts w:ascii="Helvetica" w:hAnsi="Helvetica" w:eastAsia="Helvetica" w:cs="Helvetica"/>
-                <w:i w:val="false"/>
-                <w:b w:val="false"/>
-                <w:u w:val="none"/>
-                <w:sz w:val="22"/>
-                <w:szCs w:val="22"/>
-                <w:color w:val="000000"/>
-              </w:rPr>
-              <w:t xml:space="preserve">&lt;0.001</w:t>
+              <w:ind w:left="100" w:right="100" w:firstLine="0" w:firstLineChars="0"/>
+              <w:rPr>
+                <w:rFonts w:ascii="Helvetica" w:hAnsi="Helvetica" w:eastAsia="Helvetica" w:cs="Helvetica"/>
+                <w:i w:val="false"/>
+                <w:b w:val="false"/>
+                <w:u w:val="none"/>
+                <w:sz w:val="22"/>
+                <w:szCs w:val="22"/>
+                <w:color w:val="000000"/>
+              </w:rPr>
+            </w:pPr>
+            <w:r>
+              <w:rPr>
+                <w:rFonts w:ascii="Helvetica" w:hAnsi="Helvetica" w:eastAsia="Helvetica" w:cs="Helvetica"/>
+                <w:i w:val="false"/>
+                <w:b w:val="false"/>
+                <w:u w:val="none"/>
+                <w:sz w:val="22"/>
+                <w:szCs w:val="22"/>
+                <w:color w:val="000000"/>
+              </w:rPr>
+              <w:t xml:space="preserve">ecog_score</w:t>
+            </w:r>
+          </w:p>
+        </w:tc>
+        <w:tc>
+          <w:tcPr>
+            <w:tcBorders>
+              <w:bottom w:val="none" w:sz="0" w:space="0" w:color="000000"/>
+              <w:top w:val="none" w:sz="0" w:space="0" w:color="000000"/>
+              <w:left w:val="none" w:sz="0" w:space="0" w:color="000000"/>
+              <w:right w:val="none" w:sz="0" w:space="0" w:color="000000"/>
+            </w:tcBorders>
+            <w:shd w:val="clear" w:color="auto" w:fill="FFFFFF"/>
+            <w:tcMar>
+              <w:top w:w="0" w:type="dxa"/>
+              <w:bottom w:w="0" w:type="dxa"/>
+              <w:left w:w="0" w:type="dxa"/>
+              <w:right w:w="0" w:type="dxa"/>
+            </w:tcMar>
+            <w:vAlign w:val="top"/>
+          </w:tcPr>
+          <w:p>
+            <w:pPr>
+              <w:pStyle w:val="Normal"/>
+              <w:jc w:val="center"/>
+              <w:pBdr>
+                <w:bottom w:val="none" w:sz="0" w:space="0" w:color="000000"/>
+                <w:top w:val="none" w:sz="0" w:space="0" w:color="000000"/>
+                <w:left w:val="none" w:sz="0" w:space="0" w:color="000000"/>
+                <w:right w:val="none" w:sz="0" w:space="0" w:color="000000"/>
+              </w:pBdr>
+              <w:spacing w:after="100" w:before="100" w:line="240"/>
+              <w:ind w:left="100" w:right="100" w:firstLine="0" w:firstLineChars="0"/>
+              <w:rPr>
+                <w:rFonts w:ascii="Helvetica" w:hAnsi="Helvetica" w:eastAsia="Helvetica" w:cs="Helvetica"/>
+                <w:i w:val="false"/>
+                <w:b w:val="false"/>
+                <w:u w:val="none"/>
+                <w:sz w:val="22"/>
+                <w:szCs w:val="22"/>
+                <w:color w:val="000000"/>
+              </w:rPr>
+            </w:pPr>
+            <w:r>
+              <w:rPr>
+                <w:rFonts w:ascii="Helvetica" w:hAnsi="Helvetica" w:eastAsia="Helvetica" w:cs="Helvetica"/>
+                <w:i w:val="false"/>
+                <w:b w:val="false"/>
+                <w:u w:val="none"/>
+                <w:sz w:val="22"/>
+                <w:szCs w:val="22"/>
+                <w:color w:val="000000"/>
+              </w:rPr>
+              <w:t xml:space="preserve">121</w:t>
+            </w:r>
+          </w:p>
+        </w:tc>
+        <w:tc>
+          <w:tcPr>
+            <w:tcBorders>
+              <w:bottom w:val="none" w:sz="0" w:space="0" w:color="000000"/>
+              <w:top w:val="none" w:sz="0" w:space="0" w:color="000000"/>
+              <w:left w:val="none" w:sz="0" w:space="0" w:color="000000"/>
+              <w:right w:val="none" w:sz="0" w:space="0" w:color="000000"/>
+            </w:tcBorders>
+            <w:shd w:val="clear" w:color="auto" w:fill="FFFFFF"/>
+            <w:tcMar>
+              <w:top w:w="0" w:type="dxa"/>
+              <w:bottom w:w="0" w:type="dxa"/>
+              <w:left w:w="0" w:type="dxa"/>
+              <w:right w:w="0" w:type="dxa"/>
+            </w:tcMar>
+            <w:vAlign w:val="top"/>
+          </w:tcPr>
+          <w:p>
+            <w:pPr>
+              <w:pStyle w:val="Normal"/>
+              <w:jc w:val="center"/>
+              <w:pBdr>
+                <w:bottom w:val="none" w:sz="0" w:space="0" w:color="000000"/>
+                <w:top w:val="none" w:sz="0" w:space="0" w:color="000000"/>
+                <w:left w:val="none" w:sz="0" w:space="0" w:color="000000"/>
+                <w:right w:val="none" w:sz="0" w:space="0" w:color="000000"/>
+              </w:pBdr>
+              <w:spacing w:after="100" w:before="100" w:line="240"/>
+              <w:ind w:left="100" w:right="100" w:firstLine="0" w:firstLineChars="0"/>
+              <w:rPr>
+                <w:rFonts w:ascii="Helvetica" w:hAnsi="Helvetica" w:eastAsia="Helvetica" w:cs="Helvetica"/>
+                <w:i w:val="false"/>
+                <w:b w:val="false"/>
+                <w:u w:val="none"/>
+                <w:sz w:val="22"/>
+                <w:szCs w:val="22"/>
+                <w:color w:val="000000"/>
+              </w:rPr>
+            </w:pPr>
+            <w:r>
+              <w:rPr>
+                <w:rFonts w:ascii="Helvetica" w:hAnsi="Helvetica" w:eastAsia="Helvetica" w:cs="Helvetica"/>
+                <w:i w:val="false"/>
+                <w:b w:val="false"/>
+                <w:u w:val="none"/>
+                <w:sz w:val="22"/>
+                <w:szCs w:val="22"/>
+                <w:color w:val="000000"/>
+              </w:rPr>
+              <w:t xml:space="preserve">2.33</w:t>
+            </w:r>
+          </w:p>
+        </w:tc>
+        <w:tc>
+          <w:tcPr>
+            <w:tcBorders>
+              <w:bottom w:val="none" w:sz="0" w:space="0" w:color="000000"/>
+              <w:top w:val="none" w:sz="0" w:space="0" w:color="000000"/>
+              <w:left w:val="none" w:sz="0" w:space="0" w:color="000000"/>
+              <w:right w:val="none" w:sz="0" w:space="0" w:color="000000"/>
+            </w:tcBorders>
+            <w:shd w:val="clear" w:color="auto" w:fill="FFFFFF"/>
+            <w:tcMar>
+              <w:top w:w="0" w:type="dxa"/>
+              <w:bottom w:w="0" w:type="dxa"/>
+              <w:left w:w="0" w:type="dxa"/>
+              <w:right w:w="0" w:type="dxa"/>
+            </w:tcMar>
+            <w:vAlign w:val="top"/>
+          </w:tcPr>
+          <w:p>
+            <w:pPr>
+              <w:pStyle w:val="Normal"/>
+              <w:jc w:val="center"/>
+              <w:pBdr>
+                <w:bottom w:val="none" w:sz="0" w:space="0" w:color="000000"/>
+                <w:top w:val="none" w:sz="0" w:space="0" w:color="000000"/>
+                <w:left w:val="none" w:sz="0" w:space="0" w:color="000000"/>
+                <w:right w:val="none" w:sz="0" w:space="0" w:color="000000"/>
+              </w:pBdr>
+              <w:spacing w:after="100" w:before="100" w:line="240"/>
+              <w:ind w:left="100" w:right="100" w:firstLine="0" w:firstLineChars="0"/>
+              <w:rPr>
+                <w:rFonts w:ascii="Helvetica" w:hAnsi="Helvetica" w:eastAsia="Helvetica" w:cs="Helvetica"/>
+                <w:i w:val="false"/>
+                <w:b w:val="false"/>
+                <w:u w:val="none"/>
+                <w:sz w:val="22"/>
+                <w:szCs w:val="22"/>
+                <w:color w:val="000000"/>
+              </w:rPr>
+            </w:pPr>
+            <w:r>
+              <w:rPr>
+                <w:rFonts w:ascii="Helvetica" w:hAnsi="Helvetica" w:eastAsia="Helvetica" w:cs="Helvetica"/>
+                <w:i w:val="false"/>
+                <w:b w:val="false"/>
+                <w:u w:val="none"/>
+                <w:sz w:val="22"/>
+                <w:szCs w:val="22"/>
+                <w:color w:val="000000"/>
+              </w:rPr>
+              <w:t xml:space="preserve">1.29, 4.22</w:t>
+            </w:r>
+          </w:p>
+        </w:tc>
+        <w:tc>
+          <w:tcPr>
+            <w:tcBorders>
+              <w:bottom w:val="none" w:sz="0" w:space="0" w:color="000000"/>
+              <w:top w:val="none" w:sz="0" w:space="0" w:color="000000"/>
+              <w:left w:val="none" w:sz="0" w:space="0" w:color="000000"/>
+              <w:right w:val="none" w:sz="0" w:space="0" w:color="000000"/>
+            </w:tcBorders>
+            <w:shd w:val="clear" w:color="auto" w:fill="FFFFFF"/>
+            <w:tcMar>
+              <w:top w:w="0" w:type="dxa"/>
+              <w:bottom w:w="0" w:type="dxa"/>
+              <w:left w:w="0" w:type="dxa"/>
+              <w:right w:w="0" w:type="dxa"/>
+            </w:tcMar>
+            <w:vAlign w:val="top"/>
+          </w:tcPr>
+          <w:p>
+            <w:pPr>
+              <w:pStyle w:val="Normal"/>
+              <w:jc w:val="center"/>
+              <w:pBdr>
+                <w:bottom w:val="none" w:sz="0" w:space="0" w:color="000000"/>
+                <w:top w:val="none" w:sz="0" w:space="0" w:color="000000"/>
+                <w:left w:val="none" w:sz="0" w:space="0" w:color="000000"/>
+                <w:right w:val="none" w:sz="0" w:space="0" w:color="000000"/>
+              </w:pBdr>
+              <w:spacing w:after="100" w:before="100" w:line="240"/>
+              <w:ind w:left="100" w:right="100" w:firstLine="0" w:firstLineChars="0"/>
+              <w:rPr>
+                <w:rFonts w:ascii="Helvetica" w:hAnsi="Helvetica" w:eastAsia="Helvetica" w:cs="Helvetica"/>
+                <w:i w:val="false"/>
+                <w:b w:val="false"/>
+                <w:u w:val="none"/>
+                <w:sz w:val="22"/>
+                <w:szCs w:val="22"/>
+                <w:color w:val="000000"/>
+              </w:rPr>
+            </w:pPr>
+            <w:r>
+              <w:rPr>
+                <w:rFonts w:ascii="Helvetica" w:hAnsi="Helvetica" w:eastAsia="Helvetica" w:cs="Helvetica"/>
+                <w:i w:val="false"/>
+                <w:b w:val="false"/>
+                <w:u w:val="none"/>
+                <w:sz w:val="22"/>
+                <w:szCs w:val="22"/>
+                <w:color w:val="000000"/>
+              </w:rPr>
+              <w:t xml:space="preserve">0.005</w:t>
+            </w:r>
+          </w:p>
+        </w:tc>
+        <w:tc>
+          <w:tcPr>
+            <w:tcBorders>
+              <w:bottom w:val="none" w:sz="0" w:space="0" w:color="000000"/>
+              <w:top w:val="none" w:sz="0" w:space="0" w:color="000000"/>
+              <w:left w:val="none" w:sz="0" w:space="0" w:color="000000"/>
+              <w:right w:val="none" w:sz="0" w:space="0" w:color="000000"/>
+            </w:tcBorders>
+            <w:shd w:val="clear" w:color="auto" w:fill="FFFFFF"/>
+            <w:tcMar>
+              <w:top w:w="0" w:type="dxa"/>
+              <w:bottom w:w="0" w:type="dxa"/>
+              <w:left w:w="0" w:type="dxa"/>
+              <w:right w:w="0" w:type="dxa"/>
+            </w:tcMar>
+            <w:vAlign w:val="top"/>
+          </w:tcPr>
+          <w:p>
+            <w:pPr>
+              <w:pStyle w:val="Normal"/>
+              <w:jc w:val="center"/>
+              <w:pBdr>
+                <w:bottom w:val="none" w:sz="0" w:space="0" w:color="000000"/>
+                <w:top w:val="none" w:sz="0" w:space="0" w:color="000000"/>
+                <w:left w:val="none" w:sz="0" w:space="0" w:color="000000"/>
+                <w:right w:val="none" w:sz="0" w:space="0" w:color="000000"/>
+              </w:pBdr>
+              <w:spacing w:after="100" w:before="100" w:line="240"/>
+              <w:ind w:left="100" w:right="100" w:firstLine="0" w:firstLineChars="0"/>
+              <w:rPr>
+                <w:rFonts w:ascii="Helvetica" w:hAnsi="Helvetica" w:eastAsia="Helvetica" w:cs="Helvetica"/>
+                <w:i w:val="false"/>
+                <w:b w:val="false"/>
+                <w:u w:val="none"/>
+                <w:sz w:val="22"/>
+                <w:szCs w:val="22"/>
+                <w:color w:val="000000"/>
+              </w:rPr>
+            </w:pPr>
+            <w:r>
+              <w:rPr>
+                <w:rFonts w:ascii="Helvetica" w:hAnsi="Helvetica" w:eastAsia="Helvetica" w:cs="Helvetica"/>
+                <w:i w:val="false"/>
+                <w:b w:val="false"/>
+                <w:u w:val="none"/>
+                <w:sz w:val="22"/>
+                <w:szCs w:val="22"/>
+                <w:color w:val="000000"/>
+              </w:rPr>
+              <w:t xml:space="preserve">121</w:t>
+            </w:r>
+          </w:p>
+        </w:tc>
+        <w:tc>
+          <w:tcPr>
+            <w:tcBorders>
+              <w:bottom w:val="none" w:sz="0" w:space="0" w:color="000000"/>
+              <w:top w:val="none" w:sz="0" w:space="0" w:color="000000"/>
+              <w:left w:val="none" w:sz="0" w:space="0" w:color="000000"/>
+              <w:right w:val="none" w:sz="0" w:space="0" w:color="000000"/>
+            </w:tcBorders>
+            <w:shd w:val="clear" w:color="auto" w:fill="FFFFFF"/>
+            <w:tcMar>
+              <w:top w:w="0" w:type="dxa"/>
+              <w:bottom w:w="0" w:type="dxa"/>
+              <w:left w:w="0" w:type="dxa"/>
+              <w:right w:w="0" w:type="dxa"/>
+            </w:tcMar>
+            <w:vAlign w:val="top"/>
+          </w:tcPr>
+          <w:p>
+            <w:pPr>
+              <w:pStyle w:val="Normal"/>
+              <w:jc w:val="center"/>
+              <w:pBdr>
+                <w:bottom w:val="none" w:sz="0" w:space="0" w:color="000000"/>
+                <w:top w:val="none" w:sz="0" w:space="0" w:color="000000"/>
+                <w:left w:val="none" w:sz="0" w:space="0" w:color="000000"/>
+                <w:right w:val="none" w:sz="0" w:space="0" w:color="000000"/>
+              </w:pBdr>
+              <w:spacing w:after="100" w:before="100" w:line="240"/>
+              <w:ind w:left="100" w:right="100" w:firstLine="0" w:firstLineChars="0"/>
+              <w:rPr>
+                <w:rFonts w:ascii="Helvetica" w:hAnsi="Helvetica" w:eastAsia="Helvetica" w:cs="Helvetica"/>
+                <w:i w:val="false"/>
+                <w:b w:val="false"/>
+                <w:u w:val="none"/>
+                <w:sz w:val="22"/>
+                <w:szCs w:val="22"/>
+                <w:color w:val="000000"/>
+              </w:rPr>
+            </w:pPr>
+            <w:r>
+              <w:rPr>
+                <w:rFonts w:ascii="Helvetica" w:hAnsi="Helvetica" w:eastAsia="Helvetica" w:cs="Helvetica"/>
+                <w:i w:val="false"/>
+                <w:b w:val="false"/>
+                <w:u w:val="none"/>
+                <w:sz w:val="22"/>
+                <w:szCs w:val="22"/>
+                <w:color w:val="000000"/>
+              </w:rPr>
+              <w:t xml:space="preserve">2.26</w:t>
+            </w:r>
+          </w:p>
+        </w:tc>
+        <w:tc>
+          <w:tcPr>
+            <w:tcBorders>
+              <w:bottom w:val="none" w:sz="0" w:space="0" w:color="000000"/>
+              <w:top w:val="none" w:sz="0" w:space="0" w:color="000000"/>
+              <w:left w:val="none" w:sz="0" w:space="0" w:color="000000"/>
+              <w:right w:val="none" w:sz="0" w:space="0" w:color="000000"/>
+            </w:tcBorders>
+            <w:shd w:val="clear" w:color="auto" w:fill="FFFFFF"/>
+            <w:tcMar>
+              <w:top w:w="0" w:type="dxa"/>
+              <w:bottom w:w="0" w:type="dxa"/>
+              <w:left w:w="0" w:type="dxa"/>
+              <w:right w:w="0" w:type="dxa"/>
+            </w:tcMar>
+            <w:vAlign w:val="top"/>
+          </w:tcPr>
+          <w:p>
+            <w:pPr>
+              <w:pStyle w:val="Normal"/>
+              <w:jc w:val="center"/>
+              <w:pBdr>
+                <w:bottom w:val="none" w:sz="0" w:space="0" w:color="000000"/>
+                <w:top w:val="none" w:sz="0" w:space="0" w:color="000000"/>
+                <w:left w:val="none" w:sz="0" w:space="0" w:color="000000"/>
+                <w:right w:val="none" w:sz="0" w:space="0" w:color="000000"/>
+              </w:pBdr>
+              <w:spacing w:after="100" w:before="100" w:line="240"/>
+              <w:ind w:left="100" w:right="100" w:firstLine="0" w:firstLineChars="0"/>
+              <w:rPr>
+                <w:rFonts w:ascii="Helvetica" w:hAnsi="Helvetica" w:eastAsia="Helvetica" w:cs="Helvetica"/>
+                <w:i w:val="false"/>
+                <w:b w:val="false"/>
+                <w:u w:val="none"/>
+                <w:sz w:val="22"/>
+                <w:szCs w:val="22"/>
+                <w:color w:val="000000"/>
+              </w:rPr>
+            </w:pPr>
+            <w:r>
+              <w:rPr>
+                <w:rFonts w:ascii="Helvetica" w:hAnsi="Helvetica" w:eastAsia="Helvetica" w:cs="Helvetica"/>
+                <w:i w:val="false"/>
+                <w:b w:val="false"/>
+                <w:u w:val="none"/>
+                <w:sz w:val="22"/>
+                <w:szCs w:val="22"/>
+                <w:color w:val="000000"/>
+              </w:rPr>
+              <w:t xml:space="preserve">0.74, 6.90</w:t>
+            </w:r>
+          </w:p>
+        </w:tc>
+        <w:tc>
+          <w:tcPr>
+            <w:tcBorders>
+              <w:bottom w:val="none" w:sz="0" w:space="0" w:color="000000"/>
+              <w:top w:val="none" w:sz="0" w:space="0" w:color="000000"/>
+              <w:left w:val="none" w:sz="0" w:space="0" w:color="000000"/>
+              <w:right w:val="none" w:sz="0" w:space="0" w:color="000000"/>
+            </w:tcBorders>
+            <w:shd w:val="clear" w:color="auto" w:fill="FFFFFF"/>
+            <w:tcMar>
+              <w:top w:w="0" w:type="dxa"/>
+              <w:bottom w:w="0" w:type="dxa"/>
+              <w:left w:w="0" w:type="dxa"/>
+              <w:right w:w="0" w:type="dxa"/>
+            </w:tcMar>
+            <w:vAlign w:val="top"/>
+          </w:tcPr>
+          <w:p>
+            <w:pPr>
+              <w:pStyle w:val="Normal"/>
+              <w:jc w:val="center"/>
+              <w:pBdr>
+                <w:bottom w:val="none" w:sz="0" w:space="0" w:color="000000"/>
+                <w:top w:val="none" w:sz="0" w:space="0" w:color="000000"/>
+                <w:left w:val="none" w:sz="0" w:space="0" w:color="000000"/>
+                <w:right w:val="none" w:sz="0" w:space="0" w:color="000000"/>
+              </w:pBdr>
+              <w:spacing w:after="100" w:before="100" w:line="240"/>
+              <w:ind w:left="100" w:right="100" w:firstLine="0" w:firstLineChars="0"/>
+              <w:rPr>
+                <w:rFonts w:ascii="Helvetica" w:hAnsi="Helvetica" w:eastAsia="Helvetica" w:cs="Helvetica"/>
+                <w:i w:val="false"/>
+                <w:b w:val="false"/>
+                <w:u w:val="none"/>
+                <w:sz w:val="22"/>
+                <w:szCs w:val="22"/>
+                <w:color w:val="000000"/>
+              </w:rPr>
+            </w:pPr>
+            <w:r>
+              <w:rPr>
+                <w:rFonts w:ascii="Helvetica" w:hAnsi="Helvetica" w:eastAsia="Helvetica" w:cs="Helvetica"/>
+                <w:i w:val="false"/>
+                <w:b w:val="false"/>
+                <w:u w:val="none"/>
+                <w:sz w:val="22"/>
+                <w:szCs w:val="22"/>
+                <w:color w:val="000000"/>
+              </w:rPr>
+              <w:t xml:space="preserve">0.150</w:t>
             </w:r>
           </w:p>
         </w:tc>
@@ -4599,7 +3633,7 @@
         <w:trPr>
           <w:trHeight w:val="598" w:hRule="auto"/>
         </w:trPr>
-        body 9
+        body7
         <w:tc>
           <w:tcPr>
             <w:tcBorders>
@@ -4967,113 +4001,113 @@
                 <w:szCs w:val="22"/>
                 <w:color w:val="000000"/>
               </w:rPr>
-              <w:t xml:space="preserve">1.60</w:t>
-            </w:r>
-          </w:p>
-        </w:tc>
-        <w:tc>
-          <w:tcPr>
-            <w:tcBorders>
-              <w:bottom w:val="none" w:sz="0" w:space="0" w:color="000000"/>
-              <w:top w:val="none" w:sz="0" w:space="0" w:color="000000"/>
-              <w:left w:val="none" w:sz="0" w:space="0" w:color="000000"/>
-              <w:right w:val="none" w:sz="0" w:space="0" w:color="000000"/>
-            </w:tcBorders>
-            <w:shd w:val="clear" w:color="auto" w:fill="FFFFFF"/>
-            <w:tcMar>
-              <w:top w:w="0" w:type="dxa"/>
-              <w:bottom w:w="0" w:type="dxa"/>
-              <w:left w:w="0" w:type="dxa"/>
-              <w:right w:w="0" w:type="dxa"/>
-            </w:tcMar>
-            <w:vAlign w:val="top"/>
-          </w:tcPr>
-          <w:p>
-            <w:pPr>
-              <w:pStyle w:val="Normal"/>
-              <w:jc w:val="center"/>
-              <w:pBdr>
-                <w:bottom w:val="none" w:sz="0" w:space="0" w:color="000000"/>
-                <w:top w:val="none" w:sz="0" w:space="0" w:color="000000"/>
-                <w:left w:val="none" w:sz="0" w:space="0" w:color="000000"/>
-                <w:right w:val="none" w:sz="0" w:space="0" w:color="000000"/>
-              </w:pBdr>
-              <w:spacing w:after="100" w:before="100" w:line="240"/>
-              <w:ind w:left="100" w:right="100" w:firstLine="0" w:firstLineChars="0"/>
-              <w:rPr>
-                <w:rFonts w:ascii="Helvetica" w:hAnsi="Helvetica" w:eastAsia="Helvetica" w:cs="Helvetica"/>
-                <w:i w:val="false"/>
-                <w:b w:val="false"/>
-                <w:u w:val="none"/>
-                <w:sz w:val="22"/>
-                <w:szCs w:val="22"/>
-                <w:color w:val="000000"/>
-              </w:rPr>
-            </w:pPr>
-            <w:r>
-              <w:rPr>
-                <w:rFonts w:ascii="Helvetica" w:hAnsi="Helvetica" w:eastAsia="Helvetica" w:cs="Helvetica"/>
-                <w:i w:val="false"/>
-                <w:b w:val="false"/>
-                <w:u w:val="none"/>
-                <w:sz w:val="22"/>
-                <w:szCs w:val="22"/>
-                <w:color w:val="000000"/>
-              </w:rPr>
-              <w:t xml:space="preserve">0.39, 6.61</w:t>
-            </w:r>
-          </w:p>
-        </w:tc>
-        <w:tc>
-          <w:tcPr>
-            <w:tcBorders>
-              <w:bottom w:val="none" w:sz="0" w:space="0" w:color="000000"/>
-              <w:top w:val="none" w:sz="0" w:space="0" w:color="000000"/>
-              <w:left w:val="none" w:sz="0" w:space="0" w:color="000000"/>
-              <w:right w:val="none" w:sz="0" w:space="0" w:color="000000"/>
-            </w:tcBorders>
-            <w:shd w:val="clear" w:color="auto" w:fill="FFFFFF"/>
-            <w:tcMar>
-              <w:top w:w="0" w:type="dxa"/>
-              <w:bottom w:w="0" w:type="dxa"/>
-              <w:left w:w="0" w:type="dxa"/>
-              <w:right w:w="0" w:type="dxa"/>
-            </w:tcMar>
-            <w:vAlign w:val="top"/>
-          </w:tcPr>
-          <w:p>
-            <w:pPr>
-              <w:pStyle w:val="Normal"/>
-              <w:jc w:val="center"/>
-              <w:pBdr>
-                <w:bottom w:val="none" w:sz="0" w:space="0" w:color="000000"/>
-                <w:top w:val="none" w:sz="0" w:space="0" w:color="000000"/>
-                <w:left w:val="none" w:sz="0" w:space="0" w:color="000000"/>
-                <w:right w:val="none" w:sz="0" w:space="0" w:color="000000"/>
-              </w:pBdr>
-              <w:spacing w:after="100" w:before="100" w:line="240"/>
-              <w:ind w:left="100" w:right="100" w:firstLine="0" w:firstLineChars="0"/>
-              <w:rPr>
-                <w:rFonts w:ascii="Helvetica" w:hAnsi="Helvetica" w:eastAsia="Helvetica" w:cs="Helvetica"/>
-                <w:i w:val="false"/>
-                <w:b w:val="false"/>
-                <w:u w:val="none"/>
-                <w:sz w:val="22"/>
-                <w:szCs w:val="22"/>
-                <w:color w:val="000000"/>
-              </w:rPr>
-            </w:pPr>
-            <w:r>
-              <w:rPr>
-                <w:rFonts w:ascii="Helvetica" w:hAnsi="Helvetica" w:eastAsia="Helvetica" w:cs="Helvetica"/>
-                <w:i w:val="false"/>
-                <w:b w:val="false"/>
-                <w:u w:val="none"/>
-                <w:sz w:val="22"/>
-                <w:szCs w:val="22"/>
-                <w:color w:val="000000"/>
-              </w:rPr>
-              <w:t xml:space="preserve">0.510</w:t>
+              <w:t xml:space="preserve">2.20</w:t>
+            </w:r>
+          </w:p>
+        </w:tc>
+        <w:tc>
+          <w:tcPr>
+            <w:tcBorders>
+              <w:bottom w:val="none" w:sz="0" w:space="0" w:color="000000"/>
+              <w:top w:val="none" w:sz="0" w:space="0" w:color="000000"/>
+              <w:left w:val="none" w:sz="0" w:space="0" w:color="000000"/>
+              <w:right w:val="none" w:sz="0" w:space="0" w:color="000000"/>
+            </w:tcBorders>
+            <w:shd w:val="clear" w:color="auto" w:fill="FFFFFF"/>
+            <w:tcMar>
+              <w:top w:w="0" w:type="dxa"/>
+              <w:bottom w:w="0" w:type="dxa"/>
+              <w:left w:w="0" w:type="dxa"/>
+              <w:right w:w="0" w:type="dxa"/>
+            </w:tcMar>
+            <w:vAlign w:val="top"/>
+          </w:tcPr>
+          <w:p>
+            <w:pPr>
+              <w:pStyle w:val="Normal"/>
+              <w:jc w:val="center"/>
+              <w:pBdr>
+                <w:bottom w:val="none" w:sz="0" w:space="0" w:color="000000"/>
+                <w:top w:val="none" w:sz="0" w:space="0" w:color="000000"/>
+                <w:left w:val="none" w:sz="0" w:space="0" w:color="000000"/>
+                <w:right w:val="none" w:sz="0" w:space="0" w:color="000000"/>
+              </w:pBdr>
+              <w:spacing w:after="100" w:before="100" w:line="240"/>
+              <w:ind w:left="100" w:right="100" w:firstLine="0" w:firstLineChars="0"/>
+              <w:rPr>
+                <w:rFonts w:ascii="Helvetica" w:hAnsi="Helvetica" w:eastAsia="Helvetica" w:cs="Helvetica"/>
+                <w:i w:val="false"/>
+                <w:b w:val="false"/>
+                <w:u w:val="none"/>
+                <w:sz w:val="22"/>
+                <w:szCs w:val="22"/>
+                <w:color w:val="000000"/>
+              </w:rPr>
+            </w:pPr>
+            <w:r>
+              <w:rPr>
+                <w:rFonts w:ascii="Helvetica" w:hAnsi="Helvetica" w:eastAsia="Helvetica" w:cs="Helvetica"/>
+                <w:i w:val="false"/>
+                <w:b w:val="false"/>
+                <w:u w:val="none"/>
+                <w:sz w:val="22"/>
+                <w:szCs w:val="22"/>
+                <w:color w:val="000000"/>
+              </w:rPr>
+              <w:t xml:space="preserve">0.44, 10.9</w:t>
+            </w:r>
+          </w:p>
+        </w:tc>
+        <w:tc>
+          <w:tcPr>
+            <w:tcBorders>
+              <w:bottom w:val="none" w:sz="0" w:space="0" w:color="000000"/>
+              <w:top w:val="none" w:sz="0" w:space="0" w:color="000000"/>
+              <w:left w:val="none" w:sz="0" w:space="0" w:color="000000"/>
+              <w:right w:val="none" w:sz="0" w:space="0" w:color="000000"/>
+            </w:tcBorders>
+            <w:shd w:val="clear" w:color="auto" w:fill="FFFFFF"/>
+            <w:tcMar>
+              <w:top w:w="0" w:type="dxa"/>
+              <w:bottom w:w="0" w:type="dxa"/>
+              <w:left w:w="0" w:type="dxa"/>
+              <w:right w:w="0" w:type="dxa"/>
+            </w:tcMar>
+            <w:vAlign w:val="top"/>
+          </w:tcPr>
+          <w:p>
+            <w:pPr>
+              <w:pStyle w:val="Normal"/>
+              <w:jc w:val="center"/>
+              <w:pBdr>
+                <w:bottom w:val="none" w:sz="0" w:space="0" w:color="000000"/>
+                <w:top w:val="none" w:sz="0" w:space="0" w:color="000000"/>
+                <w:left w:val="none" w:sz="0" w:space="0" w:color="000000"/>
+                <w:right w:val="none" w:sz="0" w:space="0" w:color="000000"/>
+              </w:pBdr>
+              <w:spacing w:after="100" w:before="100" w:line="240"/>
+              <w:ind w:left="100" w:right="100" w:firstLine="0" w:firstLineChars="0"/>
+              <w:rPr>
+                <w:rFonts w:ascii="Helvetica" w:hAnsi="Helvetica" w:eastAsia="Helvetica" w:cs="Helvetica"/>
+                <w:i w:val="false"/>
+                <w:b w:val="false"/>
+                <w:u w:val="none"/>
+                <w:sz w:val="22"/>
+                <w:szCs w:val="22"/>
+                <w:color w:val="000000"/>
+              </w:rPr>
+            </w:pPr>
+            <w:r>
+              <w:rPr>
+                <w:rFonts w:ascii="Helvetica" w:hAnsi="Helvetica" w:eastAsia="Helvetica" w:cs="Helvetica"/>
+                <w:i w:val="false"/>
+                <w:b w:val="false"/>
+                <w:u w:val="none"/>
+                <w:sz w:val="22"/>
+                <w:szCs w:val="22"/>
+                <w:color w:val="000000"/>
+              </w:rPr>
+              <w:t xml:space="preserve">0.330</w:t>
             </w:r>
           </w:p>
         </w:tc>
@@ -5082,7 +4116,7 @@
         <w:trPr>
           <w:trHeight w:val="598" w:hRule="auto"/>
         </w:trPr>
-        body10
+        body8
         <w:tc>
           <w:tcPr>
             <w:tcBorders>
@@ -5450,7 +4484,7 @@
                 <w:szCs w:val="22"/>
                 <w:color w:val="000000"/>
               </w:rPr>
-              <w:t xml:space="preserve">1.01</w:t>
+              <w:t xml:space="preserve">1.00</w:t>
             </w:r>
           </w:p>
         </w:tc>
@@ -5556,7 +4590,7 @@
                 <w:szCs w:val="22"/>
                 <w:color w:val="000000"/>
               </w:rPr>
-              <w:t xml:space="preserve">0.520</w:t>
+              <w:t xml:space="preserve">0.760</w:t>
             </w:r>
           </w:p>
         </w:tc>
@@ -5565,7 +4599,7 @@
         <w:trPr>
           <w:trHeight w:val="360" w:hRule="auto"/>
         </w:trPr>
-        footer 1
+        footer1
         <w:tc>
           <w:tcPr>
             <w:gridSpan w:val="9"/>

</xml_diff>